<commit_message>
Started Testing, Final Report, and Fixed Streaks not updating bug
</commit_message>
<xml_diff>
--- a/Documentation/SETU Code Lab Final Report.docx
+++ b/Documentation/SETU Code Lab Final Report.docx
@@ -10,6 +10,12 @@
           <w:rFonts w:eastAsiaTheme="minorHAnsi"/>
         </w:rPr>
       </w:pPr>
+      <w:r>
+        <w:rPr>
+          <w:rFonts w:eastAsiaTheme="minorHAnsi"/>
+        </w:rPr>
+        <w:t xml:space="preserve"> </w:t>
+      </w:r>
       <w:r>
         <w:rPr>
           <w:rFonts w:ascii="Times New Roman" w:eastAsia="Arial" w:hAnsi="Times New Roman" w:cs="Times New Roman"/>
@@ -36,7 +42,7 @@
                     </pic:cNvPicPr>
                   </pic:nvPicPr>
                   <pic:blipFill>
-                    <a:blip r:embed="rId7">
+                    <a:blip r:embed="rId8">
                       <a:extLst>
                         <a:ext uri="{28A0092B-C50C-407E-A947-70E740481C1C}">
                           <a14:useLocalDpi xmlns:a14="http://schemas.microsoft.com/office/drawing/2010/main" val="0"/>
@@ -158,6 +164,15 @@
     </w:p>
     <w:sdt>
       <w:sdtPr>
+        <w:rPr>
+          <w:rFonts w:asciiTheme="minorHAnsi" w:eastAsiaTheme="minorHAnsi" w:hAnsiTheme="minorHAnsi" w:cstheme="minorBidi"/>
+          <w:color w:val="auto"/>
+          <w:kern w:val="2"/>
+          <w:sz w:val="22"/>
+          <w:szCs w:val="22"/>
+          <w:lang w:val="en-IE"/>
+          <w14:ligatures w14:val="standardContextual"/>
+        </w:rPr>
         <w:id w:val="-1868672499"/>
         <w:docPartObj>
           <w:docPartGallery w:val="Table of Contents"/>
@@ -166,16 +181,9 @@
       </w:sdtPr>
       <w:sdtEndPr>
         <w:rPr>
-          <w:rFonts w:asciiTheme="minorHAnsi" w:eastAsiaTheme="minorHAnsi" w:hAnsiTheme="minorHAnsi" w:cstheme="minorBidi"/>
           <w:b/>
           <w:bCs/>
           <w:noProof/>
-          <w:color w:val="auto"/>
-          <w:kern w:val="2"/>
-          <w:sz w:val="22"/>
-          <w:szCs w:val="22"/>
-          <w:lang w:val="en-IE"/>
-          <w14:ligatures w14:val="standardContextual"/>
         </w:rPr>
       </w:sdtEndPr>
       <w:sdtContent>
@@ -210,13 +218,13 @@
           <w:r>
             <w:fldChar w:fldCharType="separate"/>
           </w:r>
-          <w:hyperlink w:anchor="_Toc225840315" w:history="1">
+          <w:hyperlink w:anchor="_Toc226288851" w:history="1">
             <w:r>
               <w:rPr>
                 <w:rStyle w:val="Hyperlink"/>
                 <w:noProof/>
               </w:rPr>
-              <w:t>What was Achieved</w:t>
+              <w:t>Abstract</w:t>
             </w:r>
             <w:r>
               <w:rPr>
@@ -237,7 +245,7 @@
                 <w:noProof/>
                 <w:webHidden/>
               </w:rPr>
-              <w:instrText xml:space="preserve"> PAGEREF _Toc225840315 \h </w:instrText>
+              <w:instrText xml:space="preserve"> PAGEREF _Toc226288851 \h </w:instrText>
             </w:r>
             <w:r>
               <w:rPr>
@@ -257,7 +265,7 @@
                 <w:noProof/>
                 <w:webHidden/>
               </w:rPr>
-              <w:t>3</w:t>
+              <w:t>4</w:t>
             </w:r>
             <w:r>
               <w:rPr>
@@ -282,13 +290,13 @@
               <w:lang w:eastAsia="en-IE"/>
             </w:rPr>
           </w:pPr>
-          <w:hyperlink w:anchor="_Toc225840316" w:history="1">
+          <w:hyperlink w:anchor="_Toc226288852" w:history="1">
             <w:r>
               <w:rPr>
                 <w:rStyle w:val="Hyperlink"/>
                 <w:noProof/>
               </w:rPr>
-              <w:t>What was not Achieved</w:t>
+              <w:t>Introduction</w:t>
             </w:r>
             <w:r>
               <w:rPr>
@@ -309,7 +317,7 @@
                 <w:noProof/>
                 <w:webHidden/>
               </w:rPr>
-              <w:instrText xml:space="preserve"> PAGEREF _Toc225840316 \h </w:instrText>
+              <w:instrText xml:space="preserve"> PAGEREF _Toc226288852 \h </w:instrText>
             </w:r>
             <w:r>
               <w:rPr>
@@ -329,7 +337,7 @@
                 <w:noProof/>
                 <w:webHidden/>
               </w:rPr>
-              <w:t>4</w:t>
+              <w:t>5</w:t>
             </w:r>
             <w:r>
               <w:rPr>
@@ -354,13 +362,13 @@
               <w:lang w:eastAsia="en-IE"/>
             </w:rPr>
           </w:pPr>
-          <w:hyperlink w:anchor="_Toc225840317" w:history="1">
+          <w:hyperlink w:anchor="_Toc226288853" w:history="1">
             <w:r>
               <w:rPr>
                 <w:rStyle w:val="Hyperlink"/>
                 <w:noProof/>
               </w:rPr>
-              <w:t>Learnings</w:t>
+              <w:t>Challenges</w:t>
             </w:r>
             <w:r>
               <w:rPr>
@@ -381,7 +389,7 @@
                 <w:noProof/>
                 <w:webHidden/>
               </w:rPr>
-              <w:instrText xml:space="preserve"> PAGEREF _Toc225840317 \h </w:instrText>
+              <w:instrText xml:space="preserve"> PAGEREF _Toc226288853 \h </w:instrText>
             </w:r>
             <w:r>
               <w:rPr>
@@ -401,7 +409,75 @@
                 <w:noProof/>
                 <w:webHidden/>
               </w:rPr>
-              <w:t>5</w:t>
+              <w:t>6</w:t>
+            </w:r>
+            <w:r>
+              <w:rPr>
+                <w:noProof/>
+                <w:webHidden/>
+              </w:rPr>
+              <w:fldChar w:fldCharType="end"/>
+            </w:r>
+          </w:hyperlink>
+        </w:p>
+        <w:p>
+          <w:pPr>
+            <w:pStyle w:val="TOC2"/>
+            <w:tabs>
+              <w:tab w:val="right" w:leader="dot" w:pos="9016"/>
+            </w:tabs>
+            <w:rPr>
+              <w:noProof/>
+            </w:rPr>
+          </w:pPr>
+          <w:hyperlink w:anchor="_Toc226288854" w:history="1">
+            <w:r>
+              <w:rPr>
+                <w:rStyle w:val="Hyperlink"/>
+                <w:noProof/>
+              </w:rPr>
+              <w:t>Architecture</w:t>
+            </w:r>
+            <w:r>
+              <w:rPr>
+                <w:noProof/>
+                <w:webHidden/>
+              </w:rPr>
+              <w:tab/>
+            </w:r>
+            <w:r>
+              <w:rPr>
+                <w:noProof/>
+                <w:webHidden/>
+              </w:rPr>
+              <w:fldChar w:fldCharType="begin"/>
+            </w:r>
+            <w:r>
+              <w:rPr>
+                <w:noProof/>
+                <w:webHidden/>
+              </w:rPr>
+              <w:instrText xml:space="preserve"> PAGEREF _Toc226288854 \h </w:instrText>
+            </w:r>
+            <w:r>
+              <w:rPr>
+                <w:noProof/>
+                <w:webHidden/>
+              </w:rPr>
+            </w:r>
+            <w:r>
+              <w:rPr>
+                <w:noProof/>
+                <w:webHidden/>
+              </w:rPr>
+              <w:fldChar w:fldCharType="separate"/>
+            </w:r>
+            <w:r>
+              <w:rPr>
+                <w:noProof/>
+                <w:webHidden/>
+              </w:rPr>
+              <w:t>6</w:t>
             </w:r>
             <w:r>
               <w:rPr>
@@ -426,13 +502,13 @@
               <w:lang w:eastAsia="en-IE"/>
             </w:rPr>
           </w:pPr>
-          <w:hyperlink w:anchor="_Toc225840318" w:history="1">
+          <w:hyperlink w:anchor="_Toc226288855" w:history="1">
             <w:r>
               <w:rPr>
                 <w:rStyle w:val="Hyperlink"/>
                 <w:noProof/>
               </w:rPr>
-              <w:t>Reflection</w:t>
+              <w:t>Learnings</w:t>
             </w:r>
             <w:r>
               <w:rPr>
@@ -453,7 +529,7 @@
                 <w:noProof/>
                 <w:webHidden/>
               </w:rPr>
-              <w:instrText xml:space="preserve"> PAGEREF _Toc225840318 \h </w:instrText>
+              <w:instrText xml:space="preserve"> PAGEREF _Toc226288855 \h </w:instrText>
             </w:r>
             <w:r>
               <w:rPr>
@@ -473,7 +549,7 @@
                 <w:noProof/>
                 <w:webHidden/>
               </w:rPr>
-              <w:t>6</w:t>
+              <w:t>8</w:t>
             </w:r>
             <w:r>
               <w:rPr>
@@ -498,13 +574,13 @@
               <w:lang w:eastAsia="en-IE"/>
             </w:rPr>
           </w:pPr>
-          <w:hyperlink w:anchor="_Toc225840319" w:history="1">
+          <w:hyperlink w:anchor="_Toc226288856" w:history="1">
             <w:r>
               <w:rPr>
                 <w:rStyle w:val="Hyperlink"/>
                 <w:noProof/>
               </w:rPr>
-              <w:t>Testing</w:t>
+              <w:t>Reflection</w:t>
             </w:r>
             <w:r>
               <w:rPr>
@@ -525,7 +601,7 @@
                 <w:noProof/>
                 <w:webHidden/>
               </w:rPr>
-              <w:instrText xml:space="preserve"> PAGEREF _Toc225840319 \h </w:instrText>
+              <w:instrText xml:space="preserve"> PAGEREF _Toc226288856 \h </w:instrText>
             </w:r>
             <w:r>
               <w:rPr>
@@ -545,7 +621,7 @@
                 <w:noProof/>
                 <w:webHidden/>
               </w:rPr>
-              <w:t>7</w:t>
+              <w:t>9</w:t>
             </w:r>
             <w:r>
               <w:rPr>
@@ -570,12 +646,84 @@
               <w:lang w:eastAsia="en-IE"/>
             </w:rPr>
           </w:pPr>
-          <w:hyperlink w:anchor="_Toc225840320" w:history="1">
+          <w:hyperlink w:anchor="_Toc226288857" w:history="1">
             <w:r>
               <w:rPr>
                 <w:rStyle w:val="Hyperlink"/>
                 <w:noProof/>
               </w:rPr>
+              <w:t>Testing</w:t>
+            </w:r>
+            <w:r>
+              <w:rPr>
+                <w:noProof/>
+                <w:webHidden/>
+              </w:rPr>
+              <w:tab/>
+            </w:r>
+            <w:r>
+              <w:rPr>
+                <w:noProof/>
+                <w:webHidden/>
+              </w:rPr>
+              <w:fldChar w:fldCharType="begin"/>
+            </w:r>
+            <w:r>
+              <w:rPr>
+                <w:noProof/>
+                <w:webHidden/>
+              </w:rPr>
+              <w:instrText xml:space="preserve"> PAGEREF _Toc226288857 \h </w:instrText>
+            </w:r>
+            <w:r>
+              <w:rPr>
+                <w:noProof/>
+                <w:webHidden/>
+              </w:rPr>
+            </w:r>
+            <w:r>
+              <w:rPr>
+                <w:noProof/>
+                <w:webHidden/>
+              </w:rPr>
+              <w:fldChar w:fldCharType="separate"/>
+            </w:r>
+            <w:r>
+              <w:rPr>
+                <w:noProof/>
+                <w:webHidden/>
+              </w:rPr>
+              <w:t>10</w:t>
+            </w:r>
+            <w:r>
+              <w:rPr>
+                <w:noProof/>
+                <w:webHidden/>
+              </w:rPr>
+              <w:fldChar w:fldCharType="end"/>
+            </w:r>
+          </w:hyperlink>
+        </w:p>
+        <w:p>
+          <w:pPr>
+            <w:pStyle w:val="TOC1"/>
+            <w:tabs>
+              <w:tab w:val="right" w:leader="dot" w:pos="9016"/>
+            </w:tabs>
+            <w:rPr>
+              <w:rFonts w:eastAsiaTheme="minorEastAsia"/>
+              <w:noProof/>
+              <w:sz w:val="24"/>
+              <w:szCs w:val="24"/>
+              <w:lang w:eastAsia="en-IE"/>
+            </w:rPr>
+          </w:pPr>
+          <w:hyperlink w:anchor="_Toc226288858" w:history="1">
+            <w:r>
+              <w:rPr>
+                <w:rStyle w:val="Hyperlink"/>
+                <w:noProof/>
+              </w:rPr>
               <w:t>Conclusion</w:t>
             </w:r>
             <w:r>
@@ -597,7 +745,7 @@
                 <w:noProof/>
                 <w:webHidden/>
               </w:rPr>
-              <w:instrText xml:space="preserve"> PAGEREF _Toc225840320 \h </w:instrText>
+              <w:instrText xml:space="preserve"> PAGEREF _Toc226288858 \h </w:instrText>
             </w:r>
             <w:r>
               <w:rPr>
@@ -617,7 +765,79 @@
                 <w:noProof/>
                 <w:webHidden/>
               </w:rPr>
-              <w:t>8</w:t>
+              <w:t>11</w:t>
+            </w:r>
+            <w:r>
+              <w:rPr>
+                <w:noProof/>
+                <w:webHidden/>
+              </w:rPr>
+              <w:fldChar w:fldCharType="end"/>
+            </w:r>
+          </w:hyperlink>
+        </w:p>
+        <w:p>
+          <w:pPr>
+            <w:pStyle w:val="TOC1"/>
+            <w:tabs>
+              <w:tab w:val="right" w:leader="dot" w:pos="9016"/>
+            </w:tabs>
+            <w:rPr>
+              <w:rFonts w:eastAsiaTheme="minorEastAsia"/>
+              <w:noProof/>
+              <w:sz w:val="24"/>
+              <w:szCs w:val="24"/>
+              <w:lang w:eastAsia="en-IE"/>
+            </w:rPr>
+          </w:pPr>
+          <w:hyperlink w:anchor="_Toc226288859" w:history="1">
+            <w:r>
+              <w:rPr>
+                <w:rStyle w:val="Hyperlink"/>
+                <w:noProof/>
+              </w:rPr>
+              <w:t>Bibliography</w:t>
+            </w:r>
+            <w:r>
+              <w:rPr>
+                <w:noProof/>
+                <w:webHidden/>
+              </w:rPr>
+              <w:tab/>
+            </w:r>
+            <w:r>
+              <w:rPr>
+                <w:noProof/>
+                <w:webHidden/>
+              </w:rPr>
+              <w:fldChar w:fldCharType="begin"/>
+            </w:r>
+            <w:r>
+              <w:rPr>
+                <w:noProof/>
+                <w:webHidden/>
+              </w:rPr>
+              <w:instrText xml:space="preserve"> PAGEREF _Toc226288859 \h </w:instrText>
+            </w:r>
+            <w:r>
+              <w:rPr>
+                <w:noProof/>
+                <w:webHidden/>
+              </w:rPr>
+            </w:r>
+            <w:r>
+              <w:rPr>
+                <w:noProof/>
+                <w:webHidden/>
+              </w:rPr>
+              <w:fldChar w:fldCharType="separate"/>
+            </w:r>
+            <w:r>
+              <w:rPr>
+                <w:noProof/>
+                <w:webHidden/>
+              </w:rPr>
+              <w:t>12</w:t>
             </w:r>
             <w:r>
               <w:rPr>
@@ -643,21 +863,26 @@
     <w:p>
       <w:pPr>
         <w:spacing w:line="278" w:lineRule="auto"/>
+        <w:rPr>
+          <w:rFonts w:eastAsiaTheme="minorEastAsia"/>
+          <w:noProof/>
+          <w:sz w:val="24"/>
+          <w:szCs w:val="24"/>
+          <w:lang w:eastAsia="en-IE"/>
+        </w:rPr>
       </w:pPr>
       <w:r>
         <w:br w:type="page"/>
       </w:r>
-    </w:p>
-    <w:p>
-      <w:pPr>
-        <w:pStyle w:val="Heading1"/>
-      </w:pPr>
-      <w:bookmarkStart w:id="0" w:name="_Toc225840315"/>
-      <w:r>
-        <w:lastRenderedPageBreak/>
-        <w:t>What was Achieved</w:t>
-      </w:r>
-      <w:bookmarkEnd w:id="0"/>
+      <w:r>
+        <w:fldChar w:fldCharType="begin"/>
+      </w:r>
+      <w:r>
+        <w:instrText xml:space="preserve"> TOC \h \z \c "Figure" </w:instrText>
+      </w:r>
+      <w:r>
+        <w:fldChar w:fldCharType="separate"/>
+      </w:r>
     </w:p>
     <w:p>
       <w:pPr>
@@ -670,6 +895,10 @@
         </w:rPr>
       </w:pPr>
       <w:r>
+        <w:lastRenderedPageBreak/>
+        <w:fldChar w:fldCharType="end"/>
+      </w:r>
+      <w:r>
         <w:br w:type="page"/>
       </w:r>
     </w:p>
@@ -677,12 +906,12 @@
       <w:pPr>
         <w:pStyle w:val="Heading1"/>
       </w:pPr>
-      <w:bookmarkStart w:id="1" w:name="_Toc225840316"/>
+      <w:bookmarkStart w:id="0" w:name="_Toc226288851"/>
       <w:r>
         <w:lastRenderedPageBreak/>
-        <w:t>What was not Achieved</w:t>
-      </w:r>
-      <w:bookmarkEnd w:id="1"/>
+        <w:t>Abstract</w:t>
+      </w:r>
+      <w:bookmarkEnd w:id="0"/>
     </w:p>
     <w:p>
       <w:pPr>
@@ -702,12 +931,2079 @@
       <w:pPr>
         <w:pStyle w:val="Heading1"/>
       </w:pPr>
-      <w:bookmarkStart w:id="2" w:name="_Toc225840317"/>
+      <w:bookmarkStart w:id="1" w:name="_Toc226288852"/>
+      <w:r>
+        <w:lastRenderedPageBreak/>
+        <w:t>Introduction</w:t>
+      </w:r>
+      <w:bookmarkEnd w:id="1"/>
+    </w:p>
+    <w:p>
+      <w:pPr>
+        <w:jc w:val="both"/>
+      </w:pPr>
+      <w:r>
+        <w:t>SETU Code Lab is an in-browser study tool for students enrolled in computing-related courses in SETU (South East Technological University) and a learning management platform for their lecturers. Lecturers can create problems and courses and add students to these courses.</w:t>
+      </w:r>
+      <w:r>
+        <w:t xml:space="preserve"> This allows lecturers to easily assign work to groups of students and gather their submissions all in one place. When a lecturer creates a problem, they define several test cases. Student solutions are then run using inputs from these test cases and automatically graded for the lecturer.</w:t>
+      </w:r>
+      <w:r>
+        <w:t xml:space="preserve"> </w:t>
+      </w:r>
+      <w:r>
+        <w:t xml:space="preserve">The lecturer can view every student’s solution and </w:t>
+      </w:r>
+      <w:r>
+        <w:t xml:space="preserve">see </w:t>
+      </w:r>
+      <w:r>
+        <w:t>how they performed on each problem and even download class results in .CSV format for their convenience.</w:t>
+      </w:r>
+    </w:p>
+    <w:p>
+      <w:pPr>
+        <w:jc w:val="both"/>
+      </w:pPr>
+      <w:r>
+        <w:t xml:space="preserve">As well as a learning management platform SETU Code Lab can also be used by students to study for coding exams and technical interviews. </w:t>
+      </w:r>
+      <w:r>
+        <w:t xml:space="preserve">There is a </w:t>
+      </w:r>
+      <w:r>
+        <w:rPr>
+          <w:b/>
+          <w:bCs/>
+          <w:i/>
+          <w:iCs/>
+        </w:rPr>
+        <w:t>Global Problems</w:t>
+      </w:r>
+      <w:r>
+        <w:t xml:space="preserve"> course available to all users which lecturers can also add problems to for students to practice in their own time. To keep students engaged, the platform also employs several gamification techniques such as daily login streaks, points, badges and a leaderboard</w:t>
+      </w:r>
+      <w:r>
+        <w:t xml:space="preserve"> and</w:t>
+      </w:r>
+      <w:r>
+        <w:t xml:space="preserve"> supports Java and Python for code execution.</w:t>
+      </w:r>
+    </w:p>
+    <w:p>
+      <w:pPr>
+        <w:jc w:val="both"/>
+      </w:pPr>
+      <w:r>
+        <w:t xml:space="preserve">This report reflects on the development process of SETU Code Lab and outlines the challenges encountered, how they were solved and what changes were made to the project along the way. </w:t>
+      </w:r>
+      <w:r>
+        <w:t xml:space="preserve">It </w:t>
+      </w:r>
+      <w:r>
+        <w:t xml:space="preserve">will also look at the testing process of SETU Code Lab and assess its </w:t>
+      </w:r>
+      <w:r>
+        <w:t>success and reliability as a software product.</w:t>
+      </w:r>
+      <w:r>
+        <w:br w:type="page"/>
+      </w:r>
+    </w:p>
+    <w:p>
+      <w:pPr>
+        <w:pStyle w:val="Heading1"/>
+      </w:pPr>
+      <w:bookmarkStart w:id="2" w:name="_Toc226288853"/>
+      <w:r>
+        <w:lastRenderedPageBreak/>
+        <w:t>Challenges</w:t>
+      </w:r>
+      <w:bookmarkEnd w:id="2"/>
+    </w:p>
+    <w:p>
+      <w:pPr>
+        <w:pStyle w:val="Heading2"/>
+      </w:pPr>
+      <w:bookmarkStart w:id="3" w:name="_Toc226288854"/>
+      <w:r>
+        <w:t>Architecture</w:t>
+      </w:r>
+      <w:bookmarkEnd w:id="3"/>
+    </w:p>
+    <w:p>
+      <w:pPr>
+        <w:jc w:val="both"/>
+      </w:pPr>
+      <w:r>
+        <w:t xml:space="preserve">One of the </w:t>
+      </w:r>
+      <w:r>
+        <w:t xml:space="preserve">first challenges </w:t>
+      </w:r>
+      <w:r>
+        <w:t xml:space="preserve">at the beginning of this project was </w:t>
+      </w:r>
+      <w:r>
+        <w:t xml:space="preserve">learning </w:t>
+      </w:r>
+      <w:r>
+        <w:t xml:space="preserve">how to structure files in an easily maintainable and extensible way so that </w:t>
+      </w:r>
+      <w:r>
+        <w:t>as the codebase grows, it is still comprehensible and easy to work on.</w:t>
+      </w:r>
+      <w:r>
+        <w:t xml:space="preserve"> This was overcome through </w:t>
+      </w:r>
+      <w:r>
+        <w:t xml:space="preserve">independent learning and research. </w:t>
+      </w:r>
+      <w:r>
+        <w:t>The goal when thinking about how the project should be laid out was to keep coupling low and cohesion high.</w:t>
+      </w:r>
+    </w:p>
+    <w:p>
+      <w:pPr>
+        <w:jc w:val="both"/>
+      </w:pPr>
+      <w:r>
+        <w:t xml:space="preserve">Backend development </w:t>
+      </w:r>
+      <w:r>
+        <w:t xml:space="preserve">specifically, </w:t>
+      </w:r>
+      <w:r>
+        <w:t xml:space="preserve">proved to be </w:t>
+      </w:r>
+      <w:r>
+        <w:t>the biggest</w:t>
+      </w:r>
+      <w:r>
+        <w:t xml:space="preserve"> challenge</w:t>
+      </w:r>
+      <w:r>
+        <w:t xml:space="preserve"> in this regard</w:t>
+      </w:r>
+      <w:r>
+        <w:t xml:space="preserve"> as </w:t>
+      </w:r>
+      <w:r>
+        <w:t>I initially</w:t>
+      </w:r>
+      <w:r>
+        <w:t xml:space="preserve"> </w:t>
+      </w:r>
+      <w:r>
+        <w:t xml:space="preserve">had limited prior </w:t>
+      </w:r>
+      <w:r>
+        <w:t>experience with it. This required research into</w:t>
+      </w:r>
+      <w:r>
+        <w:t>:</w:t>
+      </w:r>
+    </w:p>
+    <w:p>
+      <w:pPr>
+        <w:pStyle w:val="ListParagraph"/>
+        <w:numPr>
+          <w:ilvl w:val="0"/>
+          <w:numId w:val="1"/>
+        </w:numPr>
+        <w:jc w:val="both"/>
+      </w:pPr>
+      <w:r>
+        <w:t>H</w:t>
+      </w:r>
+      <w:r>
+        <w:t>ow to make HTTP requests from the frontend</w:t>
+      </w:r>
+      <w:r>
+        <w:t xml:space="preserve"> using TypeScript</w:t>
+      </w:r>
+    </w:p>
+    <w:p>
+      <w:pPr>
+        <w:pStyle w:val="ListParagraph"/>
+        <w:numPr>
+          <w:ilvl w:val="0"/>
+          <w:numId w:val="1"/>
+        </w:numPr>
+        <w:jc w:val="both"/>
+      </w:pPr>
+      <w:r>
+        <w:t>H</w:t>
+      </w:r>
+      <w:r>
+        <w:t>ow to define a corresponding route in the backend</w:t>
+      </w:r>
+      <w:r>
+        <w:t xml:space="preserve"> using TypeScript and Express</w:t>
+      </w:r>
+      <w:r>
+        <w:t>.js</w:t>
+      </w:r>
+    </w:p>
+    <w:p>
+      <w:pPr>
+        <w:pStyle w:val="ListParagraph"/>
+        <w:numPr>
+          <w:ilvl w:val="0"/>
+          <w:numId w:val="1"/>
+        </w:numPr>
+        <w:jc w:val="both"/>
+      </w:pPr>
+      <w:r>
+        <w:t>H</w:t>
+      </w:r>
+      <w:r>
+        <w:t xml:space="preserve">ow to </w:t>
+      </w:r>
+      <w:r>
+        <w:t>structure backend files</w:t>
+      </w:r>
+    </w:p>
+    <w:p>
+      <w:pPr>
+        <w:jc w:val="both"/>
+      </w:pPr>
+      <w:r>
+        <w:t xml:space="preserve">From this research it was decided that the back-end </w:t>
+      </w:r>
+      <w:r>
+        <w:t xml:space="preserve">web server </w:t>
+      </w:r>
+      <w:r>
+        <w:t xml:space="preserve">should be </w:t>
+      </w:r>
+      <w:r>
+        <w:t>broken down into several different types of files based on their purpose keeping cohesion high and coupling low.</w:t>
+      </w:r>
+      <w:r>
+        <w:t xml:space="preserve"> </w:t>
+      </w:r>
+      <w:r>
+        <w:t xml:space="preserve">The most notable sources for this research </w:t>
+      </w:r>
+      <w:r>
+        <w:t>included a</w:t>
+      </w:r>
+      <w:r>
+        <w:t xml:space="preserve"> website called </w:t>
+      </w:r>
+      <w:proofErr w:type="spellStart"/>
+      <w:r>
+        <w:t>trebl</w:t>
+      </w:r>
+      <w:r>
+        <w:t>l</w:t>
+      </w:r>
+      <w:r>
+        <w:t>e</w:t>
+      </w:r>
+      <w:proofErr w:type="spellEnd"/>
+      <w:r>
+        <w:t xml:space="preserve"> and the Mozilla Developer Network.</w:t>
+      </w:r>
+    </w:p>
+    <w:p>
+      <w:pPr>
+        <w:jc w:val="both"/>
+      </w:pPr>
+      <w:r>
+        <w:t>The</w:t>
+      </w:r>
+      <w:r>
+        <w:t xml:space="preserve"> first back-end file type is</w:t>
+      </w:r>
+      <w:r>
+        <w:t xml:space="preserve"> </w:t>
+      </w:r>
+      <w:r>
+        <w:rPr>
+          <w:b/>
+          <w:bCs/>
+          <w:i/>
+          <w:iCs/>
+        </w:rPr>
+        <w:t>Routes</w:t>
+      </w:r>
+      <w:r>
+        <w:t xml:space="preserve">; </w:t>
+      </w:r>
+      <w:r>
+        <w:t>this</w:t>
+      </w:r>
+      <w:r>
+        <w:t xml:space="preserve"> is where API endpoints are defined and </w:t>
+      </w:r>
+      <w:r>
+        <w:t>they map to controller methods</w:t>
+      </w:r>
+      <w:r>
+        <w:t xml:space="preserve"> (see figure </w:t>
+      </w:r>
+      <w:r>
+        <w:t>x</w:t>
+      </w:r>
+      <w:r>
+        <w:t>)</w:t>
+      </w:r>
+      <w:r>
+        <w:t>. Sometimes before a route sends its request to the controller file there may be a middleware file which executes beforehand. This is typically used to check if a user is authenticated to make the request before forwarding it to the controller</w:t>
+      </w:r>
+      <w:r>
+        <w:t xml:space="preserve"> or for error handling</w:t>
+      </w:r>
+      <w:r>
+        <w:t xml:space="preserve"> </w:t>
+      </w:r>
+      <w:sdt>
+        <w:sdtPr>
+          <w:id w:val="-1548594384"/>
+          <w:citation/>
+        </w:sdtPr>
+        <w:sdtContent>
+          <w:r>
+            <w:fldChar w:fldCharType="begin"/>
+          </w:r>
+          <w:r>
+            <w:rPr>
+              <w:lang w:val="en-US"/>
+            </w:rPr>
+            <w:instrText xml:space="preserve"> CITATION Ant22 \l 1033 </w:instrText>
+          </w:r>
+          <w:r>
+            <w:fldChar w:fldCharType="separate"/>
+          </w:r>
+          <w:r>
+            <w:rPr>
+              <w:noProof/>
+              <w:lang w:val="en-US"/>
+            </w:rPr>
+            <w:t>(Gore, 2022)</w:t>
+          </w:r>
+          <w:r>
+            <w:fldChar w:fldCharType="end"/>
+          </w:r>
+        </w:sdtContent>
+      </w:sdt>
+      <w:r>
+        <w:t xml:space="preserve">. Routes can be called in the frontend by making a fetch request (see figure </w:t>
+      </w:r>
+      <w:r>
+        <w:t>x</w:t>
+      </w:r>
+      <w:r>
+        <w:t xml:space="preserve">). Later this logic was abstracted away to a group of methods called </w:t>
+      </w:r>
+      <w:proofErr w:type="spellStart"/>
+      <w:r>
+        <w:rPr>
+          <w:rFonts w:ascii="Courier New" w:hAnsi="Courier New" w:cs="Courier New"/>
+        </w:rPr>
+        <w:t>api.get</w:t>
+      </w:r>
+      <w:proofErr w:type="spellEnd"/>
+      <w:r>
+        <w:rPr>
+          <w:rFonts w:ascii="Courier New" w:hAnsi="Courier New" w:cs="Courier New"/>
+        </w:rPr>
+        <w:t>()</w:t>
+      </w:r>
+      <w:r>
+        <w:t xml:space="preserve">, </w:t>
+      </w:r>
+      <w:proofErr w:type="spellStart"/>
+      <w:r>
+        <w:rPr>
+          <w:rFonts w:ascii="Courier New" w:hAnsi="Courier New" w:cs="Courier New"/>
+        </w:rPr>
+        <w:t>api.post</w:t>
+      </w:r>
+      <w:proofErr w:type="spellEnd"/>
+      <w:r>
+        <w:rPr>
+          <w:rFonts w:ascii="Courier New" w:hAnsi="Courier New" w:cs="Courier New"/>
+        </w:rPr>
+        <w:t>()</w:t>
+      </w:r>
+      <w:r>
+        <w:t xml:space="preserve"> and </w:t>
+      </w:r>
+      <w:proofErr w:type="spellStart"/>
+      <w:r>
+        <w:rPr>
+          <w:rFonts w:ascii="Courier New" w:hAnsi="Courier New" w:cs="Courier New"/>
+        </w:rPr>
+        <w:t>api.delete</w:t>
+      </w:r>
+      <w:proofErr w:type="spellEnd"/>
+      <w:r>
+        <w:rPr>
+          <w:rFonts w:ascii="Courier New" w:hAnsi="Courier New" w:cs="Courier New"/>
+        </w:rPr>
+        <w:t>()</w:t>
+      </w:r>
+      <w:r>
+        <w:t xml:space="preserve"> to reduce code duplication (see figure </w:t>
+      </w:r>
+      <w:r>
+        <w:t>x</w:t>
+      </w:r>
+      <w:r>
+        <w:t>).</w:t>
+      </w:r>
+    </w:p>
+    <w:p>
+      <w:pPr>
+        <w:jc w:val="center"/>
+      </w:pPr>
+      <w:r>
+        <w:drawing>
+          <wp:inline distT="0" distB="0" distL="0" distR="0" wp14:anchorId="121A7027" wp14:editId="37FBED0D">
+            <wp:extent cx="3857630" cy="1500996"/>
+            <wp:effectExtent l="0" t="0" r="0" b="4445"/>
+            <wp:docPr id="1790240750" name="Picture 1"/>
+            <wp:cNvGraphicFramePr>
+              <a:graphicFrameLocks xmlns:a="http://schemas.openxmlformats.org/drawingml/2006/main" noChangeAspect="1"/>
+            </wp:cNvGraphicFramePr>
+            <a:graphic xmlns:a="http://schemas.openxmlformats.org/drawingml/2006/main">
+              <a:graphicData uri="http://schemas.openxmlformats.org/drawingml/2006/picture">
+                <pic:pic xmlns:pic="http://schemas.openxmlformats.org/drawingml/2006/picture">
+                  <pic:nvPicPr>
+                    <pic:cNvPr id="1790240750" name=""/>
+                    <pic:cNvPicPr/>
+                  </pic:nvPicPr>
+                  <pic:blipFill>
+                    <a:blip r:embed="rId9"/>
+                    <a:stretch>
+                      <a:fillRect/>
+                    </a:stretch>
+                  </pic:blipFill>
+                  <pic:spPr>
+                    <a:xfrm>
+                      <a:off x="0" y="0"/>
+                      <a:ext cx="4008099" cy="1559543"/>
+                    </a:xfrm>
+                    <a:prstGeom prst="rect">
+                      <a:avLst/>
+                    </a:prstGeom>
+                  </pic:spPr>
+                </pic:pic>
+              </a:graphicData>
+            </a:graphic>
+          </wp:inline>
+        </w:drawing>
+      </w:r>
+    </w:p>
+    <w:p>
+      <w:pPr>
+        <w:pStyle w:val="Caption"/>
+        <w:jc w:val="center"/>
+      </w:pPr>
+      <w:bookmarkStart w:id="4" w:name="_Toc226302149"/>
+      <w:r>
+        <w:rPr>
+          <w:b/>
+          <w:bCs/>
+        </w:rPr>
+        <w:t xml:space="preserve">Figure </w:t>
+      </w:r>
+      <w:r>
+        <w:rPr>
+          <w:b/>
+          <w:bCs/>
+        </w:rPr>
+        <w:t>x</w:t>
+      </w:r>
+      <w:r>
+        <w:rPr>
+          <w:b/>
+          <w:bCs/>
+        </w:rPr>
+        <w:t>.</w:t>
+      </w:r>
+      <w:r>
+        <w:t xml:space="preserve"> Example route file</w:t>
+      </w:r>
+      <w:bookmarkEnd w:id="4"/>
+    </w:p>
+    <w:p>
+      <w:pPr>
+        <w:jc w:val="center"/>
+      </w:pPr>
+      <w:r>
+        <w:drawing>
+          <wp:inline distT="0" distB="0" distL="0" distR="0" wp14:anchorId="5C069153" wp14:editId="45928456">
+            <wp:extent cx="3916392" cy="1190625"/>
+            <wp:effectExtent l="0" t="0" r="8255" b="0"/>
+            <wp:docPr id="2030883837" name="Picture 1"/>
+            <wp:cNvGraphicFramePr>
+              <a:graphicFrameLocks xmlns:a="http://schemas.openxmlformats.org/drawingml/2006/main" noChangeAspect="1"/>
+            </wp:cNvGraphicFramePr>
+            <a:graphic xmlns:a="http://schemas.openxmlformats.org/drawingml/2006/main">
+              <a:graphicData uri="http://schemas.openxmlformats.org/drawingml/2006/picture">
+                <pic:pic xmlns:pic="http://schemas.openxmlformats.org/drawingml/2006/picture">
+                  <pic:nvPicPr>
+                    <pic:cNvPr id="2030883837" name=""/>
+                    <pic:cNvPicPr/>
+                  </pic:nvPicPr>
+                  <pic:blipFill>
+                    <a:blip r:embed="rId10"/>
+                    <a:stretch>
+                      <a:fillRect/>
+                    </a:stretch>
+                  </pic:blipFill>
+                  <pic:spPr>
+                    <a:xfrm>
+                      <a:off x="0" y="0"/>
+                      <a:ext cx="4006116" cy="1217902"/>
+                    </a:xfrm>
+                    <a:prstGeom prst="rect">
+                      <a:avLst/>
+                    </a:prstGeom>
+                  </pic:spPr>
+                </pic:pic>
+              </a:graphicData>
+            </a:graphic>
+          </wp:inline>
+        </w:drawing>
+      </w:r>
+    </w:p>
+    <w:p>
+      <w:pPr>
+        <w:pStyle w:val="Caption"/>
+        <w:jc w:val="center"/>
+      </w:pPr>
+      <w:bookmarkStart w:id="5" w:name="_Toc226302150"/>
+      <w:r>
+        <w:rPr>
+          <w:b/>
+          <w:bCs/>
+        </w:rPr>
+        <w:t xml:space="preserve">Figure </w:t>
+      </w:r>
+      <w:r>
+        <w:rPr>
+          <w:b/>
+          <w:bCs/>
+        </w:rPr>
+        <w:t>x</w:t>
+      </w:r>
+      <w:r>
+        <w:rPr>
+          <w:b/>
+          <w:bCs/>
+        </w:rPr>
+        <w:t>.</w:t>
+      </w:r>
+      <w:r>
+        <w:t xml:space="preserve"> Making a request to the backend</w:t>
+      </w:r>
+      <w:bookmarkEnd w:id="5"/>
+    </w:p>
+    <w:p>
+      <w:pPr>
+        <w:spacing w:line="278" w:lineRule="auto"/>
+        <w:jc w:val="center"/>
+      </w:pPr>
+      <w:r>
+        <w:lastRenderedPageBreak/>
+        <w:drawing>
+          <wp:inline distT="0" distB="0" distL="0" distR="0" wp14:anchorId="0BC1F30B" wp14:editId="0191EC89">
+            <wp:extent cx="3976778" cy="1356698"/>
+            <wp:effectExtent l="0" t="0" r="5080" b="0"/>
+            <wp:docPr id="2081876236" name="Picture 1"/>
+            <wp:cNvGraphicFramePr>
+              <a:graphicFrameLocks xmlns:a="http://schemas.openxmlformats.org/drawingml/2006/main" noChangeAspect="1"/>
+            </wp:cNvGraphicFramePr>
+            <a:graphic xmlns:a="http://schemas.openxmlformats.org/drawingml/2006/main">
+              <a:graphicData uri="http://schemas.openxmlformats.org/drawingml/2006/picture">
+                <pic:pic xmlns:pic="http://schemas.openxmlformats.org/drawingml/2006/picture">
+                  <pic:nvPicPr>
+                    <pic:cNvPr id="2081876236" name=""/>
+                    <pic:cNvPicPr/>
+                  </pic:nvPicPr>
+                  <pic:blipFill>
+                    <a:blip r:embed="rId11"/>
+                    <a:stretch>
+                      <a:fillRect/>
+                    </a:stretch>
+                  </pic:blipFill>
+                  <pic:spPr>
+                    <a:xfrm>
+                      <a:off x="0" y="0"/>
+                      <a:ext cx="4035141" cy="1376609"/>
+                    </a:xfrm>
+                    <a:prstGeom prst="rect">
+                      <a:avLst/>
+                    </a:prstGeom>
+                  </pic:spPr>
+                </pic:pic>
+              </a:graphicData>
+            </a:graphic>
+          </wp:inline>
+        </w:drawing>
+      </w:r>
+    </w:p>
+    <w:p>
+      <w:pPr>
+        <w:pStyle w:val="Caption"/>
+        <w:jc w:val="center"/>
+      </w:pPr>
+      <w:bookmarkStart w:id="6" w:name="_Toc226302151"/>
+      <w:r>
+        <w:rPr>
+          <w:b/>
+          <w:bCs/>
+        </w:rPr>
+        <w:t xml:space="preserve">Figure </w:t>
+      </w:r>
+      <w:r>
+        <w:rPr>
+          <w:b/>
+          <w:bCs/>
+        </w:rPr>
+        <w:t>x</w:t>
+      </w:r>
+      <w:r>
+        <w:rPr>
+          <w:b/>
+          <w:bCs/>
+        </w:rPr>
+        <w:t>.</w:t>
+      </w:r>
+      <w:r>
+        <w:t xml:space="preserve"> Abstracted request method</w:t>
+      </w:r>
+      <w:bookmarkEnd w:id="6"/>
+    </w:p>
+    <w:p>
+      <w:r>
+        <w:t>Next the request is forwarded to it</w:t>
+      </w:r>
+      <w:r>
+        <w:t>s</w:t>
+      </w:r>
+      <w:r>
+        <w:t xml:space="preserve"> corresponding </w:t>
+      </w:r>
+      <w:r>
+        <w:rPr>
+          <w:b/>
+          <w:bCs/>
+          <w:i/>
+          <w:iCs/>
+        </w:rPr>
+        <w:t>C</w:t>
+      </w:r>
+      <w:r>
+        <w:rPr>
+          <w:b/>
+          <w:bCs/>
+          <w:i/>
+          <w:iCs/>
+        </w:rPr>
+        <w:t>ontroller</w:t>
+      </w:r>
+      <w:r>
+        <w:t xml:space="preserve"> method in a controller file. As with the route files, each controller file contains only methods related to one use</w:t>
+      </w:r>
+      <w:r>
+        <w:t xml:space="preserve"> case</w:t>
+      </w:r>
+      <w:r>
+        <w:t xml:space="preserve"> to keep cohesion high. Controller </w:t>
+      </w:r>
+      <w:r>
+        <w:t>methods</w:t>
+      </w:r>
+      <w:r>
+        <w:t xml:space="preserve"> prepare the incoming data in the request </w:t>
+      </w:r>
+      <w:r>
+        <w:t xml:space="preserve">before it is sent to a service method(s). Controllers are not supposed to perform any business logic instead leaving this responsibility to the next type of file in the process, the service file </w:t>
+      </w:r>
+      <w:sdt>
+        <w:sdtPr>
+          <w:id w:val="-160473182"/>
+          <w:citation/>
+        </w:sdtPr>
+        <w:sdtContent>
+          <w:r>
+            <w:fldChar w:fldCharType="begin"/>
+          </w:r>
+          <w:r>
+            <w:rPr>
+              <w:lang w:val="en-US"/>
+            </w:rPr>
+            <w:instrText xml:space="preserve"> CITATION Ant22 \l 1033 </w:instrText>
+          </w:r>
+          <w:r>
+            <w:fldChar w:fldCharType="separate"/>
+          </w:r>
+          <w:r>
+            <w:rPr>
+              <w:noProof/>
+              <w:lang w:val="en-US"/>
+            </w:rPr>
+            <w:t>(Gore, 2022)</w:t>
+          </w:r>
+          <w:r>
+            <w:fldChar w:fldCharType="end"/>
+          </w:r>
+        </w:sdtContent>
+      </w:sdt>
+      <w:r>
+        <w:t>.</w:t>
+      </w:r>
+      <w:r>
+        <w:t xml:space="preserve"> Figure </w:t>
+      </w:r>
+      <w:r>
+        <w:t>x</w:t>
+      </w:r>
+      <w:r>
+        <w:t xml:space="preserve"> below shows the signup controller method: extracting the needed data from the request, performing some basic input validation via the </w:t>
+      </w:r>
+      <w:proofErr w:type="spellStart"/>
+      <w:r>
+        <w:rPr>
+          <w:rFonts w:ascii="Courier New" w:hAnsi="Courier New" w:cs="Courier New"/>
+        </w:rPr>
+        <w:t>isValidPassword</w:t>
+      </w:r>
+      <w:proofErr w:type="spellEnd"/>
+      <w:r>
+        <w:rPr>
+          <w:rFonts w:ascii="Courier New" w:hAnsi="Courier New" w:cs="Courier New"/>
+        </w:rPr>
+        <w:t>()</w:t>
+      </w:r>
+      <w:r>
+        <w:t xml:space="preserve"> method, delegating the business logic to the </w:t>
+      </w:r>
+      <w:proofErr w:type="spellStart"/>
+      <w:r>
+        <w:rPr>
+          <w:rFonts w:ascii="Courier New" w:hAnsi="Courier New" w:cs="Courier New"/>
+        </w:rPr>
+        <w:t>signUpUser</w:t>
+      </w:r>
+      <w:proofErr w:type="spellEnd"/>
+      <w:r>
+        <w:rPr>
+          <w:rFonts w:ascii="Courier New" w:hAnsi="Courier New" w:cs="Courier New"/>
+        </w:rPr>
+        <w:t>()</w:t>
+      </w:r>
+      <w:r>
+        <w:t xml:space="preserve"> service method and attaching cookies before returning the response.</w:t>
+      </w:r>
+    </w:p>
+    <w:p>
+      <w:pPr>
+        <w:jc w:val="center"/>
+      </w:pPr>
+      <w:r>
+        <w:drawing>
+          <wp:inline distT="0" distB="0" distL="0" distR="0" wp14:anchorId="617FCD36" wp14:editId="0D7A5A2E">
+            <wp:extent cx="5335005" cy="5063706"/>
+            <wp:effectExtent l="0" t="0" r="0" b="3810"/>
+            <wp:docPr id="2002290398" name="Picture 1"/>
+            <wp:cNvGraphicFramePr>
+              <a:graphicFrameLocks xmlns:a="http://schemas.openxmlformats.org/drawingml/2006/main" noChangeAspect="1"/>
+            </wp:cNvGraphicFramePr>
+            <a:graphic xmlns:a="http://schemas.openxmlformats.org/drawingml/2006/main">
+              <a:graphicData uri="http://schemas.openxmlformats.org/drawingml/2006/picture">
+                <pic:pic xmlns:pic="http://schemas.openxmlformats.org/drawingml/2006/picture">
+                  <pic:nvPicPr>
+                    <pic:cNvPr id="2002290398" name=""/>
+                    <pic:cNvPicPr/>
+                  </pic:nvPicPr>
+                  <pic:blipFill>
+                    <a:blip r:embed="rId12"/>
+                    <a:stretch>
+                      <a:fillRect/>
+                    </a:stretch>
+                  </pic:blipFill>
+                  <pic:spPr>
+                    <a:xfrm>
+                      <a:off x="0" y="0"/>
+                      <a:ext cx="5431282" cy="5155087"/>
+                    </a:xfrm>
+                    <a:prstGeom prst="rect">
+                      <a:avLst/>
+                    </a:prstGeom>
+                  </pic:spPr>
+                </pic:pic>
+              </a:graphicData>
+            </a:graphic>
+          </wp:inline>
+        </w:drawing>
+      </w:r>
+    </w:p>
+    <w:p>
+      <w:pPr>
+        <w:pStyle w:val="Caption"/>
+        <w:jc w:val="center"/>
+      </w:pPr>
+      <w:bookmarkStart w:id="7" w:name="_Toc226302152"/>
+      <w:r>
+        <w:rPr>
+          <w:b/>
+          <w:bCs/>
+        </w:rPr>
+        <w:t xml:space="preserve">Figure </w:t>
+      </w:r>
+      <w:r>
+        <w:rPr>
+          <w:b/>
+          <w:bCs/>
+        </w:rPr>
+        <w:t>x</w:t>
+      </w:r>
+      <w:r>
+        <w:rPr>
+          <w:b/>
+          <w:bCs/>
+        </w:rPr>
+        <w:t>.</w:t>
+      </w:r>
+      <w:r>
+        <w:t xml:space="preserve"> Controller method</w:t>
+      </w:r>
+      <w:bookmarkEnd w:id="7"/>
+    </w:p>
+    <w:p>
+      <w:r>
+        <w:lastRenderedPageBreak/>
+        <w:t xml:space="preserve">The </w:t>
+      </w:r>
+      <w:r>
+        <w:rPr>
+          <w:b/>
+          <w:bCs/>
+          <w:i/>
+          <w:iCs/>
+        </w:rPr>
+        <w:t xml:space="preserve">Service </w:t>
+      </w:r>
+      <w:r>
+        <w:t>files are intended to handle business logic. This is any operations that need to be performed on data before it is either added to the database or displayed to the frontend</w:t>
+      </w:r>
+      <w:r>
+        <w:t xml:space="preserve"> </w:t>
+      </w:r>
+      <w:r>
+        <w:t xml:space="preserve">file </w:t>
+      </w:r>
+      <w:sdt>
+        <w:sdtPr>
+          <w:id w:val="666290594"/>
+          <w:citation/>
+        </w:sdtPr>
+        <w:sdtContent>
+          <w:r>
+            <w:fldChar w:fldCharType="begin"/>
+          </w:r>
+          <w:r>
+            <w:rPr>
+              <w:lang w:val="en-US"/>
+            </w:rPr>
+            <w:instrText xml:space="preserve"> CITATION Ant22 \l 1033 </w:instrText>
+          </w:r>
+          <w:r>
+            <w:fldChar w:fldCharType="separate"/>
+          </w:r>
+          <w:r>
+            <w:rPr>
+              <w:noProof/>
+              <w:lang w:val="en-US"/>
+            </w:rPr>
+            <w:t>(Gore, 2022)</w:t>
+          </w:r>
+          <w:r>
+            <w:fldChar w:fldCharType="end"/>
+          </w:r>
+        </w:sdtContent>
+      </w:sdt>
+      <w:r>
+        <w:t xml:space="preserve">. Figure </w:t>
+      </w:r>
+      <w:r>
+        <w:t>x</w:t>
+      </w:r>
+      <w:r>
+        <w:t xml:space="preserve"> shows an example service file from the codebase. This service performs operations such as hashing the user’s password and communicating with the </w:t>
+      </w:r>
+      <w:proofErr w:type="spellStart"/>
+      <w:r>
+        <w:rPr>
+          <w:rFonts w:ascii="Courier New" w:hAnsi="Courier New" w:cs="Courier New"/>
+        </w:rPr>
+        <w:t>authModel</w:t>
+      </w:r>
+      <w:proofErr w:type="spellEnd"/>
+      <w:r>
+        <w:t xml:space="preserve"> to add a user to the database. </w:t>
+      </w:r>
+      <w:r>
+        <w:rPr>
+          <w:b/>
+          <w:bCs/>
+          <w:i/>
+          <w:iCs/>
+        </w:rPr>
+        <w:t>Model</w:t>
+      </w:r>
+      <w:r>
+        <w:t xml:space="preserve"> files are responsible for any operation on the database and simply execute database queries (see figure </w:t>
+      </w:r>
+      <w:r>
+        <w:t>x</w:t>
+      </w:r>
+      <w:r>
+        <w:t xml:space="preserve">). </w:t>
+      </w:r>
+    </w:p>
+    <w:p>
+      <w:r>
+        <w:drawing>
+          <wp:inline distT="0" distB="0" distL="0" distR="0" wp14:anchorId="4671914C" wp14:editId="0E4DB28D">
+            <wp:extent cx="5731510" cy="3934460"/>
+            <wp:effectExtent l="0" t="0" r="2540" b="8890"/>
+            <wp:docPr id="221998456" name="Picture 1"/>
+            <wp:cNvGraphicFramePr>
+              <a:graphicFrameLocks xmlns:a="http://schemas.openxmlformats.org/drawingml/2006/main" noChangeAspect="1"/>
+            </wp:cNvGraphicFramePr>
+            <a:graphic xmlns:a="http://schemas.openxmlformats.org/drawingml/2006/main">
+              <a:graphicData uri="http://schemas.openxmlformats.org/drawingml/2006/picture">
+                <pic:pic xmlns:pic="http://schemas.openxmlformats.org/drawingml/2006/picture">
+                  <pic:nvPicPr>
+                    <pic:cNvPr id="221998456" name=""/>
+                    <pic:cNvPicPr/>
+                  </pic:nvPicPr>
+                  <pic:blipFill>
+                    <a:blip r:embed="rId13"/>
+                    <a:stretch>
+                      <a:fillRect/>
+                    </a:stretch>
+                  </pic:blipFill>
+                  <pic:spPr>
+                    <a:xfrm>
+                      <a:off x="0" y="0"/>
+                      <a:ext cx="5731510" cy="3934460"/>
+                    </a:xfrm>
+                    <a:prstGeom prst="rect">
+                      <a:avLst/>
+                    </a:prstGeom>
+                  </pic:spPr>
+                </pic:pic>
+              </a:graphicData>
+            </a:graphic>
+          </wp:inline>
+        </w:drawing>
+      </w:r>
+    </w:p>
+    <w:p>
+      <w:pPr>
+        <w:pStyle w:val="Caption"/>
+        <w:jc w:val="center"/>
+      </w:pPr>
+      <w:bookmarkStart w:id="8" w:name="_Toc226302153"/>
+      <w:r>
+        <w:rPr>
+          <w:b/>
+          <w:bCs/>
+        </w:rPr>
+        <w:t xml:space="preserve">Figure </w:t>
+      </w:r>
+      <w:r>
+        <w:rPr>
+          <w:b/>
+          <w:bCs/>
+        </w:rPr>
+        <w:t>x</w:t>
+      </w:r>
+      <w:r>
+        <w:rPr>
+          <w:b/>
+          <w:bCs/>
+        </w:rPr>
+        <w:t>.</w:t>
+      </w:r>
+      <w:r>
+        <w:t xml:space="preserve"> </w:t>
+      </w:r>
+      <w:proofErr w:type="spellStart"/>
+      <w:r>
+        <w:t>signUpUser</w:t>
+      </w:r>
+      <w:proofErr w:type="spellEnd"/>
+      <w:r>
+        <w:t xml:space="preserve"> service method</w:t>
+      </w:r>
+      <w:bookmarkEnd w:id="8"/>
+    </w:p>
+    <w:p/>
+    <w:p>
+      <w:r>
+        <w:drawing>
+          <wp:inline distT="0" distB="0" distL="0" distR="0" wp14:anchorId="04616EF8" wp14:editId="41A41BE6">
+            <wp:extent cx="5731510" cy="1035685"/>
+            <wp:effectExtent l="0" t="0" r="2540" b="0"/>
+            <wp:docPr id="526149124" name="Picture 1"/>
+            <wp:cNvGraphicFramePr>
+              <a:graphicFrameLocks xmlns:a="http://schemas.openxmlformats.org/drawingml/2006/main" noChangeAspect="1"/>
+            </wp:cNvGraphicFramePr>
+            <a:graphic xmlns:a="http://schemas.openxmlformats.org/drawingml/2006/main">
+              <a:graphicData uri="http://schemas.openxmlformats.org/drawingml/2006/picture">
+                <pic:pic xmlns:pic="http://schemas.openxmlformats.org/drawingml/2006/picture">
+                  <pic:nvPicPr>
+                    <pic:cNvPr id="526149124" name=""/>
+                    <pic:cNvPicPr/>
+                  </pic:nvPicPr>
+                  <pic:blipFill>
+                    <a:blip r:embed="rId14"/>
+                    <a:stretch>
+                      <a:fillRect/>
+                    </a:stretch>
+                  </pic:blipFill>
+                  <pic:spPr>
+                    <a:xfrm>
+                      <a:off x="0" y="0"/>
+                      <a:ext cx="5731510" cy="1035685"/>
+                    </a:xfrm>
+                    <a:prstGeom prst="rect">
+                      <a:avLst/>
+                    </a:prstGeom>
+                  </pic:spPr>
+                </pic:pic>
+              </a:graphicData>
+            </a:graphic>
+          </wp:inline>
+        </w:drawing>
+      </w:r>
+    </w:p>
+    <w:p>
+      <w:pPr>
+        <w:pStyle w:val="Caption"/>
+        <w:jc w:val="center"/>
+      </w:pPr>
+      <w:bookmarkStart w:id="9" w:name="_Toc226302154"/>
+      <w:r>
+        <w:rPr>
+          <w:b/>
+          <w:bCs/>
+        </w:rPr>
+        <w:t xml:space="preserve">Figure </w:t>
+      </w:r>
+      <w:r>
+        <w:rPr>
+          <w:b/>
+          <w:bCs/>
+        </w:rPr>
+        <w:t>x</w:t>
+      </w:r>
+      <w:r>
+        <w:rPr>
+          <w:b/>
+          <w:bCs/>
+        </w:rPr>
+        <w:t>.</w:t>
+      </w:r>
+      <w:r>
+        <w:t xml:space="preserve"> </w:t>
+      </w:r>
+      <w:proofErr w:type="spellStart"/>
+      <w:r>
+        <w:t>createUser</w:t>
+      </w:r>
+      <w:proofErr w:type="spellEnd"/>
+      <w:r>
+        <w:t xml:space="preserve"> model method</w:t>
+      </w:r>
+      <w:bookmarkEnd w:id="9"/>
+    </w:p>
+    <w:p>
+      <w:r>
+        <w:t xml:space="preserve">Every type of file in the back end is separated by use case. For example, routes relating to submissions are all in the </w:t>
+      </w:r>
+      <w:proofErr w:type="spellStart"/>
+      <w:r>
+        <w:rPr>
+          <w:rFonts w:ascii="Courier New" w:hAnsi="Courier New" w:cs="Courier New"/>
+        </w:rPr>
+        <w:t>submission.route.ts</w:t>
+      </w:r>
+      <w:proofErr w:type="spellEnd"/>
+      <w:r>
+        <w:t xml:space="preserve"> file. </w:t>
+      </w:r>
+      <w:r>
+        <w:t>Separating directories by their purpose and files by their use case</w:t>
+      </w:r>
+      <w:r>
+        <w:t xml:space="preserve"> helped massively with </w:t>
+      </w:r>
+      <w:r>
+        <w:t xml:space="preserve">my </w:t>
+      </w:r>
+      <w:r>
+        <w:t xml:space="preserve">understanding </w:t>
+      </w:r>
+      <w:r>
+        <w:t xml:space="preserve">of how server requests work and flow </w:t>
+      </w:r>
+      <w:r>
+        <w:t>from front end</w:t>
+      </w:r>
+      <w:r>
+        <w:t xml:space="preserve"> to back end, to database and vice versa</w:t>
+      </w:r>
+      <w:r>
+        <w:t xml:space="preserve">. Figure </w:t>
+      </w:r>
+      <w:r>
+        <w:t>x</w:t>
+      </w:r>
+      <w:r>
+        <w:t xml:space="preserve"> below also shows </w:t>
+      </w:r>
+      <w:r>
+        <w:t xml:space="preserve">some extra directories such as </w:t>
+      </w:r>
+      <w:proofErr w:type="spellStart"/>
+      <w:r>
+        <w:rPr>
+          <w:rFonts w:ascii="Courier New" w:hAnsi="Courier New" w:cs="Courier New"/>
+        </w:rPr>
+        <w:t>db</w:t>
+      </w:r>
+      <w:proofErr w:type="spellEnd"/>
+      <w:r>
+        <w:t xml:space="preserve"> which contains a database dump for recreating the database and </w:t>
+      </w:r>
+      <w:r>
+        <w:rPr>
+          <w:rFonts w:ascii="Courier New" w:hAnsi="Courier New" w:cs="Courier New"/>
+        </w:rPr>
+        <w:t>infrastructure</w:t>
+      </w:r>
+      <w:r>
+        <w:t xml:space="preserve"> which handles external connections to the PostgreSQL database and Docker for code execution.</w:t>
+      </w:r>
+    </w:p>
+    <w:p>
+      <w:pPr>
+        <w:jc w:val="center"/>
+      </w:pPr>
+      <w:r>
+        <w:lastRenderedPageBreak/>
+        <w:drawing>
+          <wp:inline distT="0" distB="0" distL="0" distR="0" wp14:anchorId="2EEC5B74" wp14:editId="3C7D36D3">
+            <wp:extent cx="2715004" cy="4563112"/>
+            <wp:effectExtent l="0" t="0" r="9525" b="8890"/>
+            <wp:docPr id="2059974209" name="Picture 1"/>
+            <wp:cNvGraphicFramePr>
+              <a:graphicFrameLocks xmlns:a="http://schemas.openxmlformats.org/drawingml/2006/main" noChangeAspect="1"/>
+            </wp:cNvGraphicFramePr>
+            <a:graphic xmlns:a="http://schemas.openxmlformats.org/drawingml/2006/main">
+              <a:graphicData uri="http://schemas.openxmlformats.org/drawingml/2006/picture">
+                <pic:pic xmlns:pic="http://schemas.openxmlformats.org/drawingml/2006/picture">
+                  <pic:nvPicPr>
+                    <pic:cNvPr id="2059974209" name=""/>
+                    <pic:cNvPicPr/>
+                  </pic:nvPicPr>
+                  <pic:blipFill>
+                    <a:blip r:embed="rId15"/>
+                    <a:stretch>
+                      <a:fillRect/>
+                    </a:stretch>
+                  </pic:blipFill>
+                  <pic:spPr>
+                    <a:xfrm>
+                      <a:off x="0" y="0"/>
+                      <a:ext cx="2715004" cy="4563112"/>
+                    </a:xfrm>
+                    <a:prstGeom prst="rect">
+                      <a:avLst/>
+                    </a:prstGeom>
+                  </pic:spPr>
+                </pic:pic>
+              </a:graphicData>
+            </a:graphic>
+          </wp:inline>
+        </w:drawing>
+      </w:r>
+    </w:p>
+    <w:p>
+      <w:pPr>
+        <w:pStyle w:val="Heading2"/>
+      </w:pPr>
+      <w:r>
+        <w:t>Hosting</w:t>
+      </w:r>
+    </w:p>
+    <w:p>
+      <w:pPr>
+        <w:spacing w:line="278" w:lineRule="auto"/>
+        <w:rPr>
+          <w:rFonts w:asciiTheme="majorHAnsi" w:eastAsiaTheme="majorEastAsia" w:hAnsiTheme="majorHAnsi" w:cstheme="majorBidi"/>
+          <w:color w:val="0F4761" w:themeColor="accent1" w:themeShade="BF"/>
+          <w:sz w:val="32"/>
+          <w:szCs w:val="32"/>
+        </w:rPr>
+      </w:pPr>
+      <w:r>
+        <w:br w:type="page"/>
+      </w:r>
+    </w:p>
+    <w:p>
+      <w:pPr>
+        <w:pStyle w:val="Heading2"/>
+      </w:pPr>
+      <w:r>
+        <w:lastRenderedPageBreak/>
+        <w:t>Docker Code Execution</w:t>
+      </w:r>
+    </w:p>
+    <w:p>
+      <w:pPr>
+        <w:jc w:val="both"/>
+      </w:pPr>
+      <w:r>
+        <w:t xml:space="preserve">The most technically challenging aspect of the project was </w:t>
+      </w:r>
+      <w:r>
+        <w:t xml:space="preserve">using Docker to safely and securely execute student submitted code. </w:t>
+      </w:r>
+      <w:r>
+        <w:t xml:space="preserve">This was highly important to get right because if student code could execute on the web server it could potentially give a malicious user full control of the platform. </w:t>
+      </w:r>
+      <w:r>
+        <w:t>Initially I had no experience with containerisation tools like Docker, so this was particularly challenging.</w:t>
+      </w:r>
+      <w:r>
+        <w:t xml:space="preserve"> </w:t>
+      </w:r>
+    </w:p>
+    <w:p>
+      <w:pPr>
+        <w:jc w:val="both"/>
+      </w:pPr>
+      <w:r>
+        <w:t xml:space="preserve">My first goal was to execute some Java inside a Docker container and return a result. The first hurdle with this was learning how to make my application communicate with the Docker engine which was running locally on my machine. From my research I discovered an NPM package called </w:t>
+      </w:r>
+      <w:proofErr w:type="spellStart"/>
+      <w:r>
+        <w:rPr>
+          <w:rFonts w:ascii="Courier New" w:hAnsi="Courier New" w:cs="Courier New"/>
+        </w:rPr>
+        <w:t>dockerode</w:t>
+      </w:r>
+      <w:proofErr w:type="spellEnd"/>
+      <w:r>
+        <w:t xml:space="preserve"> which provided the necessary methods for interacting with the Docker engine instance</w:t>
+      </w:r>
+      <w:r>
+        <w:t xml:space="preserve"> </w:t>
+      </w:r>
+      <w:sdt>
+        <w:sdtPr>
+          <w:id w:val="-795449224"/>
+          <w:citation/>
+        </w:sdtPr>
+        <w:sdtContent>
+          <w:r>
+            <w:fldChar w:fldCharType="begin"/>
+          </w:r>
+          <w:r>
+            <w:rPr>
+              <w:lang w:val="en-US"/>
+            </w:rPr>
+            <w:instrText xml:space="preserve"> CITATION apo26 \l 1033 </w:instrText>
+          </w:r>
+          <w:r>
+            <w:fldChar w:fldCharType="separate"/>
+          </w:r>
+          <w:r>
+            <w:rPr>
+              <w:noProof/>
+              <w:lang w:val="en-US"/>
+            </w:rPr>
+            <w:t>(apocas, 2026)</w:t>
+          </w:r>
+          <w:r>
+            <w:fldChar w:fldCharType="end"/>
+          </w:r>
+        </w:sdtContent>
+      </w:sdt>
+      <w:r>
+        <w:t xml:space="preserve">. However, before I could start any containers, I needed a way to reference the Docker socket. I did this by using </w:t>
+      </w:r>
+      <w:proofErr w:type="spellStart"/>
+      <w:r>
+        <w:rPr>
+          <w:rFonts w:ascii="Courier New" w:hAnsi="Courier New" w:cs="Courier New"/>
+        </w:rPr>
+        <w:t>dockerode</w:t>
+      </w:r>
+      <w:proofErr w:type="spellEnd"/>
+      <w:r>
+        <w:t xml:space="preserve"> to define the docker socket in code in a file called </w:t>
+      </w:r>
+      <w:proofErr w:type="spellStart"/>
+      <w:r>
+        <w:rPr>
+          <w:rFonts w:ascii="Courier New" w:hAnsi="Courier New" w:cs="Courier New"/>
+        </w:rPr>
+        <w:t>docker.ts</w:t>
+      </w:r>
+      <w:proofErr w:type="spellEnd"/>
+      <w:r>
+        <w:t xml:space="preserve">. This allowed me to interact with the Docker instance running on my machine. This taught me essential skills such as </w:t>
+      </w:r>
+      <w:r>
+        <w:t xml:space="preserve">how to interact with an external service using a socket in TypeScript and about the invaluable </w:t>
+      </w:r>
+      <w:proofErr w:type="spellStart"/>
+      <w:r>
+        <w:rPr>
+          <w:rFonts w:ascii="Courier New" w:hAnsi="Courier New" w:cs="Courier New"/>
+        </w:rPr>
+        <w:t>dockerode</w:t>
+      </w:r>
+      <w:proofErr w:type="spellEnd"/>
+      <w:r>
+        <w:t xml:space="preserve"> package and its powerful methods.</w:t>
+      </w:r>
+    </w:p>
+    <w:p>
+      <w:pPr>
+        <w:jc w:val="center"/>
+      </w:pPr>
+      <w:r>
+        <w:drawing>
+          <wp:inline distT="0" distB="0" distL="0" distR="0" wp14:anchorId="27579B4C" wp14:editId="66ED88C7">
+            <wp:extent cx="5420481" cy="1476581"/>
+            <wp:effectExtent l="0" t="0" r="8890" b="9525"/>
+            <wp:docPr id="1427307808" name="Picture 1"/>
+            <wp:cNvGraphicFramePr>
+              <a:graphicFrameLocks xmlns:a="http://schemas.openxmlformats.org/drawingml/2006/main" noChangeAspect="1"/>
+            </wp:cNvGraphicFramePr>
+            <a:graphic xmlns:a="http://schemas.openxmlformats.org/drawingml/2006/main">
+              <a:graphicData uri="http://schemas.openxmlformats.org/drawingml/2006/picture">
+                <pic:pic xmlns:pic="http://schemas.openxmlformats.org/drawingml/2006/picture">
+                  <pic:nvPicPr>
+                    <pic:cNvPr id="1427307808" name=""/>
+                    <pic:cNvPicPr/>
+                  </pic:nvPicPr>
+                  <pic:blipFill>
+                    <a:blip r:embed="rId16"/>
+                    <a:stretch>
+                      <a:fillRect/>
+                    </a:stretch>
+                  </pic:blipFill>
+                  <pic:spPr>
+                    <a:xfrm>
+                      <a:off x="0" y="0"/>
+                      <a:ext cx="5420481" cy="1476581"/>
+                    </a:xfrm>
+                    <a:prstGeom prst="rect">
+                      <a:avLst/>
+                    </a:prstGeom>
+                  </pic:spPr>
+                </pic:pic>
+              </a:graphicData>
+            </a:graphic>
+          </wp:inline>
+        </w:drawing>
+      </w:r>
+    </w:p>
+    <w:p>
+      <w:pPr>
+        <w:jc w:val="center"/>
+      </w:pPr>
+    </w:p>
+    <w:p>
+      <w:pPr>
+        <w:jc w:val="both"/>
+      </w:pPr>
+      <w:r>
+        <w:t xml:space="preserve">Custom Java Docker images needed to be created containing a Java JDK and essential Java packages for mapping sample inputs from test cases to parameters in submitted code functions. Initially I tried using a JDK by itself which worked for a simple proof of concept. However, when different inputs needed to be used with the same function I had to use the Java </w:t>
+      </w:r>
+      <w:proofErr w:type="spellStart"/>
+      <w:r>
+        <w:t>ObjectMapper</w:t>
+      </w:r>
+      <w:proofErr w:type="spellEnd"/>
+      <w:r>
+        <w:t xml:space="preserve"> object from the Jackson package. This allowed me to map sample inputs from system.in to structured Java objects which could then be passed as parameters into the user’s function.</w:t>
+      </w:r>
+      <w:r>
+        <w:t xml:space="preserve"> </w:t>
+      </w:r>
+      <w:r>
+        <w:t xml:space="preserve">This taught me how to create custom Docker images, how to tell Docker how to build them using a </w:t>
+      </w:r>
+      <w:proofErr w:type="spellStart"/>
+      <w:r>
+        <w:t>Dockerfile</w:t>
+      </w:r>
+      <w:proofErr w:type="spellEnd"/>
+      <w:r>
+        <w:t xml:space="preserve"> and how to include packages in a Docker container.</w:t>
+      </w:r>
+    </w:p>
+    <w:p>
+      <w:pPr>
+        <w:jc w:val="center"/>
+      </w:pPr>
+      <w:r>
+        <w:drawing>
+          <wp:inline distT="0" distB="0" distL="0" distR="0" wp14:anchorId="79C54037" wp14:editId="420C1E59">
+            <wp:extent cx="5731510" cy="2209165"/>
+            <wp:effectExtent l="0" t="0" r="2540" b="635"/>
+            <wp:docPr id="742097585" name="Picture 1"/>
+            <wp:cNvGraphicFramePr>
+              <a:graphicFrameLocks xmlns:a="http://schemas.openxmlformats.org/drawingml/2006/main" noChangeAspect="1"/>
+            </wp:cNvGraphicFramePr>
+            <a:graphic xmlns:a="http://schemas.openxmlformats.org/drawingml/2006/main">
+              <a:graphicData uri="http://schemas.openxmlformats.org/drawingml/2006/picture">
+                <pic:pic xmlns:pic="http://schemas.openxmlformats.org/drawingml/2006/picture">
+                  <pic:nvPicPr>
+                    <pic:cNvPr id="742097585" name=""/>
+                    <pic:cNvPicPr/>
+                  </pic:nvPicPr>
+                  <pic:blipFill>
+                    <a:blip r:embed="rId17"/>
+                    <a:stretch>
+                      <a:fillRect/>
+                    </a:stretch>
+                  </pic:blipFill>
+                  <pic:spPr>
+                    <a:xfrm>
+                      <a:off x="0" y="0"/>
+                      <a:ext cx="5731510" cy="2209165"/>
+                    </a:xfrm>
+                    <a:prstGeom prst="rect">
+                      <a:avLst/>
+                    </a:prstGeom>
+                  </pic:spPr>
+                </pic:pic>
+              </a:graphicData>
+            </a:graphic>
+          </wp:inline>
+        </w:drawing>
+      </w:r>
+    </w:p>
+    <w:p>
+      <w:pPr>
+        <w:jc w:val="both"/>
+      </w:pPr>
+      <w:r>
+        <w:lastRenderedPageBreak/>
+        <w:t>Java input functions needed to be pre-processed and placed into a suitable test harness allowing them to properly compile and execute using sample inputs</w:t>
+      </w:r>
+      <w:r>
+        <w:t xml:space="preserve">. </w:t>
+      </w:r>
+      <w:r>
+        <w:t>This test harness started as a static string into which only the submitted code was injected however this was very inflexible and completely unsuitable. Through careful examination and prototyping on paper, I identified the areas of the test harness that needed to be dynamic (see figure x).</w:t>
+      </w:r>
+    </w:p>
+    <w:p>
+      <w:pPr>
+        <w:jc w:val="center"/>
+      </w:pPr>
+      <w:r>
+        <w:drawing>
+          <wp:inline distT="0" distB="0" distL="0" distR="0" wp14:anchorId="783418F6" wp14:editId="15E371DB">
+            <wp:extent cx="3631720" cy="2667917"/>
+            <wp:effectExtent l="0" t="0" r="6985" b="0"/>
+            <wp:docPr id="326898263" name="Picture 1"/>
+            <wp:cNvGraphicFramePr>
+              <a:graphicFrameLocks xmlns:a="http://schemas.openxmlformats.org/drawingml/2006/main" noChangeAspect="1"/>
+            </wp:cNvGraphicFramePr>
+            <a:graphic xmlns:a="http://schemas.openxmlformats.org/drawingml/2006/main">
+              <a:graphicData uri="http://schemas.openxmlformats.org/drawingml/2006/picture">
+                <pic:pic xmlns:pic="http://schemas.openxmlformats.org/drawingml/2006/picture">
+                  <pic:nvPicPr>
+                    <pic:cNvPr id="326898263" name=""/>
+                    <pic:cNvPicPr/>
+                  </pic:nvPicPr>
+                  <pic:blipFill>
+                    <a:blip r:embed="rId18"/>
+                    <a:stretch>
+                      <a:fillRect/>
+                    </a:stretch>
+                  </pic:blipFill>
+                  <pic:spPr>
+                    <a:xfrm>
+                      <a:off x="0" y="0"/>
+                      <a:ext cx="3650333" cy="2681590"/>
+                    </a:xfrm>
+                    <a:prstGeom prst="rect">
+                      <a:avLst/>
+                    </a:prstGeom>
+                  </pic:spPr>
+                </pic:pic>
+              </a:graphicData>
+            </a:graphic>
+          </wp:inline>
+        </w:drawing>
+      </w:r>
+    </w:p>
+    <w:p>
+      <w:pPr>
+        <w:jc w:val="center"/>
+      </w:pPr>
+    </w:p>
+    <w:p>
+      <w:pPr>
+        <w:jc w:val="both"/>
+      </w:pPr>
+      <w:r>
+        <w:t xml:space="preserve">After defining the test harness, </w:t>
+      </w:r>
+      <w:r>
+        <w:t xml:space="preserve">I </w:t>
+      </w:r>
+      <w:r>
+        <w:t>needed to</w:t>
+      </w:r>
+      <w:r>
+        <w:t xml:space="preserve"> go back and extract the needed data from the lecturer defined placeholder code</w:t>
+      </w:r>
+      <w:r>
+        <w:t>.</w:t>
+      </w:r>
+      <w:r>
+        <w:t xml:space="preserve"> </w:t>
+      </w:r>
+      <w:r>
+        <w:t>M</w:t>
+      </w:r>
+      <w:r>
+        <w:t>os</w:t>
+      </w:r>
+      <w:r>
+        <w:t>t</w:t>
+      </w:r>
+      <w:r>
+        <w:t xml:space="preserve"> </w:t>
+      </w:r>
+      <w:r>
+        <w:t xml:space="preserve">of this could be handled using </w:t>
+      </w:r>
+      <w:r>
+        <w:t>regular expression</w:t>
+      </w:r>
+      <w:r>
+        <w:t>s</w:t>
+      </w:r>
+      <w:r>
+        <w:t xml:space="preserve">. One issue encountered later </w:t>
+      </w:r>
+      <w:r>
+        <w:t>was the</w:t>
+      </w:r>
+      <w:r>
+        <w:t xml:space="preserve"> </w:t>
+      </w:r>
+      <w:r>
+        <w:t>extract</w:t>
+      </w:r>
+      <w:r>
+        <w:t>ion</w:t>
+      </w:r>
+      <w:r>
+        <w:t xml:space="preserve"> of </w:t>
+      </w:r>
+      <w:r>
+        <w:t xml:space="preserve">complex nested data types </w:t>
+      </w:r>
+      <w:r>
+        <w:t xml:space="preserve">from placeholder code parameters. Parameters such as </w:t>
+      </w:r>
+      <w:r>
+        <w:rPr>
+          <w:b/>
+          <w:bCs/>
+          <w:i/>
+          <w:iCs/>
+        </w:rPr>
+        <w:t>Map&lt;String, Int&gt;</w:t>
+      </w:r>
+      <w:r>
+        <w:t xml:space="preserve"> </w:t>
+      </w:r>
+      <w:r>
+        <w:t xml:space="preserve">would break typical parameter splitting methods </w:t>
+      </w:r>
+      <w:r>
+        <w:t>that</w:t>
+      </w:r>
+      <w:r>
+        <w:t xml:space="preserve"> split parameter lists on commas</w:t>
+      </w:r>
+      <w:r>
+        <w:t>. To solve this, I measured the level of nesting using a variable called depth. This variable would be incremented when it detected an open bracket and decremented on any closing brackets. This allowed me to only split parameters based on top level commas (see figure x). Solving these issues helped me improve my critical thinking, code reasoning and problem-solving skills.</w:t>
+      </w:r>
+    </w:p>
+    <w:p>
+      <w:pPr>
+        <w:jc w:val="center"/>
+      </w:pPr>
+      <w:r>
+        <w:drawing>
+          <wp:inline distT="0" distB="0" distL="0" distR="0" wp14:anchorId="79C61C48" wp14:editId="3498A69A">
+            <wp:extent cx="3140617" cy="2725948"/>
+            <wp:effectExtent l="0" t="0" r="3175" b="0"/>
+            <wp:docPr id="1450082592" name="Picture 1"/>
+            <wp:cNvGraphicFramePr>
+              <a:graphicFrameLocks xmlns:a="http://schemas.openxmlformats.org/drawingml/2006/main" noChangeAspect="1"/>
+            </wp:cNvGraphicFramePr>
+            <a:graphic xmlns:a="http://schemas.openxmlformats.org/drawingml/2006/main">
+              <a:graphicData uri="http://schemas.openxmlformats.org/drawingml/2006/picture">
+                <pic:pic xmlns:pic="http://schemas.openxmlformats.org/drawingml/2006/picture">
+                  <pic:nvPicPr>
+                    <pic:cNvPr id="1450082592" name=""/>
+                    <pic:cNvPicPr/>
+                  </pic:nvPicPr>
+                  <pic:blipFill>
+                    <a:blip r:embed="rId19"/>
+                    <a:stretch>
+                      <a:fillRect/>
+                    </a:stretch>
+                  </pic:blipFill>
+                  <pic:spPr>
+                    <a:xfrm>
+                      <a:off x="0" y="0"/>
+                      <a:ext cx="3148799" cy="2733049"/>
+                    </a:xfrm>
+                    <a:prstGeom prst="rect">
+                      <a:avLst/>
+                    </a:prstGeom>
+                  </pic:spPr>
+                </pic:pic>
+              </a:graphicData>
+            </a:graphic>
+          </wp:inline>
+        </w:drawing>
+      </w:r>
+    </w:p>
+    <w:p>
+      <w:pPr>
+        <w:jc w:val="center"/>
+      </w:pPr>
+    </w:p>
+    <w:p>
+      <w:pPr>
+        <w:jc w:val="both"/>
+        <w:rPr>
+          <w:rFonts w:cs="Courier New"/>
+        </w:rPr>
+      </w:pPr>
+      <w:r>
+        <w:lastRenderedPageBreak/>
+        <w:t xml:space="preserve">Once the code was prepared and inserted into the test </w:t>
+      </w:r>
+      <w:r>
+        <w:t>harness,</w:t>
+      </w:r>
+      <w:r>
+        <w:t xml:space="preserve"> </w:t>
+      </w:r>
+      <w:r>
+        <w:t xml:space="preserve">I needed a way to pass it to the Docker container to be executed. After examining the </w:t>
+      </w:r>
+      <w:proofErr w:type="spellStart"/>
+      <w:r>
+        <w:rPr>
+          <w:rFonts w:ascii="Courier New" w:hAnsi="Courier New" w:cs="Courier New"/>
+        </w:rPr>
+        <w:t>dockerode</w:t>
+      </w:r>
+      <w:proofErr w:type="spellEnd"/>
+      <w:r>
+        <w:t xml:space="preserve"> documentation for the </w:t>
+      </w:r>
+      <w:proofErr w:type="spellStart"/>
+      <w:r>
+        <w:rPr>
+          <w:rFonts w:ascii="Courier New" w:hAnsi="Courier New" w:cs="Courier New"/>
+        </w:rPr>
+        <w:t>createContainer</w:t>
+      </w:r>
+      <w:proofErr w:type="spellEnd"/>
+      <w:r>
+        <w:rPr>
+          <w:rFonts w:ascii="Courier New" w:hAnsi="Courier New" w:cs="Courier New"/>
+        </w:rPr>
+        <w:t>()</w:t>
+      </w:r>
+      <w:r>
+        <w:t xml:space="preserve"> method I discovered it was possible to pass commands to the container</w:t>
+      </w:r>
+      <w:r>
+        <w:t xml:space="preserve"> </w:t>
+      </w:r>
+      <w:sdt>
+        <w:sdtPr>
+          <w:id w:val="480127538"/>
+          <w:citation/>
+        </w:sdtPr>
+        <w:sdtContent>
+          <w:r>
+            <w:fldChar w:fldCharType="begin"/>
+          </w:r>
+          <w:r>
+            <w:rPr>
+              <w:lang w:val="en-US"/>
+            </w:rPr>
+            <w:instrText xml:space="preserve"> CITATION Doc25 \l 1033 </w:instrText>
+          </w:r>
+          <w:r>
+            <w:fldChar w:fldCharType="separate"/>
+          </w:r>
+          <w:r>
+            <w:rPr>
+              <w:noProof/>
+              <w:lang w:val="en-US"/>
+            </w:rPr>
+            <w:t>(Docker, 2025)</w:t>
+          </w:r>
+          <w:r>
+            <w:fldChar w:fldCharType="end"/>
+          </w:r>
+        </w:sdtContent>
+      </w:sdt>
+      <w:r>
+        <w:t>. Figuring out the correct combination of shell commands took a lot of trial and error and research to do properly. From this I learned</w:t>
+      </w:r>
+      <w:r>
+        <w:t xml:space="preserve"> some basic shell scripting for example,</w:t>
+      </w:r>
+      <w:r>
+        <w:t xml:space="preserve">  </w:t>
+      </w:r>
+      <w:r>
+        <w:t>how to use the cat command along with a heredoc (</w:t>
+      </w:r>
+      <w:r>
+        <w:rPr>
+          <w:rFonts w:ascii="Courier New" w:hAnsi="Courier New" w:cs="Courier New"/>
+        </w:rPr>
+        <w:t>cat &lt;&lt; ‘EOF’ &gt; Main.java</w:t>
+      </w:r>
+      <w:r>
+        <w:t xml:space="preserve"> and </w:t>
+      </w:r>
+      <w:r>
+        <w:rPr>
+          <w:rFonts w:ascii="Courier New" w:hAnsi="Courier New" w:cs="Courier New"/>
+        </w:rPr>
+        <w:t xml:space="preserve">cat &lt;&lt; 'ENDINPUT' &gt; </w:t>
+      </w:r>
+      <w:proofErr w:type="spellStart"/>
+      <w:r>
+        <w:rPr>
+          <w:rFonts w:ascii="Courier New" w:hAnsi="Courier New" w:cs="Courier New"/>
+        </w:rPr>
+        <w:t>input.json</w:t>
+      </w:r>
+      <w:proofErr w:type="spellEnd"/>
+      <w:r>
+        <w:t xml:space="preserve">) to write data to a file. </w:t>
+      </w:r>
+      <w:r>
+        <w:t>This allowed me to then compile (</w:t>
+      </w:r>
+      <w:proofErr w:type="spellStart"/>
+      <w:r>
+        <w:rPr>
+          <w:rFonts w:ascii="Courier New" w:hAnsi="Courier New" w:cs="Courier New"/>
+        </w:rPr>
+        <w:t>javac</w:t>
+      </w:r>
+      <w:proofErr w:type="spellEnd"/>
+      <w:r>
+        <w:rPr>
+          <w:rFonts w:ascii="Courier New" w:hAnsi="Courier New" w:cs="Courier New"/>
+        </w:rPr>
+        <w:t xml:space="preserve"> Main.java</w:t>
+      </w:r>
+      <w:r>
+        <w:rPr>
+          <w:rFonts w:ascii="Courier New" w:hAnsi="Courier New" w:cs="Courier New"/>
+        </w:rPr>
+        <w:t xml:space="preserve">) </w:t>
+      </w:r>
+      <w:r>
+        <w:rPr>
+          <w:rFonts w:cs="Courier New"/>
+        </w:rPr>
+        <w:t>and run (</w:t>
+      </w:r>
+      <w:r>
+        <w:rPr>
+          <w:rFonts w:ascii="Courier New" w:hAnsi="Courier New" w:cs="Courier New"/>
+        </w:rPr>
+        <w:t xml:space="preserve">java -cp ".:/app/*" Main &lt; </w:t>
+      </w:r>
+      <w:proofErr w:type="spellStart"/>
+      <w:r>
+        <w:rPr>
+          <w:rFonts w:ascii="Courier New" w:hAnsi="Courier New" w:cs="Courier New"/>
+        </w:rPr>
+        <w:t>input.json</w:t>
+      </w:r>
+      <w:proofErr w:type="spellEnd"/>
+      <w:r>
+        <w:rPr>
+          <w:rFonts w:cs="Courier New"/>
+        </w:rPr>
+        <w:t>) my Java code inside of the Docker container</w:t>
+      </w:r>
+      <w:r>
+        <w:rPr>
+          <w:rFonts w:cs="Courier New"/>
+        </w:rPr>
+        <w:t xml:space="preserve"> (see figure x)</w:t>
+      </w:r>
+      <w:r>
+        <w:rPr>
+          <w:rFonts w:cs="Courier New"/>
+        </w:rPr>
+        <w:t xml:space="preserve">. </w:t>
+      </w:r>
+    </w:p>
+    <w:p>
+      <w:pPr>
+        <w:jc w:val="center"/>
+        <w:rPr>
+          <w:rFonts w:cs="Courier New"/>
+        </w:rPr>
+      </w:pPr>
+      <w:r>
+        <w:rPr>
+          <w:rFonts w:cs="Courier New"/>
+        </w:rPr>
+        <w:drawing>
+          <wp:inline distT="0" distB="0" distL="0" distR="0" wp14:anchorId="0DF2339E" wp14:editId="1B24F2A5">
+            <wp:extent cx="2559761" cy="1475117"/>
+            <wp:effectExtent l="0" t="0" r="0" b="0"/>
+            <wp:docPr id="1009972717" name="Picture 1"/>
+            <wp:cNvGraphicFramePr>
+              <a:graphicFrameLocks xmlns:a="http://schemas.openxmlformats.org/drawingml/2006/main" noChangeAspect="1"/>
+            </wp:cNvGraphicFramePr>
+            <a:graphic xmlns:a="http://schemas.openxmlformats.org/drawingml/2006/main">
+              <a:graphicData uri="http://schemas.openxmlformats.org/drawingml/2006/picture">
+                <pic:pic xmlns:pic="http://schemas.openxmlformats.org/drawingml/2006/picture">
+                  <pic:nvPicPr>
+                    <pic:cNvPr id="1009972717" name=""/>
+                    <pic:cNvPicPr/>
+                  </pic:nvPicPr>
+                  <pic:blipFill>
+                    <a:blip r:embed="rId20"/>
+                    <a:stretch>
+                      <a:fillRect/>
+                    </a:stretch>
+                  </pic:blipFill>
+                  <pic:spPr>
+                    <a:xfrm>
+                      <a:off x="0" y="0"/>
+                      <a:ext cx="2574005" cy="1483326"/>
+                    </a:xfrm>
+                    <a:prstGeom prst="rect">
+                      <a:avLst/>
+                    </a:prstGeom>
+                  </pic:spPr>
+                </pic:pic>
+              </a:graphicData>
+            </a:graphic>
+          </wp:inline>
+        </w:drawing>
+      </w:r>
+    </w:p>
+    <w:p/>
+    <w:p>
+      <w:r>
+        <w:t xml:space="preserve">The security and resource parameters needed to be set correctly on the </w:t>
+      </w:r>
+      <w:proofErr w:type="spellStart"/>
+      <w:r>
+        <w:rPr>
+          <w:rFonts w:ascii="Courier New" w:hAnsi="Courier New" w:cs="Courier New"/>
+        </w:rPr>
+        <w:t>createContainer</w:t>
+      </w:r>
+      <w:proofErr w:type="spellEnd"/>
+      <w:r>
+        <w:rPr>
+          <w:rFonts w:ascii="Courier New" w:hAnsi="Courier New" w:cs="Courier New"/>
+        </w:rPr>
+        <w:t xml:space="preserve">() </w:t>
+      </w:r>
+      <w:r>
+        <w:t>method so that resource and network access were limited</w:t>
+      </w:r>
+      <w:r>
+        <w:t xml:space="preserve"> on the new container</w:t>
+      </w:r>
+      <w:r>
+        <w:t xml:space="preserve">. This task </w:t>
+      </w:r>
+      <w:r>
+        <w:t>proved</w:t>
+      </w:r>
+      <w:r>
+        <w:t xml:space="preserve"> simpler than the other tasks </w:t>
+      </w:r>
+      <w:r>
+        <w:t xml:space="preserve">related </w:t>
+      </w:r>
+      <w:r>
+        <w:t>to Docker as it was just a matter of setting parameters correctly</w:t>
+      </w:r>
+      <w:r>
+        <w:t xml:space="preserve">. Most importantly </w:t>
+      </w:r>
+      <w:proofErr w:type="spellStart"/>
+      <w:r>
+        <w:t>NetworkMode</w:t>
+      </w:r>
+      <w:proofErr w:type="spellEnd"/>
+      <w:r>
+        <w:t xml:space="preserve"> had to be set to “none” to prevent connection to external networks. Resource limits were also set to prevent the system from hanging in the event of an infinite loop or DDOS attacks</w:t>
+      </w:r>
+      <w:r>
+        <w:t xml:space="preserve"> (see figure x)</w:t>
+      </w:r>
+      <w:r>
+        <w:t>. I discovered how to do this via the Docker Engine API documentation</w:t>
+      </w:r>
+      <w:r>
+        <w:t xml:space="preserve"> </w:t>
+      </w:r>
+      <w:sdt>
+        <w:sdtPr>
+          <w:id w:val="-1816412687"/>
+          <w:citation/>
+        </w:sdtPr>
+        <w:sdtContent>
+          <w:r>
+            <w:fldChar w:fldCharType="begin"/>
+          </w:r>
+          <w:r>
+            <w:rPr>
+              <w:lang w:val="en-US"/>
+            </w:rPr>
+            <w:instrText xml:space="preserve"> CITATION Doc25 \l 1033 </w:instrText>
+          </w:r>
+          <w:r>
+            <w:fldChar w:fldCharType="separate"/>
+          </w:r>
+          <w:r>
+            <w:rPr>
+              <w:noProof/>
+              <w:lang w:val="en-US"/>
+            </w:rPr>
+            <w:t>(Docker, 2025)</w:t>
+          </w:r>
+          <w:r>
+            <w:fldChar w:fldCharType="end"/>
+          </w:r>
+        </w:sdtContent>
+      </w:sdt>
+      <w:r>
+        <w:t>.</w:t>
+      </w:r>
+    </w:p>
+    <w:p>
+      <w:pPr>
+        <w:jc w:val="center"/>
+      </w:pPr>
+      <w:r>
+        <w:drawing>
+          <wp:inline distT="0" distB="0" distL="0" distR="0" wp14:anchorId="65C90121" wp14:editId="62B1F671">
+            <wp:extent cx="2605177" cy="1967595"/>
+            <wp:effectExtent l="0" t="0" r="5080" b="0"/>
+            <wp:docPr id="950377726" name="Picture 1"/>
+            <wp:cNvGraphicFramePr>
+              <a:graphicFrameLocks xmlns:a="http://schemas.openxmlformats.org/drawingml/2006/main" noChangeAspect="1"/>
+            </wp:cNvGraphicFramePr>
+            <a:graphic xmlns:a="http://schemas.openxmlformats.org/drawingml/2006/main">
+              <a:graphicData uri="http://schemas.openxmlformats.org/drawingml/2006/picture">
+                <pic:pic xmlns:pic="http://schemas.openxmlformats.org/drawingml/2006/picture">
+                  <pic:nvPicPr>
+                    <pic:cNvPr id="950377726" name=""/>
+                    <pic:cNvPicPr/>
+                  </pic:nvPicPr>
+                  <pic:blipFill>
+                    <a:blip r:embed="rId21"/>
+                    <a:stretch>
+                      <a:fillRect/>
+                    </a:stretch>
+                  </pic:blipFill>
+                  <pic:spPr>
+                    <a:xfrm>
+                      <a:off x="0" y="0"/>
+                      <a:ext cx="2608263" cy="1969925"/>
+                    </a:xfrm>
+                    <a:prstGeom prst="rect">
+                      <a:avLst/>
+                    </a:prstGeom>
+                  </pic:spPr>
+                </pic:pic>
+              </a:graphicData>
+            </a:graphic>
+          </wp:inline>
+        </w:drawing>
+      </w:r>
+    </w:p>
+    <w:p>
+      <w:pPr>
+        <w:jc w:val="center"/>
+      </w:pPr>
+    </w:p>
+    <w:p>
+      <w:r>
+        <w:t xml:space="preserve">After the previous steps were in place, starting and stopping the Docker container was easy. The next challenge would be handling the output from the Docker container after student code had been executed. </w:t>
+      </w:r>
+      <w:r>
+        <w:t>Initially, I assumed that the output from the container would be returned as a simple string. However, this was not the case. Docker returns logs in a buffered format which includes additional metadata headers for each chunk of output. This meant that the raw output could not be used directly, as it contained extra bytes that would interfere with parsing and comparison.</w:t>
+      </w:r>
+    </w:p>
+    <w:p/>
+    <w:p/>
+    <w:p>
+      <w:pPr>
+        <w:rPr>
+          <w:color w:val="0E2841" w:themeColor="text2"/>
+          <w:sz w:val="18"/>
+          <w:szCs w:val="18"/>
+        </w:rPr>
+      </w:pPr>
+      <w:r>
+        <w:br w:type="page"/>
+      </w:r>
+    </w:p>
+    <w:p>
+      <w:pPr>
+        <w:pStyle w:val="Heading1"/>
+      </w:pPr>
+      <w:bookmarkStart w:id="10" w:name="_Toc226288855"/>
       <w:r>
         <w:lastRenderedPageBreak/>
         <w:t>Learnings</w:t>
       </w:r>
-      <w:bookmarkEnd w:id="2"/>
+      <w:bookmarkEnd w:id="10"/>
     </w:p>
     <w:p>
       <w:pPr>
@@ -727,12 +3023,15 @@
       <w:pPr>
         <w:pStyle w:val="Heading1"/>
       </w:pPr>
-      <w:bookmarkStart w:id="3" w:name="_Toc225840318"/>
+      <w:bookmarkStart w:id="11" w:name="_Toc226288856"/>
       <w:r>
         <w:lastRenderedPageBreak/>
         <w:t>Reflection</w:t>
       </w:r>
-      <w:bookmarkEnd w:id="3"/>
+      <w:bookmarkEnd w:id="11"/>
+      <w:r>
+        <w:t xml:space="preserve"> Summary</w:t>
+      </w:r>
       <w:r>
         <w:br w:type="page"/>
       </w:r>
@@ -741,16 +3040,17 @@
       <w:pPr>
         <w:pStyle w:val="Heading1"/>
       </w:pPr>
-      <w:bookmarkStart w:id="4" w:name="_Toc225840319"/>
+      <w:bookmarkStart w:id="12" w:name="_Toc226288857"/>
       <w:r>
         <w:lastRenderedPageBreak/>
         <w:t>Testing</w:t>
       </w:r>
-      <w:bookmarkEnd w:id="4"/>
+      <w:bookmarkEnd w:id="12"/>
     </w:p>
     <w:p>
       <w:pPr>
         <w:spacing w:line="278" w:lineRule="auto"/>
+        <w:jc w:val="both"/>
         <w:rPr>
           <w:rFonts w:asciiTheme="majorHAnsi" w:eastAsiaTheme="majorEastAsia" w:hAnsiTheme="majorHAnsi" w:cstheme="majorBidi"/>
           <w:color w:val="0F4761" w:themeColor="accent1" w:themeShade="BF"/>
@@ -766,15 +3066,133 @@
       <w:pPr>
         <w:pStyle w:val="Heading1"/>
       </w:pPr>
-      <w:bookmarkStart w:id="5" w:name="_Toc225840320"/>
+      <w:bookmarkStart w:id="13" w:name="_Toc226288858"/>
       <w:r>
         <w:lastRenderedPageBreak/>
         <w:t>Conclusion</w:t>
       </w:r>
-      <w:bookmarkEnd w:id="5"/>
-    </w:p>
+      <w:bookmarkEnd w:id="13"/>
+    </w:p>
+    <w:p>
+      <w:pPr>
+        <w:spacing w:line="278" w:lineRule="auto"/>
+      </w:pPr>
+      <w:r>
+        <w:br w:type="page"/>
+      </w:r>
+    </w:p>
+    <w:bookmarkStart w:id="14" w:name="_Toc226288859" w:displacedByCustomXml="next"/>
+    <w:sdt>
+      <w:sdtPr>
+        <w:id w:val="-374387188"/>
+        <w:docPartObj>
+          <w:docPartGallery w:val="Bibliographies"/>
+          <w:docPartUnique/>
+        </w:docPartObj>
+      </w:sdtPr>
+      <w:sdtEndPr>
+        <w:rPr>
+          <w:rFonts w:asciiTheme="minorHAnsi" w:eastAsiaTheme="minorHAnsi" w:hAnsiTheme="minorHAnsi" w:cstheme="minorBidi"/>
+          <w:color w:val="auto"/>
+          <w:sz w:val="22"/>
+          <w:szCs w:val="22"/>
+        </w:rPr>
+      </w:sdtEndPr>
+      <w:sdtContent>
+        <w:p>
+          <w:pPr>
+            <w:pStyle w:val="Heading1"/>
+          </w:pPr>
+          <w:r>
+            <w:t>Bibliography</w:t>
+          </w:r>
+          <w:bookmarkEnd w:id="14"/>
+        </w:p>
+        <w:sdt>
+          <w:sdtPr>
+            <w:id w:val="111145805"/>
+            <w:bibliography/>
+          </w:sdtPr>
+          <w:sdtContent>
+            <w:p>
+              <w:pPr>
+                <w:pStyle w:val="Bibliography"/>
+                <w:rPr>
+                  <w:noProof/>
+                  <w:kern w:val="0"/>
+                  <w:sz w:val="24"/>
+                  <w:szCs w:val="24"/>
+                  <w14:ligatures w14:val="none"/>
+                </w:rPr>
+              </w:pPr>
+              <w:r>
+                <w:fldChar w:fldCharType="begin"/>
+              </w:r>
+              <w:r>
+                <w:instrText xml:space="preserve"> BIBLIOGRAPHY </w:instrText>
+              </w:r>
+              <w:r>
+                <w:fldChar w:fldCharType="separate"/>
+              </w:r>
+              <w:r>
+                <w:rPr>
+                  <w:noProof/>
+                </w:rPr>
+                <w:t xml:space="preserve">Gore, A., 2022. </w:t>
+              </w:r>
+              <w:r>
+                <w:rPr>
+                  <w:i/>
+                  <w:iCs/>
+                  <w:noProof/>
+                </w:rPr>
+                <w:t xml:space="preserve">treblle. </w:t>
+              </w:r>
+              <w:r>
+                <w:rPr>
+                  <w:noProof/>
+                </w:rPr>
+                <w:t xml:space="preserve">[Online] </w:t>
+              </w:r>
+              <w:r>
+                <w:rPr>
+                  <w:noProof/>
+                </w:rPr>
+                <w:br/>
+                <w:t xml:space="preserve">Available at: </w:t>
+              </w:r>
+              <w:r>
+                <w:rPr>
+                  <w:noProof/>
+                  <w:u w:val="single"/>
+                </w:rPr>
+                <w:t>https://treblle.com/blog/egergr</w:t>
+              </w:r>
+              <w:r>
+                <w:rPr>
+                  <w:noProof/>
+                </w:rPr>
+                <w:br/>
+                <w:t>[Accessed 5 April 2026].</w:t>
+              </w:r>
+            </w:p>
+            <w:p>
+              <w:r>
+                <w:rPr>
+                  <w:b/>
+                  <w:bCs/>
+                  <w:noProof/>
+                </w:rPr>
+                <w:fldChar w:fldCharType="end"/>
+              </w:r>
+            </w:p>
+          </w:sdtContent>
+        </w:sdt>
+      </w:sdtContent>
+    </w:sdt>
+    <w:p/>
     <w:sectPr>
-      <w:footerReference w:type="default" r:id="rId8"/>
+      <w:footerReference w:type="default" r:id="rId22"/>
       <w:pgSz w:w="11906" w:h="16838"/>
       <w:pgMar w:top="1440" w:right="1440" w:bottom="1440" w:left="1440" w:header="708" w:footer="708" w:gutter="0"/>
       <w:cols w:space="708"/>
@@ -885,6 +3303,243 @@
     </w:p>
   </w:footnote>
 </w:footnotes>
+</file>
+
+<file path=word/numbering.xml><?xml version="1.0" encoding="utf-8"?>
+<w:numbering xmlns:wpc="http://schemas.microsoft.com/office/word/2010/wordprocessingCanvas" xmlns:cx="http://schemas.microsoft.com/office/drawing/2014/chartex" xmlns:cx1="http://schemas.microsoft.com/office/drawing/2015/9/8/chartex" xmlns:cx2="http://schemas.microsoft.com/office/drawing/2015/10/21/chartex" xmlns:cx3="http://schemas.microsoft.com/office/drawing/2016/5/9/chartex" xmlns:cx4="http://schemas.microsoft.com/office/drawing/2016/5/10/chartex" xmlns:cx5="http://schemas.microsoft.com/office/drawing/2016/5/11/chartex" xmlns:cx6="http://schemas.microsoft.com/office/drawing/2016/5/12/chartex" xmlns:cx7="http://schemas.microsoft.com/office/drawing/2016/5/13/chartex" xmlns:cx8="http://schemas.microsoft.com/office/drawing/2016/5/14/chartex" xmlns:mc="http://schemas.openxmlformats.org/markup-compatibility/2006" xmlns:aink="http://schemas.microsoft.com/office/drawing/2016/ink" xmlns:am3d="http://schemas.microsoft.com/office/drawing/2017/model3d" xmlns:o="urn:schemas-microsoft-com:office:office" xmlns:oel="http://schemas.microsoft.com/office/2019/extlst" xmlns:r="http://schemas.openxmlformats.org/officeDocument/2006/relationships" xmlns:m="http://schemas.openxmlformats.org/officeDocument/2006/math" xmlns:v="urn:schemas-microsoft-com:vml" xmlns:wp14="http://schemas.microsoft.com/office/word/2010/wordprocessingDrawing" xmlns:wp="http://schemas.openxmlformats.org/drawingml/2006/wordprocessingDrawing" xmlns:w10="urn:schemas-microsoft-com:office:word" xmlns:w="http://schemas.openxmlformats.org/wordprocessingml/2006/main" xmlns:w14="http://schemas.microsoft.com/office/word/2010/wordml" xmlns:w15="http://schemas.microsoft.com/office/word/2012/wordml" xmlns:w16cex="http://schemas.microsoft.com/office/word/2018/wordml/cex" xmlns:w16cid="http://schemas.microsoft.com/office/word/2016/wordml/cid" xmlns:w16="http://schemas.microsoft.com/office/word/2018/wordml" xmlns:w16du="http://schemas.microsoft.com/office/word/2023/wordml/word16du" xmlns:w16sdtdh="http://schemas.microsoft.com/office/word/2020/wordml/sdtdatahash" xmlns:w16sdtfl="http://schemas.microsoft.com/office/word/2024/wordml/sdtformatlock" xmlns:w16se="http://schemas.microsoft.com/office/word/2015/wordml/symex" xmlns:wpg="http://schemas.microsoft.com/office/word/2010/wordprocessingGroup" xmlns:wpi="http://schemas.microsoft.com/office/word/2010/wordprocessingInk" xmlns:wne="http://schemas.microsoft.com/office/word/2006/wordml" xmlns:wps="http://schemas.microsoft.com/office/word/2010/wordprocessingShape" mc:Ignorable="w14 w15 w16se w16cid w16 w16cex w16sdtdh w16sdtfl w16du wp14">
+  <w:abstractNum w:abstractNumId="0" w15:restartNumberingAfterBreak="0">
+    <w:nsid w:val="16980950"/>
+    <w:multiLevelType w:val="hybridMultilevel"/>
+    <w:tmpl w:val="F6F4BB66"/>
+    <w:lvl w:ilvl="0" w:tplc="18090001">
+      <w:start w:val="1"/>
+      <w:numFmt w:val="bullet"/>
+      <w:lvlText w:val=""/>
+      <w:lvlJc w:val="left"/>
+      <w:pPr>
+        <w:ind w:left="720" w:hanging="360"/>
+      </w:pPr>
+      <w:rPr>
+        <w:rFonts w:ascii="Symbol" w:hAnsi="Symbol" w:hint="default"/>
+      </w:rPr>
+    </w:lvl>
+    <w:lvl w:ilvl="1" w:tplc="18090003" w:tentative="1">
+      <w:start w:val="1"/>
+      <w:numFmt w:val="bullet"/>
+      <w:lvlText w:val="o"/>
+      <w:lvlJc w:val="left"/>
+      <w:pPr>
+        <w:ind w:left="1440" w:hanging="360"/>
+      </w:pPr>
+      <w:rPr>
+        <w:rFonts w:ascii="Courier New" w:hAnsi="Courier New" w:cs="Courier New" w:hint="default"/>
+      </w:rPr>
+    </w:lvl>
+    <w:lvl w:ilvl="2" w:tplc="18090005" w:tentative="1">
+      <w:start w:val="1"/>
+      <w:numFmt w:val="bullet"/>
+      <w:lvlText w:val=""/>
+      <w:lvlJc w:val="left"/>
+      <w:pPr>
+        <w:ind w:left="2160" w:hanging="360"/>
+      </w:pPr>
+      <w:rPr>
+        <w:rFonts w:ascii="Wingdings" w:hAnsi="Wingdings" w:hint="default"/>
+      </w:rPr>
+    </w:lvl>
+    <w:lvl w:ilvl="3" w:tplc="18090001" w:tentative="1">
+      <w:start w:val="1"/>
+      <w:numFmt w:val="bullet"/>
+      <w:lvlText w:val=""/>
+      <w:lvlJc w:val="left"/>
+      <w:pPr>
+        <w:ind w:left="2880" w:hanging="360"/>
+      </w:pPr>
+      <w:rPr>
+        <w:rFonts w:ascii="Symbol" w:hAnsi="Symbol" w:hint="default"/>
+      </w:rPr>
+    </w:lvl>
+    <w:lvl w:ilvl="4" w:tplc="18090003" w:tentative="1">
+      <w:start w:val="1"/>
+      <w:numFmt w:val="bullet"/>
+      <w:lvlText w:val="o"/>
+      <w:lvlJc w:val="left"/>
+      <w:pPr>
+        <w:ind w:left="3600" w:hanging="360"/>
+      </w:pPr>
+      <w:rPr>
+        <w:rFonts w:ascii="Courier New" w:hAnsi="Courier New" w:cs="Courier New" w:hint="default"/>
+      </w:rPr>
+    </w:lvl>
+    <w:lvl w:ilvl="5" w:tplc="18090005" w:tentative="1">
+      <w:start w:val="1"/>
+      <w:numFmt w:val="bullet"/>
+      <w:lvlText w:val=""/>
+      <w:lvlJc w:val="left"/>
+      <w:pPr>
+        <w:ind w:left="4320" w:hanging="360"/>
+      </w:pPr>
+      <w:rPr>
+        <w:rFonts w:ascii="Wingdings" w:hAnsi="Wingdings" w:hint="default"/>
+      </w:rPr>
+    </w:lvl>
+    <w:lvl w:ilvl="6" w:tplc="18090001" w:tentative="1">
+      <w:start w:val="1"/>
+      <w:numFmt w:val="bullet"/>
+      <w:lvlText w:val=""/>
+      <w:lvlJc w:val="left"/>
+      <w:pPr>
+        <w:ind w:left="5040" w:hanging="360"/>
+      </w:pPr>
+      <w:rPr>
+        <w:rFonts w:ascii="Symbol" w:hAnsi="Symbol" w:hint="default"/>
+      </w:rPr>
+    </w:lvl>
+    <w:lvl w:ilvl="7" w:tplc="18090003" w:tentative="1">
+      <w:start w:val="1"/>
+      <w:numFmt w:val="bullet"/>
+      <w:lvlText w:val="o"/>
+      <w:lvlJc w:val="left"/>
+      <w:pPr>
+        <w:ind w:left="5760" w:hanging="360"/>
+      </w:pPr>
+      <w:rPr>
+        <w:rFonts w:ascii="Courier New" w:hAnsi="Courier New" w:cs="Courier New" w:hint="default"/>
+      </w:rPr>
+    </w:lvl>
+    <w:lvl w:ilvl="8" w:tplc="18090005" w:tentative="1">
+      <w:start w:val="1"/>
+      <w:numFmt w:val="bullet"/>
+      <w:lvlText w:val=""/>
+      <w:lvlJc w:val="left"/>
+      <w:pPr>
+        <w:ind w:left="6480" w:hanging="360"/>
+      </w:pPr>
+      <w:rPr>
+        <w:rFonts w:ascii="Wingdings" w:hAnsi="Wingdings" w:hint="default"/>
+      </w:rPr>
+    </w:lvl>
+  </w:abstractNum>
+  <w:abstractNum w:abstractNumId="1" w15:restartNumberingAfterBreak="0">
+    <w:nsid w:val="3AC44301"/>
+    <w:multiLevelType w:val="hybridMultilevel"/>
+    <w:tmpl w:val="8372221C"/>
+    <w:lvl w:ilvl="0" w:tplc="18090001">
+      <w:start w:val="1"/>
+      <w:numFmt w:val="bullet"/>
+      <w:lvlText w:val=""/>
+      <w:lvlJc w:val="left"/>
+      <w:pPr>
+        <w:ind w:left="761" w:hanging="360"/>
+      </w:pPr>
+      <w:rPr>
+        <w:rFonts w:ascii="Symbol" w:hAnsi="Symbol" w:hint="default"/>
+      </w:rPr>
+    </w:lvl>
+    <w:lvl w:ilvl="1" w:tplc="18090003" w:tentative="1">
+      <w:start w:val="1"/>
+      <w:numFmt w:val="bullet"/>
+      <w:lvlText w:val="o"/>
+      <w:lvlJc w:val="left"/>
+      <w:pPr>
+        <w:ind w:left="1481" w:hanging="360"/>
+      </w:pPr>
+      <w:rPr>
+        <w:rFonts w:ascii="Courier New" w:hAnsi="Courier New" w:cs="Courier New" w:hint="default"/>
+      </w:rPr>
+    </w:lvl>
+    <w:lvl w:ilvl="2" w:tplc="18090005" w:tentative="1">
+      <w:start w:val="1"/>
+      <w:numFmt w:val="bullet"/>
+      <w:lvlText w:val=""/>
+      <w:lvlJc w:val="left"/>
+      <w:pPr>
+        <w:ind w:left="2201" w:hanging="360"/>
+      </w:pPr>
+      <w:rPr>
+        <w:rFonts w:ascii="Wingdings" w:hAnsi="Wingdings" w:hint="default"/>
+      </w:rPr>
+    </w:lvl>
+    <w:lvl w:ilvl="3" w:tplc="18090001" w:tentative="1">
+      <w:start w:val="1"/>
+      <w:numFmt w:val="bullet"/>
+      <w:lvlText w:val=""/>
+      <w:lvlJc w:val="left"/>
+      <w:pPr>
+        <w:ind w:left="2921" w:hanging="360"/>
+      </w:pPr>
+      <w:rPr>
+        <w:rFonts w:ascii="Symbol" w:hAnsi="Symbol" w:hint="default"/>
+      </w:rPr>
+    </w:lvl>
+    <w:lvl w:ilvl="4" w:tplc="18090003" w:tentative="1">
+      <w:start w:val="1"/>
+      <w:numFmt w:val="bullet"/>
+      <w:lvlText w:val="o"/>
+      <w:lvlJc w:val="left"/>
+      <w:pPr>
+        <w:ind w:left="3641" w:hanging="360"/>
+      </w:pPr>
+      <w:rPr>
+        <w:rFonts w:ascii="Courier New" w:hAnsi="Courier New" w:cs="Courier New" w:hint="default"/>
+      </w:rPr>
+    </w:lvl>
+    <w:lvl w:ilvl="5" w:tplc="18090005" w:tentative="1">
+      <w:start w:val="1"/>
+      <w:numFmt w:val="bullet"/>
+      <w:lvlText w:val=""/>
+      <w:lvlJc w:val="left"/>
+      <w:pPr>
+        <w:ind w:left="4361" w:hanging="360"/>
+      </w:pPr>
+      <w:rPr>
+        <w:rFonts w:ascii="Wingdings" w:hAnsi="Wingdings" w:hint="default"/>
+      </w:rPr>
+    </w:lvl>
+    <w:lvl w:ilvl="6" w:tplc="18090001" w:tentative="1">
+      <w:start w:val="1"/>
+      <w:numFmt w:val="bullet"/>
+      <w:lvlText w:val=""/>
+      <w:lvlJc w:val="left"/>
+      <w:pPr>
+        <w:ind w:left="5081" w:hanging="360"/>
+      </w:pPr>
+      <w:rPr>
+        <w:rFonts w:ascii="Symbol" w:hAnsi="Symbol" w:hint="default"/>
+      </w:rPr>
+    </w:lvl>
+    <w:lvl w:ilvl="7" w:tplc="18090003" w:tentative="1">
+      <w:start w:val="1"/>
+      <w:numFmt w:val="bullet"/>
+      <w:lvlText w:val="o"/>
+      <w:lvlJc w:val="left"/>
+      <w:pPr>
+        <w:ind w:left="5801" w:hanging="360"/>
+      </w:pPr>
+      <w:rPr>
+        <w:rFonts w:ascii="Courier New" w:hAnsi="Courier New" w:cs="Courier New" w:hint="default"/>
+      </w:rPr>
+    </w:lvl>
+    <w:lvl w:ilvl="8" w:tplc="18090005" w:tentative="1">
+      <w:start w:val="1"/>
+      <w:numFmt w:val="bullet"/>
+      <w:lvlText w:val=""/>
+      <w:lvlJc w:val="left"/>
+      <w:pPr>
+        <w:ind w:left="6521" w:hanging="360"/>
+      </w:pPr>
+      <w:rPr>
+        <w:rFonts w:ascii="Wingdings" w:hAnsi="Wingdings" w:hint="default"/>
+      </w:rPr>
+    </w:lvl>
+  </w:abstractNum>
+  <w:num w:numId="1" w16cid:durableId="2089114307">
+    <w:abstractNumId w:val="1"/>
+  </w:num>
+  <w:num w:numId="2" w16cid:durableId="877082984">
+    <w:abstractNumId w:val="0"/>
+  </w:num>
+</w:numbering>
 </file>
 
 <file path=word/styles.xml><?xml version="1.0" encoding="utf-8"?>
@@ -1323,7 +3978,6 @@
     <w:next w:val="Normal"/>
     <w:link w:val="Heading2Char"/>
     <w:uiPriority w:val="9"/>
-    <w:semiHidden/>
     <w:unhideWhenUsed/>
     <w:qFormat/>
     <w:rsid w:val="00AE3E15"/>
@@ -1510,7 +4164,6 @@
   <w:style w:type="character" w:default="1" w:styleId="DefaultParagraphFont">
     <w:name w:val="Default Paragraph Font"/>
     <w:uiPriority w:val="1"/>
-    <w:semiHidden/>
     <w:unhideWhenUsed/>
   </w:style>
   <w:style w:type="table" w:default="1" w:styleId="TableNormal">
@@ -1552,7 +4205,6 @@
     <w:basedOn w:val="DefaultParagraphFont"/>
     <w:link w:val="Heading2"/>
     <w:uiPriority w:val="9"/>
-    <w:semiHidden/>
     <w:rsid w:val="00AE3E15"/>
     <w:rPr>
       <w:rFonts w:asciiTheme="majorHAnsi" w:eastAsiaTheme="majorEastAsia" w:hAnsiTheme="majorHAnsi" w:cstheme="majorBidi"/>
@@ -1929,6 +4581,57 @@
       <w:u w:val="single"/>
     </w:rPr>
   </w:style>
+  <w:style w:type="paragraph" w:styleId="Caption">
+    <w:name w:val="caption"/>
+    <w:basedOn w:val="Normal"/>
+    <w:next w:val="Normal"/>
+    <w:uiPriority w:val="35"/>
+    <w:unhideWhenUsed/>
+    <w:qFormat/>
+    <w:rsid w:val="0034034F"/>
+    <w:pPr>
+      <w:spacing w:after="200" w:line="240" w:lineRule="auto"/>
+    </w:pPr>
+    <w:rPr>
+      <w:i/>
+      <w:iCs/>
+      <w:color w:val="0E2841" w:themeColor="text2"/>
+      <w:sz w:val="18"/>
+      <w:szCs w:val="18"/>
+    </w:rPr>
+  </w:style>
+  <w:style w:type="paragraph" w:styleId="TableofFigures">
+    <w:name w:val="table of figures"/>
+    <w:basedOn w:val="Normal"/>
+    <w:next w:val="Normal"/>
+    <w:uiPriority w:val="99"/>
+    <w:unhideWhenUsed/>
+    <w:rsid w:val="006C63FC"/>
+    <w:pPr>
+      <w:spacing w:after="0"/>
+    </w:pPr>
+  </w:style>
+  <w:style w:type="paragraph" w:styleId="Bibliography">
+    <w:name w:val="Bibliography"/>
+    <w:basedOn w:val="Normal"/>
+    <w:next w:val="Normal"/>
+    <w:uiPriority w:val="37"/>
+    <w:unhideWhenUsed/>
+    <w:rsid w:val="006C63FC"/>
+  </w:style>
+  <w:style w:type="paragraph" w:styleId="TOC2">
+    <w:name w:val="toc 2"/>
+    <w:basedOn w:val="Normal"/>
+    <w:next w:val="Normal"/>
+    <w:autoRedefine/>
+    <w:uiPriority w:val="39"/>
+    <w:unhideWhenUsed/>
+    <w:rsid w:val="003567E8"/>
+    <w:pPr>
+      <w:spacing w:after="100"/>
+      <w:ind w:left="220"/>
+    </w:pPr>
+  </w:style>
 </w:styles>
 </file>
 
@@ -2228,11 +4931,72 @@
 </file>
 
 <file path=customXml/item1.xml><?xml version="1.0" encoding="utf-8"?>
-<b:Sources xmlns:b="http://schemas.openxmlformats.org/officeDocument/2006/bibliography" xmlns="http://schemas.openxmlformats.org/officeDocument/2006/bibliography" SelectedStyle="\HarvardAnglia2008OfficeOnline.xsl" StyleName="Harvard - Anglia" Version="2008"/>
+<b:Sources xmlns:b="http://schemas.openxmlformats.org/officeDocument/2006/bibliography" xmlns="http://schemas.openxmlformats.org/officeDocument/2006/bibliography" SelectedStyle="\HarvardAnglia2008OfficeOnline.xsl" StyleName="Harvard - Anglia" Version="2008">
+  <b:Source>
+    <b:Tag>Ant22</b:Tag>
+    <b:SourceType>InternetSite</b:SourceType>
+    <b:Guid>{8D2BC9B4-7B25-4F15-ACE5-D8EB222C295E}</b:Guid>
+    <b:Author>
+      <b:Author>
+        <b:NameList>
+          <b:Person>
+            <b:Last>Gore</b:Last>
+            <b:First>Anthony</b:First>
+          </b:Person>
+        </b:NameList>
+      </b:Author>
+    </b:Author>
+    <b:Title>treblle</b:Title>
+    <b:Year>2022</b:Year>
+    <b:YearAccessed>2026</b:YearAccessed>
+    <b:MonthAccessed>April</b:MonthAccessed>
+    <b:DayAccessed>5</b:DayAccessed>
+    <b:URL>https://treblle.com/blog/egergr</b:URL>
+    <b:RefOrder>1</b:RefOrder>
+  </b:Source>
+  <b:Source>
+    <b:Tag>Doc25</b:Tag>
+    <b:SourceType>InternetSite</b:SourceType>
+    <b:Guid>{0ECB8916-47BB-4C7B-95B9-8F66DA58F0D7}</b:Guid>
+    <b:Author>
+      <b:Author>
+        <b:Corporate>Docker</b:Corporate>
+      </b:Author>
+    </b:Author>
+    <b:Title>Docker Engine API</b:Title>
+    <b:Year>2025</b:Year>
+    <b:YearAccessed>2026</b:YearAccessed>
+    <b:MonthAccessed>April</b:MonthAccessed>
+    <b:DayAccessed>5</b:DayAccessed>
+    <b:URL>https://docs.docker.com/reference/api/engine/version/v1.52/</b:URL>
+    <b:RefOrder>3</b:RefOrder>
+  </b:Source>
+  <b:Source>
+    <b:Tag>apo26</b:Tag>
+    <b:SourceType>InternetSite</b:SourceType>
+    <b:Guid>{2688BF84-59BF-43B4-9D87-E1519C43A806}</b:Guid>
+    <b:Author>
+      <b:Author>
+        <b:NameList>
+          <b:Person>
+            <b:Last>apocas</b:Last>
+          </b:Person>
+        </b:NameList>
+      </b:Author>
+    </b:Author>
+    <b:Title>NPM - dockerode</b:Title>
+    <b:Year>2026</b:Year>
+    <b:YearAccessed>2026</b:YearAccessed>
+    <b:MonthAccessed>April</b:MonthAccessed>
+    <b:DayAccessed>05</b:DayAccessed>
+    <b:URL>https://www.npmjs.com/package/dockerode</b:URL>
+    <b:RefOrder>2</b:RefOrder>
+  </b:Source>
+</b:Sources>
 </file>
 
 <file path=customXml/itemProps1.xml><?xml version="1.0" encoding="utf-8"?>
-<ds:datastoreItem xmlns:ds="http://schemas.openxmlformats.org/officeDocument/2006/customXml" ds:itemID="{5570FF9A-DBBD-42CE-84F9-E210F9F32053}">
+<ds:datastoreItem xmlns:ds="http://schemas.openxmlformats.org/officeDocument/2006/customXml" ds:itemID="{84CDC56E-6460-4FD8-8C4C-55113B48986F}">
   <ds:schemaRefs>
     <ds:schemaRef ds:uri="http://schemas.openxmlformats.org/officeDocument/2006/bibliography"/>
   </ds:schemaRefs>

</xml_diff>

<commit_message>
Added industry day summary
</commit_message>
<xml_diff>
--- a/Documentation/SETU Code Lab Final Report.docx
+++ b/Documentation/SETU Code Lab Final Report.docx
@@ -225,7 +225,7 @@
           <w:r>
             <w:fldChar w:fldCharType="separate"/>
           </w:r>
-          <w:hyperlink w:anchor="_Toc227510365" w:history="1">
+          <w:hyperlink w:anchor="_Toc227585033" w:history="1">
             <w:r>
               <w:rPr>
                 <w:rStyle w:val="Hyperlink"/>
@@ -252,7 +252,7 @@
                 <w:noProof/>
                 <w:webHidden/>
               </w:rPr>
-              <w:instrText xml:space="preserve"> PAGEREF _Toc227510365 \h </w:instrText>
+              <w:instrText xml:space="preserve"> PAGEREF _Toc227585033 \h </w:instrText>
             </w:r>
             <w:r>
               <w:rPr>
@@ -297,7 +297,7 @@
               <w:lang w:eastAsia="en-IE"/>
             </w:rPr>
           </w:pPr>
-          <w:hyperlink w:anchor="_Toc227510366" w:history="1">
+          <w:hyperlink w:anchor="_Toc227585034" w:history="1">
             <w:r>
               <w:rPr>
                 <w:rStyle w:val="Hyperlink"/>
@@ -324,7 +324,7 @@
                 <w:noProof/>
                 <w:webHidden/>
               </w:rPr>
-              <w:instrText xml:space="preserve"> PAGEREF _Toc227510366 \h </w:instrText>
+              <w:instrText xml:space="preserve"> PAGEREF _Toc227585034 \h </w:instrText>
             </w:r>
             <w:r>
               <w:rPr>
@@ -369,7 +369,7 @@
               <w:lang w:eastAsia="en-IE"/>
             </w:rPr>
           </w:pPr>
-          <w:hyperlink w:anchor="_Toc227510367" w:history="1">
+          <w:hyperlink w:anchor="_Toc227585035" w:history="1">
             <w:r>
               <w:rPr>
                 <w:rStyle w:val="Hyperlink"/>
@@ -396,7 +396,7 @@
                 <w:noProof/>
                 <w:webHidden/>
               </w:rPr>
-              <w:instrText xml:space="preserve"> PAGEREF _Toc227510367 \h </w:instrText>
+              <w:instrText xml:space="preserve"> PAGEREF _Toc227585035 \h </w:instrText>
             </w:r>
             <w:r>
               <w:rPr>
@@ -441,7 +441,7 @@
               <w:lang w:eastAsia="en-IE"/>
             </w:rPr>
           </w:pPr>
-          <w:hyperlink w:anchor="_Toc227510368" w:history="1">
+          <w:hyperlink w:anchor="_Toc227585036" w:history="1">
             <w:r>
               <w:rPr>
                 <w:rStyle w:val="Hyperlink"/>
@@ -468,7 +468,7 @@
                 <w:noProof/>
                 <w:webHidden/>
               </w:rPr>
-              <w:instrText xml:space="preserve"> PAGEREF _Toc227510368 \h </w:instrText>
+              <w:instrText xml:space="preserve"> PAGEREF _Toc227585036 \h </w:instrText>
             </w:r>
             <w:r>
               <w:rPr>
@@ -513,7 +513,7 @@
               <w:lang w:eastAsia="en-IE"/>
             </w:rPr>
           </w:pPr>
-          <w:hyperlink w:anchor="_Toc227510369" w:history="1">
+          <w:hyperlink w:anchor="_Toc227585037" w:history="1">
             <w:r>
               <w:rPr>
                 <w:rStyle w:val="Hyperlink"/>
@@ -540,7 +540,7 @@
                 <w:noProof/>
                 <w:webHidden/>
               </w:rPr>
-              <w:instrText xml:space="preserve"> PAGEREF _Toc227510369 \h </w:instrText>
+              <w:instrText xml:space="preserve"> PAGEREF _Toc227585037 \h </w:instrText>
             </w:r>
             <w:r>
               <w:rPr>
@@ -585,7 +585,7 @@
               <w:lang w:eastAsia="en-IE"/>
             </w:rPr>
           </w:pPr>
-          <w:hyperlink w:anchor="_Toc227510370" w:history="1">
+          <w:hyperlink w:anchor="_Toc227585038" w:history="1">
             <w:r>
               <w:rPr>
                 <w:rStyle w:val="Hyperlink"/>
@@ -612,7 +612,7 @@
                 <w:noProof/>
                 <w:webHidden/>
               </w:rPr>
-              <w:instrText xml:space="preserve"> PAGEREF _Toc227510370 \h </w:instrText>
+              <w:instrText xml:space="preserve"> PAGEREF _Toc227585038 \h </w:instrText>
             </w:r>
             <w:r>
               <w:rPr>
@@ -657,7 +657,7 @@
               <w:lang w:eastAsia="en-IE"/>
             </w:rPr>
           </w:pPr>
-          <w:hyperlink w:anchor="_Toc227510371" w:history="1">
+          <w:hyperlink w:anchor="_Toc227585039" w:history="1">
             <w:r>
               <w:rPr>
                 <w:rStyle w:val="Hyperlink"/>
@@ -684,7 +684,7 @@
                 <w:noProof/>
                 <w:webHidden/>
               </w:rPr>
-              <w:instrText xml:space="preserve"> PAGEREF _Toc227510371 \h </w:instrText>
+              <w:instrText xml:space="preserve"> PAGEREF _Toc227585039 \h </w:instrText>
             </w:r>
             <w:r>
               <w:rPr>
@@ -729,7 +729,7 @@
               <w:lang w:eastAsia="en-IE"/>
             </w:rPr>
           </w:pPr>
-          <w:hyperlink w:anchor="_Toc227510372" w:history="1">
+          <w:hyperlink w:anchor="_Toc227585040" w:history="1">
             <w:r>
               <w:rPr>
                 <w:rStyle w:val="Hyperlink"/>
@@ -756,7 +756,7 @@
                 <w:noProof/>
                 <w:webHidden/>
               </w:rPr>
-              <w:instrText xml:space="preserve"> PAGEREF _Toc227510372 \h </w:instrText>
+              <w:instrText xml:space="preserve"> PAGEREF _Toc227585040 \h </w:instrText>
             </w:r>
             <w:r>
               <w:rPr>
@@ -801,7 +801,7 @@
               <w:lang w:eastAsia="en-IE"/>
             </w:rPr>
           </w:pPr>
-          <w:hyperlink w:anchor="_Toc227510373" w:history="1">
+          <w:hyperlink w:anchor="_Toc227585041" w:history="1">
             <w:r>
               <w:rPr>
                 <w:rStyle w:val="Hyperlink"/>
@@ -828,7 +828,7 @@
                 <w:noProof/>
                 <w:webHidden/>
               </w:rPr>
-              <w:instrText xml:space="preserve"> PAGEREF _Toc227510373 \h </w:instrText>
+              <w:instrText xml:space="preserve"> PAGEREF _Toc227585041 \h </w:instrText>
             </w:r>
             <w:r>
               <w:rPr>
@@ -873,7 +873,7 @@
               <w:lang w:eastAsia="en-IE"/>
             </w:rPr>
           </w:pPr>
-          <w:hyperlink w:anchor="_Toc227510374" w:history="1">
+          <w:hyperlink w:anchor="_Toc227585042" w:history="1">
             <w:r>
               <w:rPr>
                 <w:rStyle w:val="Hyperlink"/>
@@ -900,7 +900,7 @@
                 <w:noProof/>
                 <w:webHidden/>
               </w:rPr>
-              <w:instrText xml:space="preserve"> PAGEREF _Toc227510374 \h </w:instrText>
+              <w:instrText xml:space="preserve"> PAGEREF _Toc227585042 \h </w:instrText>
             </w:r>
             <w:r>
               <w:rPr>
@@ -945,7 +945,7 @@
               <w:lang w:eastAsia="en-IE"/>
             </w:rPr>
           </w:pPr>
-          <w:hyperlink w:anchor="_Toc227510375" w:history="1">
+          <w:hyperlink w:anchor="_Toc227585043" w:history="1">
             <w:r>
               <w:rPr>
                 <w:rStyle w:val="Hyperlink"/>
@@ -972,7 +972,7 @@
                 <w:noProof/>
                 <w:webHidden/>
               </w:rPr>
-              <w:instrText xml:space="preserve"> PAGEREF _Toc227510375 \h </w:instrText>
+              <w:instrText xml:space="preserve"> PAGEREF _Toc227585043 \h </w:instrText>
             </w:r>
             <w:r>
               <w:rPr>
@@ -1017,7 +1017,7 @@
               <w:lang w:eastAsia="en-IE"/>
             </w:rPr>
           </w:pPr>
-          <w:hyperlink w:anchor="_Toc227510376" w:history="1">
+          <w:hyperlink w:anchor="_Toc227585044" w:history="1">
             <w:r>
               <w:rPr>
                 <w:rStyle w:val="Hyperlink"/>
@@ -1044,7 +1044,7 @@
                 <w:noProof/>
                 <w:webHidden/>
               </w:rPr>
-              <w:instrText xml:space="preserve"> PAGEREF _Toc227510376 \h </w:instrText>
+              <w:instrText xml:space="preserve"> PAGEREF _Toc227585044 \h </w:instrText>
             </w:r>
             <w:r>
               <w:rPr>
@@ -1089,7 +1089,7 @@
               <w:lang w:eastAsia="en-IE"/>
             </w:rPr>
           </w:pPr>
-          <w:hyperlink w:anchor="_Toc227510377" w:history="1">
+          <w:hyperlink w:anchor="_Toc227585045" w:history="1">
             <w:r>
               <w:rPr>
                 <w:rStyle w:val="Hyperlink"/>
@@ -1116,7 +1116,7 @@
                 <w:noProof/>
                 <w:webHidden/>
               </w:rPr>
-              <w:instrText xml:space="preserve"> PAGEREF _Toc227510377 \h </w:instrText>
+              <w:instrText xml:space="preserve"> PAGEREF _Toc227585045 \h </w:instrText>
             </w:r>
             <w:r>
               <w:rPr>
@@ -1161,7 +1161,7 @@
               <w:lang w:eastAsia="en-IE"/>
             </w:rPr>
           </w:pPr>
-          <w:hyperlink w:anchor="_Toc227510378" w:history="1">
+          <w:hyperlink w:anchor="_Toc227585046" w:history="1">
             <w:r>
               <w:rPr>
                 <w:rStyle w:val="Hyperlink"/>
@@ -1188,7 +1188,7 @@
                 <w:noProof/>
                 <w:webHidden/>
               </w:rPr>
-              <w:instrText xml:space="preserve"> PAGEREF _Toc227510378 \h </w:instrText>
+              <w:instrText xml:space="preserve"> PAGEREF _Toc227585046 \h </w:instrText>
             </w:r>
             <w:r>
               <w:rPr>
@@ -1233,7 +1233,7 @@
               <w:lang w:eastAsia="en-IE"/>
             </w:rPr>
           </w:pPr>
-          <w:hyperlink w:anchor="_Toc227510379" w:history="1">
+          <w:hyperlink w:anchor="_Toc227585047" w:history="1">
             <w:r>
               <w:rPr>
                 <w:rStyle w:val="Hyperlink"/>
@@ -1260,7 +1260,7 @@
                 <w:noProof/>
                 <w:webHidden/>
               </w:rPr>
-              <w:instrText xml:space="preserve"> PAGEREF _Toc227510379 \h </w:instrText>
+              <w:instrText xml:space="preserve"> PAGEREF _Toc227585047 \h </w:instrText>
             </w:r>
             <w:r>
               <w:rPr>
@@ -1305,7 +1305,7 @@
               <w:lang w:eastAsia="en-IE"/>
             </w:rPr>
           </w:pPr>
-          <w:hyperlink w:anchor="_Toc227510380" w:history="1">
+          <w:hyperlink w:anchor="_Toc227585048" w:history="1">
             <w:r>
               <w:rPr>
                 <w:rStyle w:val="Hyperlink"/>
@@ -1332,7 +1332,7 @@
                 <w:noProof/>
                 <w:webHidden/>
               </w:rPr>
-              <w:instrText xml:space="preserve"> PAGEREF _Toc227510380 \h </w:instrText>
+              <w:instrText xml:space="preserve"> PAGEREF _Toc227585048 \h </w:instrText>
             </w:r>
             <w:r>
               <w:rPr>
@@ -1377,7 +1377,7 @@
               <w:lang w:eastAsia="en-IE"/>
             </w:rPr>
           </w:pPr>
-          <w:hyperlink w:anchor="_Toc227510381" w:history="1">
+          <w:hyperlink w:anchor="_Toc227585049" w:history="1">
             <w:r>
               <w:rPr>
                 <w:rStyle w:val="Hyperlink"/>
@@ -1404,7 +1404,7 @@
                 <w:noProof/>
                 <w:webHidden/>
               </w:rPr>
-              <w:instrText xml:space="preserve"> PAGEREF _Toc227510381 \h </w:instrText>
+              <w:instrText xml:space="preserve"> PAGEREF _Toc227585049 \h </w:instrText>
             </w:r>
             <w:r>
               <w:rPr>
@@ -1449,7 +1449,7 @@
               <w:lang w:eastAsia="en-IE"/>
             </w:rPr>
           </w:pPr>
-          <w:hyperlink w:anchor="_Toc227510382" w:history="1">
+          <w:hyperlink w:anchor="_Toc227585050" w:history="1">
             <w:r>
               <w:rPr>
                 <w:rStyle w:val="Hyperlink"/>
@@ -1476,7 +1476,7 @@
                 <w:noProof/>
                 <w:webHidden/>
               </w:rPr>
-              <w:instrText xml:space="preserve"> PAGEREF _Toc227510382 \h </w:instrText>
+              <w:instrText xml:space="preserve"> PAGEREF _Toc227585050 \h </w:instrText>
             </w:r>
             <w:r>
               <w:rPr>
@@ -1521,7 +1521,7 @@
               <w:lang w:eastAsia="en-IE"/>
             </w:rPr>
           </w:pPr>
-          <w:hyperlink w:anchor="_Toc227510383" w:history="1">
+          <w:hyperlink w:anchor="_Toc227585051" w:history="1">
             <w:r>
               <w:rPr>
                 <w:rStyle w:val="Hyperlink"/>
@@ -1548,7 +1548,7 @@
                 <w:noProof/>
                 <w:webHidden/>
               </w:rPr>
-              <w:instrText xml:space="preserve"> PAGEREF _Toc227510383 \h </w:instrText>
+              <w:instrText xml:space="preserve"> PAGEREF _Toc227585051 \h </w:instrText>
             </w:r>
             <w:r>
               <w:rPr>
@@ -1593,7 +1593,7 @@
               <w:lang w:eastAsia="en-IE"/>
             </w:rPr>
           </w:pPr>
-          <w:hyperlink w:anchor="_Toc227510384" w:history="1">
+          <w:hyperlink w:anchor="_Toc227585052" w:history="1">
             <w:r>
               <w:rPr>
                 <w:rStyle w:val="Hyperlink"/>
@@ -1620,7 +1620,7 @@
                 <w:noProof/>
                 <w:webHidden/>
               </w:rPr>
-              <w:instrText xml:space="preserve"> PAGEREF _Toc227510384 \h </w:instrText>
+              <w:instrText xml:space="preserve"> PAGEREF _Toc227585052 \h </w:instrText>
             </w:r>
             <w:r>
               <w:rPr>
@@ -1692,7 +1692,7 @@
       <w:pPr>
         <w:pStyle w:val="Heading1"/>
       </w:pPr>
-      <w:bookmarkStart w:id="0" w:name="_Toc227510365"/>
+      <w:bookmarkStart w:id="0" w:name="_Toc227585033"/>
       <w:r>
         <w:lastRenderedPageBreak/>
         <w:t>Table of Figures</w:t>
@@ -1722,7 +1722,7 @@
       <w:r>
         <w:fldChar w:fldCharType="separate"/>
       </w:r>
-      <w:hyperlink w:anchor="_Toc227510385" w:history="1">
+      <w:hyperlink w:anchor="_Toc227585053" w:history="1">
         <w:r>
           <w:rPr>
             <w:rStyle w:val="Hyperlink"/>
@@ -1758,7 +1758,7 @@
             <w:noProof/>
             <w:webHidden/>
           </w:rPr>
-          <w:instrText xml:space="preserve"> PAGEREF _Toc227510385 \h </w:instrText>
+          <w:instrText xml:space="preserve"> PAGEREF _Toc227585053 \h </w:instrText>
         </w:r>
         <w:r>
           <w:rPr>
@@ -1803,7 +1803,7 @@
           <w:lang w:eastAsia="en-IE"/>
         </w:rPr>
       </w:pPr>
-      <w:hyperlink w:anchor="_Toc227510386" w:history="1">
+      <w:hyperlink w:anchor="_Toc227585054" w:history="1">
         <w:r>
           <w:rPr>
             <w:rStyle w:val="Hyperlink"/>
@@ -1839,7 +1839,7 @@
             <w:noProof/>
             <w:webHidden/>
           </w:rPr>
-          <w:instrText xml:space="preserve"> PAGEREF _Toc227510386 \h </w:instrText>
+          <w:instrText xml:space="preserve"> PAGEREF _Toc227585054 \h </w:instrText>
         </w:r>
         <w:r>
           <w:rPr>
@@ -1884,7 +1884,7 @@
           <w:lang w:eastAsia="en-IE"/>
         </w:rPr>
       </w:pPr>
-      <w:hyperlink w:anchor="_Toc227510387" w:history="1">
+      <w:hyperlink w:anchor="_Toc227585055" w:history="1">
         <w:r>
           <w:rPr>
             <w:rStyle w:val="Hyperlink"/>
@@ -1920,7 +1920,7 @@
             <w:noProof/>
             <w:webHidden/>
           </w:rPr>
-          <w:instrText xml:space="preserve"> PAGEREF _Toc227510387 \h </w:instrText>
+          <w:instrText xml:space="preserve"> PAGEREF _Toc227585055 \h </w:instrText>
         </w:r>
         <w:r>
           <w:rPr>
@@ -1965,7 +1965,7 @@
           <w:lang w:eastAsia="en-IE"/>
         </w:rPr>
       </w:pPr>
-      <w:hyperlink w:anchor="_Toc227510388" w:history="1">
+      <w:hyperlink w:anchor="_Toc227585056" w:history="1">
         <w:r>
           <w:rPr>
             <w:rStyle w:val="Hyperlink"/>
@@ -2001,7 +2001,7 @@
             <w:noProof/>
             <w:webHidden/>
           </w:rPr>
-          <w:instrText xml:space="preserve"> PAGEREF _Toc227510388 \h </w:instrText>
+          <w:instrText xml:space="preserve"> PAGEREF _Toc227585056 \h </w:instrText>
         </w:r>
         <w:r>
           <w:rPr>
@@ -2046,7 +2046,7 @@
           <w:lang w:eastAsia="en-IE"/>
         </w:rPr>
       </w:pPr>
-      <w:hyperlink w:anchor="_Toc227510389" w:history="1">
+      <w:hyperlink w:anchor="_Toc227585057" w:history="1">
         <w:r>
           <w:rPr>
             <w:rStyle w:val="Hyperlink"/>
@@ -2082,7 +2082,7 @@
             <w:noProof/>
             <w:webHidden/>
           </w:rPr>
-          <w:instrText xml:space="preserve"> PAGEREF _Toc227510389 \h </w:instrText>
+          <w:instrText xml:space="preserve"> PAGEREF _Toc227585057 \h </w:instrText>
         </w:r>
         <w:r>
           <w:rPr>
@@ -2127,7 +2127,7 @@
           <w:lang w:eastAsia="en-IE"/>
         </w:rPr>
       </w:pPr>
-      <w:hyperlink w:anchor="_Toc227510390" w:history="1">
+      <w:hyperlink w:anchor="_Toc227585058" w:history="1">
         <w:r>
           <w:rPr>
             <w:rStyle w:val="Hyperlink"/>
@@ -2163,7 +2163,7 @@
             <w:noProof/>
             <w:webHidden/>
           </w:rPr>
-          <w:instrText xml:space="preserve"> PAGEREF _Toc227510390 \h </w:instrText>
+          <w:instrText xml:space="preserve"> PAGEREF _Toc227585058 \h </w:instrText>
         </w:r>
         <w:r>
           <w:rPr>
@@ -2208,7 +2208,7 @@
           <w:lang w:eastAsia="en-IE"/>
         </w:rPr>
       </w:pPr>
-      <w:hyperlink w:anchor="_Toc227510391" w:history="1">
+      <w:hyperlink w:anchor="_Toc227585059" w:history="1">
         <w:r>
           <w:rPr>
             <w:rStyle w:val="Hyperlink"/>
@@ -2244,7 +2244,7 @@
             <w:noProof/>
             <w:webHidden/>
           </w:rPr>
-          <w:instrText xml:space="preserve"> PAGEREF _Toc227510391 \h </w:instrText>
+          <w:instrText xml:space="preserve"> PAGEREF _Toc227585059 \h </w:instrText>
         </w:r>
         <w:r>
           <w:rPr>
@@ -2289,7 +2289,7 @@
           <w:lang w:eastAsia="en-IE"/>
         </w:rPr>
       </w:pPr>
-      <w:hyperlink w:anchor="_Toc227510392" w:history="1">
+      <w:hyperlink w:anchor="_Toc227585060" w:history="1">
         <w:r>
           <w:rPr>
             <w:rStyle w:val="Hyperlink"/>
@@ -2325,7 +2325,7 @@
             <w:noProof/>
             <w:webHidden/>
           </w:rPr>
-          <w:instrText xml:space="preserve"> PAGEREF _Toc227510392 \h </w:instrText>
+          <w:instrText xml:space="preserve"> PAGEREF _Toc227585060 \h </w:instrText>
         </w:r>
         <w:r>
           <w:rPr>
@@ -2370,7 +2370,7 @@
           <w:lang w:eastAsia="en-IE"/>
         </w:rPr>
       </w:pPr>
-      <w:hyperlink w:anchor="_Toc227510393" w:history="1">
+      <w:hyperlink w:anchor="_Toc227585061" w:history="1">
         <w:r>
           <w:rPr>
             <w:rStyle w:val="Hyperlink"/>
@@ -2406,7 +2406,7 @@
             <w:noProof/>
             <w:webHidden/>
           </w:rPr>
-          <w:instrText xml:space="preserve"> PAGEREF _Toc227510393 \h </w:instrText>
+          <w:instrText xml:space="preserve"> PAGEREF _Toc227585061 \h </w:instrText>
         </w:r>
         <w:r>
           <w:rPr>
@@ -2451,7 +2451,7 @@
           <w:lang w:eastAsia="en-IE"/>
         </w:rPr>
       </w:pPr>
-      <w:hyperlink w:anchor="_Toc227510394" w:history="1">
+      <w:hyperlink w:anchor="_Toc227585062" w:history="1">
         <w:r>
           <w:rPr>
             <w:rStyle w:val="Hyperlink"/>
@@ -2487,7 +2487,7 @@
             <w:noProof/>
             <w:webHidden/>
           </w:rPr>
-          <w:instrText xml:space="preserve"> PAGEREF _Toc227510394 \h </w:instrText>
+          <w:instrText xml:space="preserve"> PAGEREF _Toc227585062 \h </w:instrText>
         </w:r>
         <w:r>
           <w:rPr>
@@ -2532,7 +2532,7 @@
           <w:lang w:eastAsia="en-IE"/>
         </w:rPr>
       </w:pPr>
-      <w:hyperlink w:anchor="_Toc227510395" w:history="1">
+      <w:hyperlink w:anchor="_Toc227585063" w:history="1">
         <w:r>
           <w:rPr>
             <w:rStyle w:val="Hyperlink"/>
@@ -2568,7 +2568,7 @@
             <w:noProof/>
             <w:webHidden/>
           </w:rPr>
-          <w:instrText xml:space="preserve"> PAGEREF _Toc227510395 \h </w:instrText>
+          <w:instrText xml:space="preserve"> PAGEREF _Toc227585063 \h </w:instrText>
         </w:r>
         <w:r>
           <w:rPr>
@@ -2613,7 +2613,7 @@
           <w:lang w:eastAsia="en-IE"/>
         </w:rPr>
       </w:pPr>
-      <w:hyperlink w:anchor="_Toc227510396" w:history="1">
+      <w:hyperlink w:anchor="_Toc227585064" w:history="1">
         <w:r>
           <w:rPr>
             <w:rStyle w:val="Hyperlink"/>
@@ -2649,7 +2649,7 @@
             <w:noProof/>
             <w:webHidden/>
           </w:rPr>
-          <w:instrText xml:space="preserve"> PAGEREF _Toc227510396 \h </w:instrText>
+          <w:instrText xml:space="preserve"> PAGEREF _Toc227585064 \h </w:instrText>
         </w:r>
         <w:r>
           <w:rPr>
@@ -2694,7 +2694,7 @@
           <w:lang w:eastAsia="en-IE"/>
         </w:rPr>
       </w:pPr>
-      <w:hyperlink w:anchor="_Toc227510397" w:history="1">
+      <w:hyperlink w:anchor="_Toc227585065" w:history="1">
         <w:r>
           <w:rPr>
             <w:rStyle w:val="Hyperlink"/>
@@ -2730,7 +2730,7 @@
             <w:noProof/>
             <w:webHidden/>
           </w:rPr>
-          <w:instrText xml:space="preserve"> PAGEREF _Toc227510397 \h </w:instrText>
+          <w:instrText xml:space="preserve"> PAGEREF _Toc227585065 \h </w:instrText>
         </w:r>
         <w:r>
           <w:rPr>
@@ -2775,7 +2775,7 @@
           <w:lang w:eastAsia="en-IE"/>
         </w:rPr>
       </w:pPr>
-      <w:hyperlink w:anchor="_Toc227510398" w:history="1">
+      <w:hyperlink w:anchor="_Toc227585066" w:history="1">
         <w:r>
           <w:rPr>
             <w:rStyle w:val="Hyperlink"/>
@@ -2811,7 +2811,7 @@
             <w:noProof/>
             <w:webHidden/>
           </w:rPr>
-          <w:instrText xml:space="preserve"> PAGEREF _Toc227510398 \h </w:instrText>
+          <w:instrText xml:space="preserve"> PAGEREF _Toc227585066 \h </w:instrText>
         </w:r>
         <w:r>
           <w:rPr>
@@ -2856,7 +2856,7 @@
           <w:lang w:eastAsia="en-IE"/>
         </w:rPr>
       </w:pPr>
-      <w:hyperlink w:anchor="_Toc227510399" w:history="1">
+      <w:hyperlink w:anchor="_Toc227585067" w:history="1">
         <w:r>
           <w:rPr>
             <w:rStyle w:val="Hyperlink"/>
@@ -2892,7 +2892,7 @@
             <w:noProof/>
             <w:webHidden/>
           </w:rPr>
-          <w:instrText xml:space="preserve"> PAGEREF _Toc227510399 \h </w:instrText>
+          <w:instrText xml:space="preserve"> PAGEREF _Toc227585067 \h </w:instrText>
         </w:r>
         <w:r>
           <w:rPr>
@@ -2946,7 +2946,7 @@
       <w:pPr>
         <w:pStyle w:val="Heading1"/>
       </w:pPr>
-      <w:bookmarkStart w:id="1" w:name="_Toc227510366"/>
+      <w:bookmarkStart w:id="1" w:name="_Toc227585034"/>
       <w:r>
         <w:lastRenderedPageBreak/>
         <w:t>Abstract</w:t>
@@ -2977,19 +2977,25 @@
         <w:t xml:space="preserve"> merge gamified self-directed code education with learning management and automatic grading. </w:t>
       </w:r>
       <w:r>
-        <w:t>This project addresses th</w:t>
-      </w:r>
-      <w:r>
-        <w:t>is</w:t>
-      </w:r>
-      <w:r>
-        <w:t xml:space="preserve"> gap by providing a platform where lecturers can create coding problems with test cases, automatically evaluate student submissions, and manage course activity, while students can practi</w:t>
+        <w:t>This project provid</w:t>
+      </w:r>
+      <w:r>
+        <w:t>es</w:t>
+      </w:r>
+      <w:r>
+        <w:t xml:space="preserve"> a platform where lecturers can create coding problems with test cases, automatically evaluate student submissions, and manage course activity, while students can practi</w:t>
       </w:r>
       <w:r>
         <w:t>c</w:t>
       </w:r>
       <w:r>
-        <w:t>e through a shared problem repository enhanced with gamification features.</w:t>
+        <w:t xml:space="preserve">e </w:t>
+      </w:r>
+      <w:r>
+        <w:t xml:space="preserve">their coding skills </w:t>
+      </w:r>
+      <w:r>
+        <w:t>through a shared problem repository enhanced with gamification features.</w:t>
       </w:r>
     </w:p>
     <w:p>
@@ -3002,7 +3008,13 @@
       </w:r>
       <w:r>
         <w:tab/>
-        <w:t>A key technical consideration with this project is the execution of untrusted student code using Docker containers. This required the development of code test harnesses for Java and Python and custom container configurations.</w:t>
+        <w:t>A key technical consideration with this project is the execution of untrusted student code using Docker containers. This required the development of code test harnesses for Java and Python and custom container configurations</w:t>
+      </w:r>
+      <w:r>
+        <w:t xml:space="preserve"> for code execution</w:t>
+      </w:r>
+      <w:r>
+        <w:t>.</w:t>
       </w:r>
       <w:r>
         <w:t xml:space="preserve"> </w:t>
@@ -3020,7 +3032,13 @@
         <w:t xml:space="preserve">handling complex input parsing for Java functions, </w:t>
       </w:r>
       <w:r>
-        <w:t>hosting the system online and building a usable yet secure user interface. These were addressed through buffer processing techniques, setting up a Digital Ocean virtual private server and implementing refresh tokens.</w:t>
+        <w:t>hosting the system online and building a usable</w:t>
+      </w:r>
+      <w:r>
+        <w:t>,</w:t>
+      </w:r>
+      <w:r>
+        <w:t xml:space="preserve"> yet secure user interface. These were addressed through buffer processing techniques, setting up a Digital Ocean virtual private server and implementing refresh tokens.</w:t>
       </w:r>
       <w:r>
         <w:t xml:space="preserve"> </w:t>
@@ -3056,7 +3074,7 @@
       <w:pPr>
         <w:pStyle w:val="Heading1"/>
       </w:pPr>
-      <w:bookmarkStart w:id="2" w:name="_Toc227510367"/>
+      <w:bookmarkStart w:id="2" w:name="_Toc227585035"/>
       <w:r>
         <w:lastRenderedPageBreak/>
         <w:t>Introduction</w:t>
@@ -3091,7 +3109,13 @@
         <w:jc w:val="both"/>
       </w:pPr>
       <w:r>
-        <w:t xml:space="preserve">As well as a learning management platform SETU Code Lab can also be used by students to study for coding exams and technical interviews. </w:t>
+        <w:t>As well as a learning management platform</w:t>
+      </w:r>
+      <w:r>
+        <w:t>,</w:t>
+      </w:r>
+      <w:r>
+        <w:t xml:space="preserve"> SETU Code Lab can also be used by students to study for coding exams and technical interviews. </w:t>
       </w:r>
       <w:r>
         <w:t xml:space="preserve">There is a </w:t>
@@ -3106,10 +3130,22 @@
         <w:t>Global Problems</w:t>
       </w:r>
       <w:r>
-        <w:t xml:space="preserve"> course available to all users which lecturers can also add problems to for students to practice in their own time. To keep students engaged, the platform also employs several gamification techniques such as daily login streaks, points, badges and a leaderboard</w:t>
-      </w:r>
-      <w:r>
-        <w:t xml:space="preserve"> and</w:t>
+        <w:t xml:space="preserve"> course available to all users</w:t>
+      </w:r>
+      <w:r>
+        <w:t>, to</w:t>
+      </w:r>
+      <w:r>
+        <w:t xml:space="preserve"> which</w:t>
+      </w:r>
+      <w:r>
+        <w:t xml:space="preserve"> any</w:t>
+      </w:r>
+      <w:r>
+        <w:t xml:space="preserve"> lecturer can add problems to for students to practice in their own time. To keep students engaged the platform also employs several gamification techniques such as daily login streaks, points, badges and a leaderboard</w:t>
+      </w:r>
+      <w:r>
+        <w:t>. It also</w:t>
       </w:r>
       <w:r>
         <w:t xml:space="preserve"> supports Java and Python for code execution.</w:t>
@@ -3126,17 +3162,29 @@
         <w:t xml:space="preserve">It </w:t>
       </w:r>
       <w:r>
-        <w:t xml:space="preserve">will also look at the testing process of SETU Code Lab and assess its </w:t>
-      </w:r>
-      <w:r>
-        <w:t>success and reliability as a software product.</w:t>
+        <w:t>will also look at the testing process of SETU Code Lab</w:t>
+      </w:r>
+      <w:r>
+        <w:t>,</w:t>
+      </w:r>
+      <w:r>
+        <w:t xml:space="preserve"> assess its </w:t>
+      </w:r>
+      <w:r>
+        <w:t>success and reliability as a software product</w:t>
+      </w:r>
+      <w:r>
+        <w:t>, and discuss the skills and learnings I have acquired</w:t>
+      </w:r>
+      <w:r>
+        <w:t>.</w:t>
       </w:r>
     </w:p>
     <w:p>
       <w:pPr>
         <w:pStyle w:val="Heading1"/>
       </w:pPr>
-      <w:bookmarkStart w:id="3" w:name="_Toc227510368"/>
+      <w:bookmarkStart w:id="3" w:name="_Toc227585036"/>
       <w:r>
         <w:t>Challenges</w:t>
       </w:r>
@@ -3149,7 +3197,7 @@
       <w:pPr>
         <w:pStyle w:val="Heading2"/>
       </w:pPr>
-      <w:bookmarkStart w:id="4" w:name="_Toc227510369"/>
+      <w:bookmarkStart w:id="4" w:name="_Toc227585037"/>
       <w:r>
         <w:t>Architecture</w:t>
       </w:r>
@@ -3201,7 +3249,7 @@
         <w:t xml:space="preserve">proved to be </w:t>
       </w:r>
       <w:r>
-        <w:t>the biggest</w:t>
+        <w:t>a big</w:t>
       </w:r>
       <w:r>
         <w:t xml:space="preserve"> challenge</w:t>
@@ -3293,7 +3341,13 @@
         <w:jc w:val="both"/>
       </w:pPr>
       <w:r>
-        <w:t xml:space="preserve">From this research it was decided that the back-end web server should be broken down into several different types of files based on their purpose keeping cohesion high and coupling low. </w:t>
+        <w:t xml:space="preserve">From this research </w:t>
+      </w:r>
+      <w:r>
+        <w:t xml:space="preserve">I learned </w:t>
+      </w:r>
+      <w:r>
+        <w:t xml:space="preserve">that the back-end web server should be broken down into several different types of files based on their purpose keeping cohesion high and coupling low. </w:t>
       </w:r>
       <w:r>
         <w:t xml:space="preserve">The most notable source for this research </w:t>
@@ -3361,7 +3415,11 @@
         <w:t>. Sometimes before a route sends its request to the controller file there may be a middleware file which executes beforehand. This is typically used to check if a user is authenticated to make the request before forwarding it to the controller</w:t>
       </w:r>
       <w:r>
-        <w:t xml:space="preserve"> or for error handling</w:t>
+        <w:t xml:space="preserve"> or for error </w:t>
+      </w:r>
+      <w:r>
+        <w:lastRenderedPageBreak/>
+        <w:t>handling</w:t>
       </w:r>
       <w:r>
         <w:t xml:space="preserve"> </w:t>
@@ -3406,7 +3464,6 @@
         <w:t xml:space="preserve">igure </w:t>
       </w:r>
       <w:r>
-        <w:lastRenderedPageBreak/>
         <w:t>2</w:t>
       </w:r>
       <w:r>
@@ -3526,7 +3583,7 @@
         <w:pStyle w:val="Caption"/>
         <w:jc w:val="center"/>
       </w:pPr>
-      <w:bookmarkStart w:id="5" w:name="_Toc227510385"/>
+      <w:bookmarkStart w:id="5" w:name="_Toc227585053"/>
       <w:r>
         <w:rPr>
           <w:b/>
@@ -3632,7 +3689,7 @@
         <w:pStyle w:val="Caption"/>
         <w:jc w:val="center"/>
       </w:pPr>
-      <w:bookmarkStart w:id="6" w:name="_Toc227510386"/>
+      <w:bookmarkStart w:id="6" w:name="_Toc227585054"/>
       <w:r>
         <w:rPr>
           <w:b/>
@@ -3739,7 +3796,7 @@
         <w:pStyle w:val="Caption"/>
         <w:jc w:val="center"/>
       </w:pPr>
-      <w:bookmarkStart w:id="7" w:name="_Toc227510387"/>
+      <w:bookmarkStart w:id="7" w:name="_Toc227585055"/>
       <w:r>
         <w:rPr>
           <w:b/>
@@ -3969,7 +4026,7 @@
         <w:pStyle w:val="Caption"/>
         <w:jc w:val="center"/>
       </w:pPr>
-      <w:bookmarkStart w:id="8" w:name="_Toc227510388"/>
+      <w:bookmarkStart w:id="8" w:name="_Toc227585056"/>
       <w:r>
         <w:rPr>
           <w:b/>
@@ -4170,7 +4227,7 @@
         <w:pStyle w:val="Caption"/>
         <w:jc w:val="center"/>
       </w:pPr>
-      <w:bookmarkStart w:id="9" w:name="_Toc227510389"/>
+      <w:bookmarkStart w:id="9" w:name="_Toc227585057"/>
       <w:r>
         <w:rPr>
           <w:b/>
@@ -4281,7 +4338,7 @@
         <w:pStyle w:val="Caption"/>
         <w:jc w:val="center"/>
       </w:pPr>
-      <w:bookmarkStart w:id="10" w:name="_Toc227510390"/>
+      <w:bookmarkStart w:id="10" w:name="_Toc227585058"/>
       <w:r>
         <w:rPr>
           <w:b/>
@@ -4471,7 +4528,7 @@
         <w:pStyle w:val="Caption"/>
         <w:jc w:val="center"/>
       </w:pPr>
-      <w:bookmarkStart w:id="11" w:name="_Toc227510391"/>
+      <w:bookmarkStart w:id="11" w:name="_Toc227585059"/>
       <w:r>
         <w:rPr>
           <w:b/>
@@ -4531,7 +4588,7 @@
       <w:pPr>
         <w:pStyle w:val="Heading2"/>
       </w:pPr>
-      <w:bookmarkStart w:id="12" w:name="_Toc227510370"/>
+      <w:bookmarkStart w:id="12" w:name="_Toc227585038"/>
       <w:r>
         <w:t>Hosting</w:t>
       </w:r>
@@ -4645,14 +4702,47 @@
         <w:t>PM2 is a process manager for Node.js applications installed globally on the host machine</w:t>
       </w:r>
       <w:r>
+        <w:t xml:space="preserve"> </w:t>
+      </w:r>
+      <w:sdt>
+        <w:sdtPr>
+          <w:id w:val="-1459487330"/>
+          <w:citation/>
+        </w:sdtPr>
+        <w:sdtContent>
+          <w:r>
+            <w:fldChar w:fldCharType="begin"/>
+          </w:r>
+          <w:r>
+            <w:rPr>
+              <w:lang w:val="en-US"/>
+            </w:rPr>
+            <w:instrText xml:space="preserve"> CITATION Ayo26 \l 1033 </w:instrText>
+          </w:r>
+          <w:r>
+            <w:fldChar w:fldCharType="separate"/>
+          </w:r>
+          <w:r>
+            <w:rPr>
+              <w:noProof/>
+              <w:lang w:val="en-US"/>
+            </w:rPr>
+            <w:t>(Isaiah, 2026)</w:t>
+          </w:r>
+          <w:r>
+            <w:fldChar w:fldCharType="end"/>
+          </w:r>
+        </w:sdtContent>
+      </w:sdt>
+      <w:r>
         <w:t>.</w:t>
       </w:r>
       <w:r>
-        <w:t xml:space="preserve"> After endlessly tweaking configuration files and setting the environment variables via PM2, the platform could eventually </w:t>
+        <w:t xml:space="preserve"> After endlessly tweaking configuration files and setting the environment variables via PM2, the </w:t>
       </w:r>
       <w:r>
         <w:lastRenderedPageBreak/>
-        <w:t xml:space="preserve">be accessed </w:t>
+        <w:t xml:space="preserve">platform could eventually be accessed </w:t>
       </w:r>
       <w:r>
         <w:t>via an IP address.</w:t>
@@ -4748,7 +4838,7 @@
       <w:pPr>
         <w:pStyle w:val="Heading2"/>
       </w:pPr>
-      <w:bookmarkStart w:id="13" w:name="_Toc227510371"/>
+      <w:bookmarkStart w:id="13" w:name="_Toc227585039"/>
       <w:r>
         <w:t>Docker Code Execution</w:t>
       </w:r>
@@ -4991,7 +5081,7 @@
         <w:pStyle w:val="Caption"/>
         <w:jc w:val="center"/>
       </w:pPr>
-      <w:bookmarkStart w:id="14" w:name="_Toc227510392"/>
+      <w:bookmarkStart w:id="14" w:name="_Toc227585060"/>
       <w:r>
         <w:rPr>
           <w:b/>
@@ -5067,6 +5157,12 @@
       </w:r>
       <w:proofErr w:type="spellStart"/>
       <w:r>
+        <w:rPr>
+          <w:b/>
+          <w:bCs/>
+          <w:i/>
+          <w:iCs/>
+        </w:rPr>
         <w:t>ObjectMapper</w:t>
       </w:r>
       <w:proofErr w:type="spellEnd"/>
@@ -5180,7 +5276,7 @@
         <w:pStyle w:val="Caption"/>
         <w:jc w:val="center"/>
       </w:pPr>
-      <w:bookmarkStart w:id="15" w:name="_Toc227510393"/>
+      <w:bookmarkStart w:id="15" w:name="_Toc227585061"/>
       <w:r>
         <w:rPr>
           <w:b/>
@@ -5317,7 +5413,7 @@
         <w:pStyle w:val="Caption"/>
         <w:jc w:val="center"/>
       </w:pPr>
-      <w:bookmarkStart w:id="16" w:name="_Toc227510394"/>
+      <w:bookmarkStart w:id="16" w:name="_Toc227585062"/>
       <w:r>
         <w:rPr>
           <w:b/>
@@ -5466,7 +5562,13 @@
         <w:t xml:space="preserve"> split parameter lists on commas</w:t>
       </w:r>
       <w:r>
-        <w:t xml:space="preserve">. To solve this, I measured the level of nesting using a variable called depth. This variable would be incremented when it detected an open bracket and decremented on any closing brackets. This allowed me to only split parameters based on top level commas (see </w:t>
+        <w:t xml:space="preserve">. To solve this, I measured the level of nesting using a variable called </w:t>
+      </w:r>
+      <w:r>
+        <w:t>depth</w:t>
+      </w:r>
+      <w:r>
+        <w:t xml:space="preserve">. This variable would be incremented when it detected an open bracket and decremented on any closing brackets. This allowed me to only split parameters based on top level commas (see </w:t>
       </w:r>
       <w:r>
         <w:t>F</w:t>
@@ -5531,7 +5633,7 @@
         <w:pStyle w:val="Caption"/>
         <w:jc w:val="center"/>
       </w:pPr>
-      <w:bookmarkStart w:id="17" w:name="_Toc227510395"/>
+      <w:bookmarkStart w:id="17" w:name="_Toc227585063"/>
       <w:r>
         <w:rPr>
           <w:b/>
@@ -5685,7 +5787,19 @@
         <w:t xml:space="preserve">  </w:t>
       </w:r>
       <w:r>
-        <w:t>how to use the cat command along with a heredoc (</w:t>
+        <w:t xml:space="preserve">how to use the cat command along with a </w:t>
+      </w:r>
+      <w:r>
+        <w:rPr>
+          <w:b/>
+          <w:bCs/>
+          <w:i/>
+          <w:iCs/>
+        </w:rPr>
+        <w:t>heredoc</w:t>
+      </w:r>
+      <w:r>
+        <w:t xml:space="preserve"> (</w:t>
       </w:r>
       <w:r>
         <w:rPr>
@@ -5853,7 +5967,7 @@
         <w:pStyle w:val="Caption"/>
         <w:jc w:val="center"/>
       </w:pPr>
-      <w:bookmarkStart w:id="18" w:name="_Toc227510396"/>
+      <w:bookmarkStart w:id="18" w:name="_Toc227585064"/>
       <w:r>
         <w:rPr>
           <w:b/>
@@ -5954,13 +6068,23 @@
       <w:r>
         <w:t xml:space="preserve">. Most importantly </w:t>
       </w:r>
-      <w:proofErr w:type="spellStart"/>
-      <w:r>
+      <w:r>
+        <w:rPr>
+          <w:rFonts w:ascii="Courier New" w:hAnsi="Courier New" w:cs="Courier New"/>
+        </w:rPr>
         <w:t>NetworkMode</w:t>
       </w:r>
-      <w:proofErr w:type="spellEnd"/>
-      <w:r>
-        <w:t xml:space="preserve"> had to be set to “none” to prevent connection to external networks. Resource limits were also set to prevent the system from hanging in the event </w:t>
+      <w:r>
+        <w:t xml:space="preserve"> had to be set to “</w:t>
+      </w:r>
+      <w:r>
+        <w:rPr>
+          <w:rFonts w:ascii="Courier New" w:hAnsi="Courier New" w:cs="Courier New"/>
+        </w:rPr>
+        <w:t>none</w:t>
+      </w:r>
+      <w:r>
+        <w:t xml:space="preserve">” to prevent connection to external networks. Resource limits were also set to prevent the system from hanging in the event </w:t>
       </w:r>
       <w:r>
         <w:lastRenderedPageBreak/>
@@ -6071,7 +6195,7 @@
         <w:pStyle w:val="Caption"/>
         <w:jc w:val="center"/>
       </w:pPr>
-      <w:bookmarkStart w:id="19" w:name="_Toc227510397"/>
+      <w:bookmarkStart w:id="19" w:name="_Toc227585065"/>
       <w:r>
         <w:rPr>
           <w:b/>
@@ -6297,7 +6421,7 @@
         <w:pStyle w:val="Caption"/>
         <w:jc w:val="center"/>
       </w:pPr>
-      <w:bookmarkStart w:id="20" w:name="_Toc227510398"/>
+      <w:bookmarkStart w:id="20" w:name="_Toc227585066"/>
       <w:r>
         <w:rPr>
           <w:b/>
@@ -6417,7 +6541,7 @@
       <w:pPr>
         <w:pStyle w:val="Heading2"/>
       </w:pPr>
-      <w:bookmarkStart w:id="21" w:name="_Toc227510372"/>
+      <w:bookmarkStart w:id="21" w:name="_Toc227585040"/>
       <w:r>
         <w:t>Docker Containerisation</w:t>
       </w:r>
@@ -6492,7 +6616,43 @@
         <w:t>.</w:t>
       </w:r>
       <w:r>
-        <w:t xml:space="preserve"> This enables containers to be lightweight and spin up quickly.</w:t>
+        <w:t xml:space="preserve"> This enables containers to be lightweight and spin up quickly</w:t>
+      </w:r>
+      <w:r>
+        <w:t xml:space="preserve"> </w:t>
+      </w:r>
+      <w:sdt>
+        <w:sdtPr>
+          <w:id w:val="1446499777"/>
+          <w:citation/>
+        </w:sdtPr>
+        <w:sdtContent>
+          <w:r>
+            <w:fldChar w:fldCharType="begin"/>
+          </w:r>
+          <w:r>
+            <w:rPr>
+              <w:lang w:val="en-US"/>
+            </w:rPr>
+            <w:instrText xml:space="preserve"> CITATION Doc26 \l 1033 </w:instrText>
+          </w:r>
+          <w:r>
+            <w:fldChar w:fldCharType="separate"/>
+          </w:r>
+          <w:r>
+            <w:rPr>
+              <w:noProof/>
+              <w:lang w:val="en-US"/>
+            </w:rPr>
+            <w:t>(Docker, n.d.)</w:t>
+          </w:r>
+          <w:r>
+            <w:fldChar w:fldCharType="end"/>
+          </w:r>
+        </w:sdtContent>
+      </w:sdt>
+      <w:r>
+        <w:t>.</w:t>
       </w:r>
     </w:p>
     <w:p>
@@ -6511,15 +6671,66 @@
         <w:jc w:val="both"/>
       </w:pPr>
       <w:r>
-        <w:t>To do this I had to create a docker-</w:t>
+        <w:t xml:space="preserve">To do this I had to create a </w:t>
+      </w:r>
+      <w:r>
+        <w:rPr>
+          <w:b/>
+          <w:bCs/>
+          <w:i/>
+          <w:iCs/>
+        </w:rPr>
+        <w:t>docker-</w:t>
       </w:r>
       <w:proofErr w:type="spellStart"/>
       <w:r>
+        <w:rPr>
+          <w:b/>
+          <w:bCs/>
+          <w:i/>
+          <w:iCs/>
+        </w:rPr>
         <w:t>compose.yaml</w:t>
       </w:r>
       <w:proofErr w:type="spellEnd"/>
       <w:r>
-        <w:t xml:space="preserve"> file. Before containerisation my first solution stored database</w:t>
+        <w:t xml:space="preserve"> file</w:t>
+      </w:r>
+      <w:r>
+        <w:t xml:space="preserve"> </w:t>
+      </w:r>
+      <w:sdt>
+        <w:sdtPr>
+          <w:id w:val="1602229531"/>
+          <w:citation/>
+        </w:sdtPr>
+        <w:sdtContent>
+          <w:r>
+            <w:fldChar w:fldCharType="begin"/>
+          </w:r>
+          <w:r>
+            <w:rPr>
+              <w:lang w:val="en-US"/>
+            </w:rPr>
+            <w:instrText xml:space="preserve"> CITATION Doc261 \l 1033 </w:instrText>
+          </w:r>
+          <w:r>
+            <w:fldChar w:fldCharType="separate"/>
+          </w:r>
+          <w:r>
+            <w:rPr>
+              <w:noProof/>
+              <w:lang w:val="en-US"/>
+            </w:rPr>
+            <w:t>(Docker, n.d.)</w:t>
+          </w:r>
+          <w:r>
+            <w:fldChar w:fldCharType="end"/>
+          </w:r>
+        </w:sdtContent>
+      </w:sdt>
+      <w:r>
+        <w:t>. Before containerisation my first solution stored database</w:t>
       </w:r>
       <w:r>
         <w:t xml:space="preserve"> and JWT</w:t>
@@ -6585,13 +6796,15 @@
       </w:r>
       <w:r>
         <w:rPr>
+          <w:b/>
+          <w:bCs/>
           <w:i/>
           <w:iCs/>
         </w:rPr>
         <w:t>global problems</w:t>
       </w:r>
       <w:r>
-        <w:t xml:space="preserve"> course to work, as all new accounts are automatically added to this course. </w:t>
+        <w:t xml:space="preserve">, as all new accounts are automatically added to this course. </w:t>
       </w:r>
     </w:p>
     <w:p>
@@ -6603,6 +6816,8 @@
       </w:r>
       <w:r>
         <w:rPr>
+          <w:b/>
+          <w:bCs/>
           <w:i/>
           <w:iCs/>
         </w:rPr>
@@ -6611,6 +6826,8 @@
       <w:proofErr w:type="spellStart"/>
       <w:r>
         <w:rPr>
+          <w:b/>
+          <w:bCs/>
           <w:i/>
           <w:iCs/>
         </w:rPr>
@@ -6619,6 +6836,8 @@
       <w:proofErr w:type="spellEnd"/>
       <w:r>
         <w:rPr>
+          <w:b/>
+          <w:bCs/>
           <w:i/>
           <w:iCs/>
         </w:rPr>
@@ -6627,6 +6846,8 @@
       <w:proofErr w:type="spellStart"/>
       <w:r>
         <w:rPr>
+          <w:b/>
+          <w:bCs/>
           <w:i/>
           <w:iCs/>
         </w:rPr>
@@ -6640,14 +6861,50 @@
         <w:t>. This</w:t>
       </w:r>
       <w:r>
-        <w:t xml:space="preserve"> allows SQL scripts to be executed automatically when the container is first created. This ensured that the required schema and seed data were consistently applied whenever a new environment was set up.</w:t>
+        <w:t xml:space="preserve"> allows SQL scripts to be executed automatically when the container is first created. This ensured that the required schema and seed data were consistently applied whenever a new environment was set up</w:t>
+      </w:r>
+      <w:r>
+        <w:t xml:space="preserve"> </w:t>
+      </w:r>
+      <w:sdt>
+        <w:sdtPr>
+          <w:id w:val="896552243"/>
+          <w:citation/>
+        </w:sdtPr>
+        <w:sdtContent>
+          <w:r>
+            <w:fldChar w:fldCharType="begin"/>
+          </w:r>
+          <w:r>
+            <w:rPr>
+              <w:lang w:val="en-US"/>
+            </w:rPr>
+            <w:instrText xml:space="preserve"> CITATION Pos26 \l 1033 </w:instrText>
+          </w:r>
+          <w:r>
+            <w:fldChar w:fldCharType="separate"/>
+          </w:r>
+          <w:r>
+            <w:rPr>
+              <w:noProof/>
+              <w:lang w:val="en-US"/>
+            </w:rPr>
+            <w:t>(PostgreSQL, n.d.)</w:t>
+          </w:r>
+          <w:r>
+            <w:fldChar w:fldCharType="end"/>
+          </w:r>
+        </w:sdtContent>
+      </w:sdt>
+      <w:r>
+        <w:t>.</w:t>
       </w:r>
     </w:p>
     <w:p>
       <w:pPr>
         <w:pStyle w:val="Heading2"/>
       </w:pPr>
-      <w:bookmarkStart w:id="22" w:name="_Toc227510373"/>
+      <w:bookmarkStart w:id="22" w:name="_Toc227585041"/>
       <w:r>
         <w:t>Generative Artificial Intelligence Considerations</w:t>
       </w:r>
@@ -6711,6 +6968,8 @@
       </w:r>
       <w:r>
         <w:rPr>
+          <w:b/>
+          <w:bCs/>
           <w:i/>
           <w:iCs/>
         </w:rPr>
@@ -6721,7 +6980,13 @@
       </w:r>
       <w:r>
         <w:lastRenderedPageBreak/>
-        <w:t>however, sometimes certain notifications or even if the user clicks in the address bar, this event can be triggered. This would lead to unintentional automatic submissions. I had to find a way to balance user experience with the mitigation of AI.</w:t>
+        <w:t xml:space="preserve">however, sometimes </w:t>
+      </w:r>
+      <w:r>
+        <w:t xml:space="preserve">for </w:t>
+      </w:r>
+      <w:r>
+        <w:t>certain notifications or even if the user clicks in the address bar, this event can be triggered. This would lead to unintentional automatic submissions. I had to find a way to balance user experience with the mitigation of AI.</w:t>
       </w:r>
       <w:r>
         <w:t xml:space="preserve"> </w:t>
@@ -6731,6 +6996,8 @@
       </w:r>
       <w:r>
         <w:rPr>
+          <w:b/>
+          <w:bCs/>
           <w:i/>
           <w:iCs/>
         </w:rPr>
@@ -6777,6 +7044,8 @@
       </w:r>
       <w:r>
         <w:rPr>
+          <w:b/>
+          <w:bCs/>
           <w:i/>
           <w:iCs/>
         </w:rPr>
@@ -6807,6 +7076,8 @@
       </w:r>
       <w:r>
         <w:rPr>
+          <w:b/>
+          <w:bCs/>
           <w:i/>
           <w:iCs/>
         </w:rPr>
@@ -6822,20 +7093,17 @@
         <w:t xml:space="preserve">. </w:t>
       </w:r>
       <w:r>
-        <w:t xml:space="preserve">This idea was not implemented because it was discovered too late in development when time had already been committed to other features and </w:t>
-      </w:r>
-      <w:r>
-        <w:t xml:space="preserve">because it </w:t>
-      </w:r>
-      <w:r>
-        <w:t>required database changes.</w:t>
+        <w:t>This idea was not implemented because it was discovered too late in development when time had already been committed to other features</w:t>
+      </w:r>
+      <w:r>
+        <w:t>.</w:t>
       </w:r>
     </w:p>
     <w:p>
       <w:pPr>
         <w:pStyle w:val="Heading2"/>
       </w:pPr>
-      <w:bookmarkStart w:id="23" w:name="_Toc227510374"/>
+      <w:bookmarkStart w:id="23" w:name="_Toc227585042"/>
       <w:r>
         <w:t>Authentication</w:t>
       </w:r>
@@ -7017,6 +7285,9 @@
       </w:r>
       <w:r>
         <w:t>This taught me how to implement a secure,  industry-standard authentication  process, how to use JWT tokens correctly and how to balance security with the user’s experience.</w:t>
+      </w:r>
+      <w:r>
+        <w:t xml:space="preserve"> </w:t>
       </w:r>
     </w:p>
     <w:p>
@@ -7075,7 +7346,7 @@
         <w:pStyle w:val="Caption"/>
         <w:jc w:val="center"/>
       </w:pPr>
-      <w:bookmarkStart w:id="24" w:name="_Toc227510399"/>
+      <w:bookmarkStart w:id="24" w:name="_Toc227585067"/>
       <w:r>
         <w:rPr>
           <w:b/>
@@ -7148,7 +7419,7 @@
       <w:pPr>
         <w:pStyle w:val="Heading1"/>
       </w:pPr>
-      <w:bookmarkStart w:id="25" w:name="_Toc227510375"/>
+      <w:bookmarkStart w:id="25" w:name="_Toc227585043"/>
       <w:r>
         <w:t>Reflection</w:t>
       </w:r>
@@ -7158,7 +7429,7 @@
       <w:pPr>
         <w:pStyle w:val="Heading2"/>
       </w:pPr>
-      <w:bookmarkStart w:id="26" w:name="_Toc227510376"/>
+      <w:bookmarkStart w:id="26" w:name="_Toc227585044"/>
       <w:r>
         <w:t>What I Achieved</w:t>
       </w:r>
@@ -7218,15 +7489,18 @@
         <w:t>.</w:t>
       </w:r>
       <w:r>
-        <w:t xml:space="preserve"> This allowed me to more easily manipulate the data when I needed to run it with a student problem, while also keeping the user interface friendly to the user (as they would not have to enter this data in JSON format).</w:t>
+        <w:t xml:space="preserve"> This allowed me to easily manipulate the data when I needed to run it with a student problem, while also keeping the user interface friendly to the user (as they would not have to enter </w:t>
+      </w:r>
+      <w:r>
+        <w:t xml:space="preserve">test inputs and outputs </w:t>
+      </w:r>
+      <w:r>
+        <w:t>in JSON format).</w:t>
       </w:r>
     </w:p>
     <w:p>
       <w:r>
-        <w:t>T</w:t>
-      </w:r>
-      <w:r>
-        <w:t xml:space="preserve">his section </w:t>
+        <w:t xml:space="preserve">The problem creation screen </w:t>
       </w:r>
       <w:r>
         <w:t xml:space="preserve">also </w:t>
@@ -7257,7 +7531,7 @@
       <w:pPr>
         <w:pStyle w:val="Heading2"/>
       </w:pPr>
-      <w:bookmarkStart w:id="27" w:name="_Toc227510377"/>
+      <w:bookmarkStart w:id="27" w:name="_Toc227585045"/>
       <w:r>
         <w:t>What I did not Achieve</w:t>
       </w:r>
@@ -7309,7 +7583,7 @@
       <w:pPr>
         <w:pStyle w:val="Heading2"/>
       </w:pPr>
-      <w:bookmarkStart w:id="28" w:name="_Toc227510378"/>
+      <w:bookmarkStart w:id="28" w:name="_Toc227585046"/>
       <w:r>
         <w:t>What I Learned</w:t>
       </w:r>
@@ -7328,7 +7602,13 @@
         <w:jc w:val="both"/>
       </w:pPr>
       <w:r>
-        <w:t xml:space="preserve">Learning how to containerise the application also proved highly valuable, particularly in simplifying deployment. Prior to this, setting up the application locally required a long and error-prone manual process. By introducing </w:t>
+        <w:t>Learning how to containerise the application also proved highly valuable, particularly in simplifying deployment. Prior to this, setting up the application locally</w:t>
+      </w:r>
+      <w:r>
+        <w:t>,</w:t>
+      </w:r>
+      <w:r>
+        <w:t xml:space="preserve"> required a long and error-prone manual process. By introducing </w:t>
       </w:r>
       <w:proofErr w:type="spellStart"/>
       <w:r>
@@ -7344,13 +7624,7 @@
         <w:jc w:val="both"/>
       </w:pPr>
       <w:r>
-        <w:t xml:space="preserve">The defects that arose close to the end of development taught me the true value of early feedback and testing. Java code execution proved to be very slow and should have been detected and fixed much sooner in the development process. Some defects such as menus stretching off screen, black text appearing on a dark background and strange errors with validating lecturer inputted test cases were </w:t>
-      </w:r>
-      <w:r>
-        <w:t xml:space="preserve">only </w:t>
-      </w:r>
-      <w:r>
-        <w:t xml:space="preserve">discovered very late in development and almost made it to the final release. They were discovered </w:t>
+        <w:t xml:space="preserve">The defects that arose close to the end of development taught me the true value of early feedback and testing. Java code execution proved to be very slow and should have been detected and fixed much sooner in the development process. Some defects such as menus stretching off screen, black text appearing on a dark background and strange errors with validating lecturer inputted test cases were discovered very late in development and almost made it to the final release. They were discovered </w:t>
       </w:r>
       <w:r>
         <w:t xml:space="preserve">because of </w:t>
@@ -7369,7 +7643,7 @@
       <w:pPr>
         <w:pStyle w:val="Heading2"/>
       </w:pPr>
-      <w:bookmarkStart w:id="29" w:name="_Toc227510379"/>
+      <w:bookmarkStart w:id="29" w:name="_Toc227585047"/>
       <w:r>
         <w:t>What I would do Differently</w:t>
       </w:r>
@@ -7591,7 +7865,7 @@
           <w:sz w:val="22"/>
           <w:szCs w:val="22"/>
         </w:rPr>
-        <w:t xml:space="preserve"> to give lecturers more information for grading students. This would also work to mitigate students using AI as </w:t>
+        <w:t>,</w:t>
       </w:r>
       <w:r>
         <w:rPr>
@@ -7599,7 +7873,7 @@
           <w:sz w:val="22"/>
           <w:szCs w:val="22"/>
         </w:rPr>
-        <w:t>I felt this was a weak point in the project</w:t>
+        <w:t xml:space="preserve"> to give lecturers more information for grading students. This would also work to mitigate students using AI as </w:t>
       </w:r>
       <w:r>
         <w:rPr>
@@ -7607,6 +7881,14 @@
           <w:sz w:val="22"/>
           <w:szCs w:val="22"/>
         </w:rPr>
+        <w:t>I felt this was a weak point in the project</w:t>
+      </w:r>
+      <w:r>
+        <w:rPr>
+          <w:rFonts w:ascii="Aptos" w:hAnsi="Aptos" w:cs="Calibri"/>
+          <w:sz w:val="22"/>
+          <w:szCs w:val="22"/>
+        </w:rPr>
         <w:t>. I would also take more personal notes over the course of the project to track challenges encountered and learnings. This would help me improve my documentation.</w:t>
       </w:r>
     </w:p>
@@ -7614,7 +7896,7 @@
       <w:pPr>
         <w:pStyle w:val="Heading1"/>
       </w:pPr>
-      <w:bookmarkStart w:id="30" w:name="_Toc227510380"/>
+      <w:bookmarkStart w:id="30" w:name="_Toc227585048"/>
       <w:r>
         <w:t>Testing</w:t>
       </w:r>
@@ -7626,64 +7908,7 @@
         <w:jc w:val="both"/>
       </w:pPr>
       <w:r>
-        <w:t>To test SETU Code Lab’s success and reliability as a software product, User Acceptance Testing (UAT) was performed for each use case. These are black box tests which verify the functional requirements outlined in the Functional Specification</w:t>
-      </w:r>
-      <w:r>
-        <w:t xml:space="preserve"> from the user’s perspective</w:t>
-      </w:r>
-      <w:r>
-        <w:t>.</w:t>
-      </w:r>
-      <w:r>
-        <w:t xml:space="preserve"> As it was not possible to find a user with adequate spare time to perform User Acceptance Testing, this testing was </w:t>
-      </w:r>
-      <w:r>
-        <w:t>conducted</w:t>
-      </w:r>
-      <w:r>
-        <w:t xml:space="preserve"> by me from the perspective of the user.</w:t>
-      </w:r>
-      <w:r>
-        <w:t xml:space="preserve"> Separate tests were also carried out for non-functional requirements. </w:t>
-      </w:r>
-    </w:p>
-    <w:p>
-      <w:pPr>
-        <w:spacing w:line="278" w:lineRule="auto"/>
-        <w:jc w:val="both"/>
-      </w:pPr>
-      <w:r>
-        <w:t xml:space="preserve">The </w:t>
-      </w:r>
-      <w:r>
-        <w:t xml:space="preserve">first </w:t>
-      </w:r>
-      <w:r>
-        <w:t>table</w:t>
-      </w:r>
-      <w:r>
-        <w:t xml:space="preserve">, seen </w:t>
-      </w:r>
-      <w:r>
-        <w:t>on the following pages</w:t>
-      </w:r>
-      <w:r>
-        <w:t xml:space="preserve"> shows </w:t>
-      </w:r>
-      <w:r>
-        <w:t>the</w:t>
-      </w:r>
-      <w:r>
-        <w:t xml:space="preserve"> functional</w:t>
-      </w:r>
-      <w:r>
-        <w:t xml:space="preserve"> tests that were performed. These tests map directly to the core and non-core functional requirements outlined in the Functional Specification.</w:t>
-      </w:r>
-      <w:r>
-        <w:t xml:space="preserve"> </w:t>
-      </w:r>
-      <w:r>
-        <w:t xml:space="preserve">In this table </w:t>
+        <w:t xml:space="preserve">To test SETU Code Lab’s success and reliability as a software product, </w:t>
       </w:r>
       <w:r>
         <w:rPr>
@@ -7692,16 +7917,67 @@
           <w:i/>
           <w:iCs/>
         </w:rPr>
-        <w:t xml:space="preserve">TID </w:t>
-      </w:r>
-      <w:r>
-        <w:t>refers to the test</w:t>
-      </w:r>
-      <w:r>
-        <w:t xml:space="preserve"> case</w:t>
-      </w:r>
-      <w:r>
-        <w:t xml:space="preserve"> ID and </w:t>
+        <w:t>User Acceptance Testing (UAT)</w:t>
+      </w:r>
+      <w:r>
+        <w:t xml:space="preserve"> was performed for each use case. These are black box tests which verify the functional requirements outlined in the Functional Specification</w:t>
+      </w:r>
+      <w:r>
+        <w:t xml:space="preserve"> from the user’s perspective</w:t>
+      </w:r>
+      <w:r>
+        <w:t>.</w:t>
+      </w:r>
+      <w:r>
+        <w:t xml:space="preserve"> As it was not possible to find a user with adequate spare time to perform User Acceptance Testing, this testing was </w:t>
+      </w:r>
+      <w:r>
+        <w:t>conducted</w:t>
+      </w:r>
+      <w:r>
+        <w:t xml:space="preserve"> by me from the perspective of the user.</w:t>
+      </w:r>
+      <w:r>
+        <w:t xml:space="preserve"> Separate tests were also carried out for non-functional requirements. </w:t>
+      </w:r>
+    </w:p>
+    <w:p>
+      <w:pPr>
+        <w:spacing w:line="278" w:lineRule="auto"/>
+        <w:jc w:val="both"/>
+      </w:pPr>
+      <w:r>
+        <w:t xml:space="preserve">The </w:t>
+      </w:r>
+      <w:r>
+        <w:t xml:space="preserve">first </w:t>
+      </w:r>
+      <w:r>
+        <w:t>table</w:t>
+      </w:r>
+      <w:r>
+        <w:t xml:space="preserve">, seen </w:t>
+      </w:r>
+      <w:r>
+        <w:t>on the following pages</w:t>
+      </w:r>
+      <w:r>
+        <w:t xml:space="preserve"> shows </w:t>
+      </w:r>
+      <w:r>
+        <w:t>the</w:t>
+      </w:r>
+      <w:r>
+        <w:t xml:space="preserve"> functional</w:t>
+      </w:r>
+      <w:r>
+        <w:t xml:space="preserve"> tests that were performed. These tests map directly to the core and non-core functional requirements outlined in the Functional Specification.</w:t>
+      </w:r>
+      <w:r>
+        <w:t xml:space="preserve"> </w:t>
+      </w:r>
+      <w:r>
+        <w:t xml:space="preserve">In this table </w:t>
       </w:r>
       <w:r>
         <w:rPr>
@@ -7710,10 +7986,16 @@
           <w:i/>
           <w:iCs/>
         </w:rPr>
-        <w:t xml:space="preserve">RID </w:t>
-      </w:r>
-      <w:r>
-        <w:t xml:space="preserve">refers to the requirement ID with </w:t>
+        <w:t xml:space="preserve">TID </w:t>
+      </w:r>
+      <w:r>
+        <w:t>refers to the test</w:t>
+      </w:r>
+      <w:r>
+        <w:t xml:space="preserve"> case</w:t>
+      </w:r>
+      <w:r>
+        <w:t xml:space="preserve"> ID and </w:t>
       </w:r>
       <w:r>
         <w:rPr>
@@ -7722,10 +8004,10 @@
           <w:i/>
           <w:iCs/>
         </w:rPr>
-        <w:t>FR</w:t>
-      </w:r>
-      <w:r>
-        <w:t xml:space="preserve"> corresponding to Functional Requirements and </w:t>
+        <w:t xml:space="preserve">RID </w:t>
+      </w:r>
+      <w:r>
+        <w:t xml:space="preserve">refers to the requirement ID with </w:t>
       </w:r>
       <w:r>
         <w:rPr>
@@ -7734,6 +8016,18 @@
           <w:i/>
           <w:iCs/>
         </w:rPr>
+        <w:t>FR</w:t>
+      </w:r>
+      <w:r>
+        <w:t xml:space="preserve"> corresponding to Functional Requirements and </w:t>
+      </w:r>
+      <w:r>
+        <w:rPr>
+          <w:b/>
+          <w:bCs/>
+          <w:i/>
+          <w:iCs/>
+        </w:rPr>
         <w:t>NFR</w:t>
       </w:r>
       <w:r>
@@ -7743,7 +8037,16 @@
         <w:t xml:space="preserve"> </w:t>
       </w:r>
       <w:r>
-        <w:t xml:space="preserve">TC11e </w:t>
+        <w:rPr>
+          <w:b/>
+          <w:bCs/>
+          <w:i/>
+          <w:iCs/>
+        </w:rPr>
+        <w:t>TC11e</w:t>
+      </w:r>
+      <w:r>
+        <w:t xml:space="preserve"> </w:t>
       </w:r>
       <w:r>
         <w:t xml:space="preserve">resulted in the discovery of </w:t>
@@ -7794,10 +8097,40 @@
         <w:jc w:val="both"/>
       </w:pPr>
       <w:r>
-        <w:t xml:space="preserve">The next table starting on page x shows the non-functional tests that were performed. These tests map directly to the non-functional (FURPS+) requirements outlined in the Functional Specification. In this table </w:t>
-      </w:r>
-      <w:r>
-        <w:t>user tests such as TC-NF02 and TC-NF03 were carried out by actual users and not</w:t>
+        <w:t xml:space="preserve">The next table starting on page </w:t>
+      </w:r>
+      <w:r>
+        <w:t>27</w:t>
+      </w:r>
+      <w:r>
+        <w:t xml:space="preserve"> shows the non-functional tests that were performed. These tests map directly to the non-functional (FURPS+) requirements outlined in the Functional Specification. In this table </w:t>
+      </w:r>
+      <w:r>
+        <w:t xml:space="preserve">user tests such as </w:t>
+      </w:r>
+      <w:r>
+        <w:rPr>
+          <w:b/>
+          <w:bCs/>
+          <w:i/>
+          <w:iCs/>
+        </w:rPr>
+        <w:t>TC-NF02</w:t>
+      </w:r>
+      <w:r>
+        <w:t xml:space="preserve"> and </w:t>
+      </w:r>
+      <w:r>
+        <w:rPr>
+          <w:b/>
+          <w:bCs/>
+          <w:i/>
+          <w:iCs/>
+        </w:rPr>
+        <w:t>TC-NF03</w:t>
+      </w:r>
+      <w:r>
+        <w:t xml:space="preserve"> were carried out by actual users and not</w:t>
       </w:r>
       <w:r>
         <w:t xml:space="preserve"> the developer</w:t>
@@ -7806,10 +8139,28 @@
         <w:t xml:space="preserve">. </w:t>
       </w:r>
       <w:r>
-        <w:t xml:space="preserve">Test case TC-NF08d revealed a user interface scrolling issue on the </w:t>
+        <w:t xml:space="preserve">Test case </w:t>
+      </w:r>
+      <w:r>
+        <w:rPr>
+          <w:b/>
+          <w:bCs/>
+          <w:i/>
+          <w:iCs/>
+        </w:rPr>
+        <w:t>TC-NF08d</w:t>
+      </w:r>
+      <w:r>
+        <w:t xml:space="preserve"> revealed a user interface scrolling issue on the </w:t>
       </w:r>
       <w:proofErr w:type="spellStart"/>
       <w:r>
+        <w:rPr>
+          <w:b/>
+          <w:bCs/>
+          <w:i/>
+          <w:iCs/>
+        </w:rPr>
         <w:t>manageProblems</w:t>
       </w:r>
       <w:proofErr w:type="spellEnd"/>
@@ -7818,6 +8169,12 @@
       </w:r>
       <w:proofErr w:type="spellStart"/>
       <w:r>
+        <w:rPr>
+          <w:b/>
+          <w:bCs/>
+          <w:i/>
+          <w:iCs/>
+        </w:rPr>
         <w:t>manageClasses</w:t>
       </w:r>
       <w:proofErr w:type="spellEnd"/>
@@ -7828,10 +8185,28 @@
         <w:t>1280×720</w:t>
       </w:r>
       <w:r>
-        <w:t xml:space="preserve">). This issue was fixed and retested successfully. Similarly test case TC-NF08e also revealed an issue where the test case entry form on the </w:t>
+        <w:t xml:space="preserve">). This issue was fixed and retested successfully. Similarly test case </w:t>
+      </w:r>
+      <w:r>
+        <w:rPr>
+          <w:b/>
+          <w:bCs/>
+          <w:i/>
+          <w:iCs/>
+        </w:rPr>
+        <w:t>TC-NF08e</w:t>
+      </w:r>
+      <w:r>
+        <w:t xml:space="preserve"> also revealed an issue where the test case entry form on the </w:t>
       </w:r>
       <w:proofErr w:type="spellStart"/>
       <w:r>
+        <w:rPr>
+          <w:b/>
+          <w:bCs/>
+          <w:i/>
+          <w:iCs/>
+        </w:rPr>
         <w:t>createProblem</w:t>
       </w:r>
       <w:proofErr w:type="spellEnd"/>
@@ -8677,7 +9052,7 @@
       <w:pPr>
         <w:pStyle w:val="Heading2"/>
       </w:pPr>
-      <w:bookmarkStart w:id="31" w:name="_Toc227510381"/>
+      <w:bookmarkStart w:id="31" w:name="_Toc227585049"/>
       <w:r>
         <w:t>Functional Testing</w:t>
       </w:r>
@@ -10801,7 +11176,7 @@
       <w:pPr>
         <w:pStyle w:val="Heading2"/>
       </w:pPr>
-      <w:bookmarkStart w:id="32" w:name="_Toc227510382"/>
+      <w:bookmarkStart w:id="32" w:name="_Toc227585050"/>
       <w:r>
         <w:lastRenderedPageBreak/>
         <w:t>Non-Functional Testing</w:t>
@@ -12938,7 +13313,7 @@
       <w:pPr>
         <w:pStyle w:val="Heading1"/>
       </w:pPr>
-      <w:bookmarkStart w:id="33" w:name="_Toc227510383"/>
+      <w:bookmarkStart w:id="33" w:name="_Toc227585051"/>
       <w:r>
         <w:lastRenderedPageBreak/>
         <w:t>Conclusion</w:t>
@@ -12966,7 +13341,13 @@
         <w:t xml:space="preserve"> The hardest part of this was not the Docker connection or spinning up the containers themselves, but rather the preprocessing of submitted Java code and submitted placeholder code before they are sent to a container for execution.</w:t>
       </w:r>
       <w:r>
-        <w:t xml:space="preserve"> This took me a while </w:t>
+        <w:t xml:space="preserve"> </w:t>
+      </w:r>
+      <w:r>
+        <w:t xml:space="preserve">It </w:t>
+      </w:r>
+      <w:r>
+        <w:t xml:space="preserve"> took me a while </w:t>
       </w:r>
       <w:r>
         <w:t xml:space="preserve">to </w:t>
@@ -12999,7 +13380,13 @@
         <w:t>so that key performance issues could be detected earlier and fixed.</w:t>
       </w:r>
       <w:r>
-        <w:t xml:space="preserve"> If I had detected this performance issue early, I could have implemented a pool of Docker containers with JVMs pre-loaded. This would have eliminated the slow spin up time of the docker containers when every test case is run.</w:t>
+        <w:t xml:space="preserve"> If I had detected this performance issue early, I could have implemented a pool of Docker containers with JVMs pre-loaded. This would have eliminated the slow spin up time of the docker containers</w:t>
+      </w:r>
+      <w:r>
+        <w:t xml:space="preserve"> on every test case run</w:t>
+      </w:r>
+      <w:r>
+        <w:t>.</w:t>
       </w:r>
     </w:p>
     <w:p>
@@ -13029,7 +13416,13 @@
         <w:t xml:space="preserve"> </w:t>
       </w:r>
       <w:r>
-        <w:t>Combined with Docker, hosting, and deployment experience, I'm now confident I can build and ship production</w:t>
+        <w:t>Combined with Docker, hosting, and deployment experience, I'm now confident I can build and ship</w:t>
+      </w:r>
+      <w:r>
+        <w:t xml:space="preserve"> higher quality</w:t>
+      </w:r>
+      <w:r>
+        <w:t xml:space="preserve"> production</w:t>
       </w:r>
       <w:r>
         <w:t xml:space="preserve"> grade</w:t>
@@ -13044,7 +13437,7 @@
         <w:br w:type="page"/>
       </w:r>
     </w:p>
-    <w:bookmarkStart w:id="34" w:name="_Toc227510384" w:displacedByCustomXml="next"/>
+    <w:bookmarkStart w:id="34" w:name="_Toc227585052" w:displacedByCustomXml="next"/>
     <w:sdt>
       <w:sdtPr>
         <w:rPr>
@@ -13295,6 +13688,104 @@
                 <w:rPr>
                   <w:noProof/>
                 </w:rPr>
+                <w:t xml:space="preserve">Docker, n.d. </w:t>
+              </w:r>
+              <w:r>
+                <w:rPr>
+                  <w:i/>
+                  <w:iCs/>
+                  <w:noProof/>
+                </w:rPr>
+                <w:t xml:space="preserve">Docker Compose | Docker Docs. </w:t>
+              </w:r>
+              <w:r>
+                <w:rPr>
+                  <w:noProof/>
+                </w:rPr>
+                <w:t xml:space="preserve">[Online] </w:t>
+              </w:r>
+              <w:r>
+                <w:rPr>
+                  <w:noProof/>
+                </w:rPr>
+                <w:br/>
+                <w:t xml:space="preserve">Available at: </w:t>
+              </w:r>
+              <w:r>
+                <w:rPr>
+                  <w:noProof/>
+                  <w:u w:val="single"/>
+                </w:rPr>
+                <w:t>https://docs.docker.com/compose/</w:t>
+              </w:r>
+              <w:r>
+                <w:rPr>
+                  <w:noProof/>
+                </w:rPr>
+                <w:br/>
+                <w:t>[Accessed 20 April 2026].</w:t>
+              </w:r>
+            </w:p>
+            <w:p>
+              <w:pPr>
+                <w:pStyle w:val="Bibliography"/>
+                <w:rPr>
+                  <w:noProof/>
+                </w:rPr>
+              </w:pPr>
+              <w:r>
+                <w:rPr>
+                  <w:noProof/>
+                </w:rPr>
+                <w:t xml:space="preserve">Docker, n.d. </w:t>
+              </w:r>
+              <w:r>
+                <w:rPr>
+                  <w:i/>
+                  <w:iCs/>
+                  <w:noProof/>
+                </w:rPr>
+                <w:t xml:space="preserve">Multi Stage | Docker Docs. </w:t>
+              </w:r>
+              <w:r>
+                <w:rPr>
+                  <w:noProof/>
+                </w:rPr>
+                <w:t xml:space="preserve">[Online] </w:t>
+              </w:r>
+              <w:r>
+                <w:rPr>
+                  <w:noProof/>
+                </w:rPr>
+                <w:br/>
+                <w:t xml:space="preserve">Available at: </w:t>
+              </w:r>
+              <w:r>
+                <w:rPr>
+                  <w:noProof/>
+                  <w:u w:val="single"/>
+                </w:rPr>
+                <w:t>https://docs.docker.com/build/building/multi-stage/</w:t>
+              </w:r>
+              <w:r>
+                <w:rPr>
+                  <w:noProof/>
+                </w:rPr>
+                <w:br/>
+                <w:t>[Accessed 20 April 2026].</w:t>
+              </w:r>
+            </w:p>
+            <w:p>
+              <w:pPr>
+                <w:pStyle w:val="Bibliography"/>
+                <w:rPr>
+                  <w:noProof/>
+                </w:rPr>
+              </w:pPr>
+              <w:r>
+                <w:rPr>
+                  <w:noProof/>
+                </w:rPr>
                 <w:t xml:space="preserve">FasterXML, 2026. </w:t>
               </w:r>
               <w:r>
@@ -13442,6 +13933,55 @@
                 <w:rPr>
                   <w:noProof/>
                 </w:rPr>
+                <w:t xml:space="preserve">Isaiah, A., 2026. </w:t>
+              </w:r>
+              <w:r>
+                <w:rPr>
+                  <w:i/>
+                  <w:iCs/>
+                  <w:noProof/>
+                </w:rPr>
+                <w:t xml:space="preserve">How to Configure Nginx as a Reverse Proxy for Node.js Applications. </w:t>
+              </w:r>
+              <w:r>
+                <w:rPr>
+                  <w:noProof/>
+                </w:rPr>
+                <w:t xml:space="preserve">[Online] </w:t>
+              </w:r>
+              <w:r>
+                <w:rPr>
+                  <w:noProof/>
+                </w:rPr>
+                <w:br/>
+                <w:t xml:space="preserve">Available at: </w:t>
+              </w:r>
+              <w:r>
+                <w:rPr>
+                  <w:noProof/>
+                  <w:u w:val="single"/>
+                </w:rPr>
+                <w:t>https://betterstack.com/community/guides/scaling-nodejs/nodejs-reverse-proxy-nginx/</w:t>
+              </w:r>
+              <w:r>
+                <w:rPr>
+                  <w:noProof/>
+                </w:rPr>
+                <w:br/>
+                <w:t>[Accessed 20 April 2026].</w:t>
+              </w:r>
+            </w:p>
+            <w:p>
+              <w:pPr>
+                <w:pStyle w:val="Bibliography"/>
+                <w:rPr>
+                  <w:noProof/>
+                </w:rPr>
+              </w:pPr>
+              <w:r>
+                <w:rPr>
+                  <w:noProof/>
+                </w:rPr>
                 <w:t xml:space="preserve">NestyBox, 2019. </w:t>
               </w:r>
               <w:r>
@@ -13491,6 +14031,7 @@
                 <w:rPr>
                   <w:noProof/>
                 </w:rPr>
+                <w:lastRenderedPageBreak/>
                 <w:t xml:space="preserve">node.js, 2026. </w:t>
               </w:r>
               <w:r>
@@ -13527,6 +14068,55 @@
                 </w:rPr>
                 <w:br/>
                 <w:t>[Accessed 06 April 2026].</w:t>
+              </w:r>
+            </w:p>
+            <w:p>
+              <w:pPr>
+                <w:pStyle w:val="Bibliography"/>
+                <w:rPr>
+                  <w:noProof/>
+                </w:rPr>
+              </w:pPr>
+              <w:r>
+                <w:rPr>
+                  <w:noProof/>
+                </w:rPr>
+                <w:t xml:space="preserve">PostgreSQL, n.d. </w:t>
+              </w:r>
+              <w:r>
+                <w:rPr>
+                  <w:i/>
+                  <w:iCs/>
+                  <w:noProof/>
+                </w:rPr>
+                <w:t xml:space="preserve">Postgres Official Image | Docker Hub. </w:t>
+              </w:r>
+              <w:r>
+                <w:rPr>
+                  <w:noProof/>
+                </w:rPr>
+                <w:t xml:space="preserve">[Online] </w:t>
+              </w:r>
+              <w:r>
+                <w:rPr>
+                  <w:noProof/>
+                </w:rPr>
+                <w:br/>
+                <w:t xml:space="preserve">Available at: </w:t>
+              </w:r>
+              <w:r>
+                <w:rPr>
+                  <w:noProof/>
+                  <w:u w:val="single"/>
+                </w:rPr>
+                <w:t>https://hub.docker.com/_/postgres</w:t>
+              </w:r>
+              <w:r>
+                <w:rPr>
+                  <w:noProof/>
+                </w:rPr>
+                <w:br/>
+                <w:t>[Accessed 20 April 2026].</w:t>
               </w:r>
             </w:p>
             <w:p>
@@ -14810,6 +15400,7 @@
   <w:style w:type="character" w:default="1" w:styleId="DefaultParagraphFont">
     <w:name w:val="Default Paragraph Font"/>
     <w:uiPriority w:val="1"/>
+    <w:semiHidden/>
     <w:unhideWhenUsed/>
   </w:style>
   <w:style w:type="table" w:default="1" w:styleId="TableNormal">
@@ -15652,7 +16243,7 @@
     <b:MonthAccessed>April</b:MonthAccessed>
     <b:DayAccessed>5</b:DayAccessed>
     <b:URL>https://docs.docker.com/reference/api/engine/version/v1.52/</b:URL>
-    <b:RefOrder>5</b:RefOrder>
+    <b:RefOrder>6</b:RefOrder>
   </b:Source>
   <b:Source>
     <b:Tag>nod26</b:Tag>
@@ -15669,7 +16260,7 @@
     <b:MonthAccessed>April</b:MonthAccessed>
     <b:DayAccessed>06</b:DayAccessed>
     <b:URL>https://nodejs.org/api/buffer.html#bufreadint32beoffset</b:URL>
-    <b:RefOrder>6</b:RefOrder>
+    <b:RefOrder>7</b:RefOrder>
   </b:Source>
   <b:Source>
     <b:Tag>apo26</b:Tag>
@@ -15691,7 +16282,7 @@
     <b:MonthAccessed>April</b:MonthAccessed>
     <b:DayAccessed>05</b:DayAccessed>
     <b:URL>https://www.npmjs.com/package/dockerode</b:URL>
-    <b:RefOrder>2</b:RefOrder>
+    <b:RefOrder>3</b:RefOrder>
   </b:Source>
   <b:Source>
     <b:Tag>Nes19</b:Tag>
@@ -15708,7 +16299,7 @@
     <b:MonthAccessed>April</b:MonthAccessed>
     <b:DayAccessed>06</b:DayAccessed>
     <b:URL>https://blog.nestybox.com/2019/09/14/dind.html</b:URL>
-    <b:RefOrder>3</b:RefOrder>
+    <b:RefOrder>4</b:RefOrder>
   </b:Source>
   <b:Source>
     <b:Tag>Gee258</b:Tag>
@@ -15725,7 +16316,7 @@
     <b:MonthAccessed>April</b:MonthAccessed>
     <b:DayAccessed>6</b:DayAccessed>
     <b:URL>https://www.geeksforgeeks.org/node-js/jwt-authentication-with-refresh-tokens/</b:URL>
-    <b:RefOrder>8</b:RefOrder>
+    <b:RefOrder>12</b:RefOrder>
   </b:Source>
   <b:Source>
     <b:Tag>Cod253</b:Tag>
@@ -15742,7 +16333,7 @@
     <b:MonthAccessed>April</b:MonthAccessed>
     <b:DayAccessed>6</b:DayAccessed>
     <b:URL>https://www.codestudy.net/blog/where-to-store-the-refresh-token-on-the-client/</b:URL>
-    <b:RefOrder>9</b:RefOrder>
+    <b:RefOrder>13</b:RefOrder>
   </b:Source>
   <b:Source>
     <b:Tag>Fas26</b:Tag>
@@ -15759,7 +16350,7 @@
     <b:MonthAccessed>April</b:MonthAccessed>
     <b:DayAccessed>18</b:DayAccessed>
     <b:URL>https://javadoc.io/doc/com.fasterxml.jackson.core/jackson-databind/latest/index.html</b:URL>
-    <b:RefOrder>4</b:RefOrder>
+    <b:RefOrder>5</b:RefOrder>
   </b:Source>
   <b:Source>
     <b:Tag>Cod254</b:Tag>
@@ -15776,13 +16367,83 @@
     <b:MonthAccessed>April</b:MonthAccessed>
     <b:DayAccessed>18</b:DayAccessed>
     <b:URL>https://www.codestudy.net/blog/detect-if-browser-tab-is-active-or-user-has-switched-away/#the-page-visibility-api-a-modern-solution</b:URL>
-    <b:RefOrder>7</b:RefOrder>
+    <b:RefOrder>11</b:RefOrder>
+  </b:Source>
+  <b:Source>
+    <b:Tag>Ayo26</b:Tag>
+    <b:SourceType>InternetSite</b:SourceType>
+    <b:Guid>{D43A6A2A-A087-4103-9AB6-2805E7A36303}</b:Guid>
+    <b:Author>
+      <b:Author>
+        <b:NameList>
+          <b:Person>
+            <b:Last>Isaiah</b:Last>
+            <b:First>Ayooluwa</b:First>
+          </b:Person>
+        </b:NameList>
+      </b:Author>
+    </b:Author>
+    <b:Title>How to Configure Nginx as a Reverse Proxy for Node.js Applications</b:Title>
+    <b:Year>2026</b:Year>
+    <b:YearAccessed>2026</b:YearAccessed>
+    <b:MonthAccessed>April</b:MonthAccessed>
+    <b:DayAccessed>20</b:DayAccessed>
+    <b:URL>https://betterstack.com/community/guides/scaling-nodejs/nodejs-reverse-proxy-nginx/</b:URL>
+    <b:RefOrder>2</b:RefOrder>
+  </b:Source>
+  <b:Source>
+    <b:Tag>Doc26</b:Tag>
+    <b:SourceType>InternetSite</b:SourceType>
+    <b:Guid>{8F45345E-1E1E-44EA-81DA-9632F99CF1E0}</b:Guid>
+    <b:Author>
+      <b:Author>
+        <b:Corporate>Docker</b:Corporate>
+      </b:Author>
+    </b:Author>
+    <b:Title>Multi Stage | Docker Docs</b:Title>
+    <b:YearAccessed>2026</b:YearAccessed>
+    <b:MonthAccessed>April</b:MonthAccessed>
+    <b:DayAccessed>20</b:DayAccessed>
+    <b:URL>https://docs.docker.com/build/building/multi-stage/</b:URL>
+    <b:RefOrder>8</b:RefOrder>
+  </b:Source>
+  <b:Source>
+    <b:Tag>Doc261</b:Tag>
+    <b:SourceType>InternetSite</b:SourceType>
+    <b:Guid>{AE970D45-8C96-435E-895E-3D0A27169F8E}</b:Guid>
+    <b:Author>
+      <b:Author>
+        <b:Corporate>Docker</b:Corporate>
+      </b:Author>
+    </b:Author>
+    <b:Title>Docker Compose | Docker Docs</b:Title>
+    <b:YearAccessed>2026</b:YearAccessed>
+    <b:MonthAccessed>April</b:MonthAccessed>
+    <b:DayAccessed>20</b:DayAccessed>
+    <b:URL>https://docs.docker.com/compose/</b:URL>
+    <b:RefOrder>9</b:RefOrder>
+  </b:Source>
+  <b:Source>
+    <b:Tag>Pos26</b:Tag>
+    <b:SourceType>InternetSite</b:SourceType>
+    <b:Guid>{CC01342A-F572-43D0-A48E-329BDF17FFA2}</b:Guid>
+    <b:Author>
+      <b:Author>
+        <b:Corporate>PostgreSQL</b:Corporate>
+      </b:Author>
+    </b:Author>
+    <b:Title>Postgres Official Image | Docker Hub</b:Title>
+    <b:YearAccessed>2026</b:YearAccessed>
+    <b:MonthAccessed>April</b:MonthAccessed>
+    <b:DayAccessed>20</b:DayAccessed>
+    <b:URL>https://hub.docker.com/_/postgres</b:URL>
+    <b:RefOrder>10</b:RefOrder>
   </b:Source>
 </b:Sources>
 </file>
 
 <file path=customXml/itemProps1.xml><?xml version="1.0" encoding="utf-8"?>
-<ds:datastoreItem xmlns:ds="http://schemas.openxmlformats.org/officeDocument/2006/customXml" ds:itemID="{E0588FE4-DEB0-4667-ABF1-583CE968EAB9}">
+<ds:datastoreItem xmlns:ds="http://schemas.openxmlformats.org/officeDocument/2006/customXml" ds:itemID="{A0F73C71-07C0-483B-9F8A-1688D31A4064}">
   <ds:schemaRefs>
     <ds:schemaRef ds:uri="http://schemas.openxmlformats.org/officeDocument/2006/bibliography"/>
   </ds:schemaRefs>

</xml_diff>

<commit_message>
Updated Documentation and README
</commit_message>
<xml_diff>
--- a/Documentation/SETU Code Lab Final Report.docx
+++ b/Documentation/SETU Code Lab Final Report.docx
@@ -225,7 +225,7 @@
           <w:r>
             <w:fldChar w:fldCharType="separate"/>
           </w:r>
-          <w:hyperlink w:anchor="_Toc227585033" w:history="1">
+          <w:hyperlink w:anchor="_Toc227928366" w:history="1">
             <w:r>
               <w:rPr>
                 <w:rStyle w:val="Hyperlink"/>
@@ -252,7 +252,7 @@
                 <w:noProof/>
                 <w:webHidden/>
               </w:rPr>
-              <w:instrText xml:space="preserve"> PAGEREF _Toc227585033 \h </w:instrText>
+              <w:instrText xml:space="preserve"> PAGEREF _Toc227928366 \h </w:instrText>
             </w:r>
             <w:r>
               <w:rPr>
@@ -297,7 +297,7 @@
               <w:lang w:eastAsia="en-IE"/>
             </w:rPr>
           </w:pPr>
-          <w:hyperlink w:anchor="_Toc227585034" w:history="1">
+          <w:hyperlink w:anchor="_Toc227928367" w:history="1">
             <w:r>
               <w:rPr>
                 <w:rStyle w:val="Hyperlink"/>
@@ -324,7 +324,7 @@
                 <w:noProof/>
                 <w:webHidden/>
               </w:rPr>
-              <w:instrText xml:space="preserve"> PAGEREF _Toc227585034 \h </w:instrText>
+              <w:instrText xml:space="preserve"> PAGEREF _Toc227928367 \h </w:instrText>
             </w:r>
             <w:r>
               <w:rPr>
@@ -369,7 +369,7 @@
               <w:lang w:eastAsia="en-IE"/>
             </w:rPr>
           </w:pPr>
-          <w:hyperlink w:anchor="_Toc227585035" w:history="1">
+          <w:hyperlink w:anchor="_Toc227928368" w:history="1">
             <w:r>
               <w:rPr>
                 <w:rStyle w:val="Hyperlink"/>
@@ -396,7 +396,7 @@
                 <w:noProof/>
                 <w:webHidden/>
               </w:rPr>
-              <w:instrText xml:space="preserve"> PAGEREF _Toc227585035 \h </w:instrText>
+              <w:instrText xml:space="preserve"> PAGEREF _Toc227928368 \h </w:instrText>
             </w:r>
             <w:r>
               <w:rPr>
@@ -416,7 +416,7 @@
                 <w:noProof/>
                 <w:webHidden/>
               </w:rPr>
-              <w:t>5</w:t>
+              <w:t>4</w:t>
             </w:r>
             <w:r>
               <w:rPr>
@@ -441,7 +441,7 @@
               <w:lang w:eastAsia="en-IE"/>
             </w:rPr>
           </w:pPr>
-          <w:hyperlink w:anchor="_Toc227585036" w:history="1">
+          <w:hyperlink w:anchor="_Toc227928369" w:history="1">
             <w:r>
               <w:rPr>
                 <w:rStyle w:val="Hyperlink"/>
@@ -468,7 +468,7 @@
                 <w:noProof/>
                 <w:webHidden/>
               </w:rPr>
-              <w:instrText xml:space="preserve"> PAGEREF _Toc227585036 \h </w:instrText>
+              <w:instrText xml:space="preserve"> PAGEREF _Toc227928369 \h </w:instrText>
             </w:r>
             <w:r>
               <w:rPr>
@@ -513,7 +513,7 @@
               <w:lang w:eastAsia="en-IE"/>
             </w:rPr>
           </w:pPr>
-          <w:hyperlink w:anchor="_Toc227585037" w:history="1">
+          <w:hyperlink w:anchor="_Toc227928370" w:history="1">
             <w:r>
               <w:rPr>
                 <w:rStyle w:val="Hyperlink"/>
@@ -540,7 +540,7 @@
                 <w:noProof/>
                 <w:webHidden/>
               </w:rPr>
-              <w:instrText xml:space="preserve"> PAGEREF _Toc227585037 \h </w:instrText>
+              <w:instrText xml:space="preserve"> PAGEREF _Toc227928370 \h </w:instrText>
             </w:r>
             <w:r>
               <w:rPr>
@@ -585,7 +585,7 @@
               <w:lang w:eastAsia="en-IE"/>
             </w:rPr>
           </w:pPr>
-          <w:hyperlink w:anchor="_Toc227585038" w:history="1">
+          <w:hyperlink w:anchor="_Toc227928371" w:history="1">
             <w:r>
               <w:rPr>
                 <w:rStyle w:val="Hyperlink"/>
@@ -612,7 +612,7 @@
                 <w:noProof/>
                 <w:webHidden/>
               </w:rPr>
-              <w:instrText xml:space="preserve"> PAGEREF _Toc227585038 \h </w:instrText>
+              <w:instrText xml:space="preserve"> PAGEREF _Toc227928371 \h </w:instrText>
             </w:r>
             <w:r>
               <w:rPr>
@@ -632,7 +632,7 @@
                 <w:noProof/>
                 <w:webHidden/>
               </w:rPr>
-              <w:t>9</w:t>
+              <w:t>8</w:t>
             </w:r>
             <w:r>
               <w:rPr>
@@ -657,7 +657,7 @@
               <w:lang w:eastAsia="en-IE"/>
             </w:rPr>
           </w:pPr>
-          <w:hyperlink w:anchor="_Toc227585039" w:history="1">
+          <w:hyperlink w:anchor="_Toc227928372" w:history="1">
             <w:r>
               <w:rPr>
                 <w:rStyle w:val="Hyperlink"/>
@@ -684,7 +684,7 @@
                 <w:noProof/>
                 <w:webHidden/>
               </w:rPr>
-              <w:instrText xml:space="preserve"> PAGEREF _Toc227585039 \h </w:instrText>
+              <w:instrText xml:space="preserve"> PAGEREF _Toc227928372 \h </w:instrText>
             </w:r>
             <w:r>
               <w:rPr>
@@ -704,7 +704,7 @@
                 <w:noProof/>
                 <w:webHidden/>
               </w:rPr>
-              <w:t>10</w:t>
+              <w:t>9</w:t>
             </w:r>
             <w:r>
               <w:rPr>
@@ -729,7 +729,7 @@
               <w:lang w:eastAsia="en-IE"/>
             </w:rPr>
           </w:pPr>
-          <w:hyperlink w:anchor="_Toc227585040" w:history="1">
+          <w:hyperlink w:anchor="_Toc227928373" w:history="1">
             <w:r>
               <w:rPr>
                 <w:rStyle w:val="Hyperlink"/>
@@ -756,7 +756,7 @@
                 <w:noProof/>
                 <w:webHidden/>
               </w:rPr>
-              <w:instrText xml:space="preserve"> PAGEREF _Toc227585040 \h </w:instrText>
+              <w:instrText xml:space="preserve"> PAGEREF _Toc227928373 \h </w:instrText>
             </w:r>
             <w:r>
               <w:rPr>
@@ -776,7 +776,7 @@
                 <w:noProof/>
                 <w:webHidden/>
               </w:rPr>
-              <w:t>14</w:t>
+              <w:t>13</w:t>
             </w:r>
             <w:r>
               <w:rPr>
@@ -801,7 +801,7 @@
               <w:lang w:eastAsia="en-IE"/>
             </w:rPr>
           </w:pPr>
-          <w:hyperlink w:anchor="_Toc227585041" w:history="1">
+          <w:hyperlink w:anchor="_Toc227928374" w:history="1">
             <w:r>
               <w:rPr>
                 <w:rStyle w:val="Hyperlink"/>
@@ -828,7 +828,7 @@
                 <w:noProof/>
                 <w:webHidden/>
               </w:rPr>
-              <w:instrText xml:space="preserve"> PAGEREF _Toc227585041 \h </w:instrText>
+              <w:instrText xml:space="preserve"> PAGEREF _Toc227928374 \h </w:instrText>
             </w:r>
             <w:r>
               <w:rPr>
@@ -848,7 +848,7 @@
                 <w:noProof/>
                 <w:webHidden/>
               </w:rPr>
-              <w:t>14</w:t>
+              <w:t>13</w:t>
             </w:r>
             <w:r>
               <w:rPr>
@@ -873,7 +873,7 @@
               <w:lang w:eastAsia="en-IE"/>
             </w:rPr>
           </w:pPr>
-          <w:hyperlink w:anchor="_Toc227585042" w:history="1">
+          <w:hyperlink w:anchor="_Toc227928375" w:history="1">
             <w:r>
               <w:rPr>
                 <w:rStyle w:val="Hyperlink"/>
@@ -900,7 +900,7 @@
                 <w:noProof/>
                 <w:webHidden/>
               </w:rPr>
-              <w:instrText xml:space="preserve"> PAGEREF _Toc227585042 \h </w:instrText>
+              <w:instrText xml:space="preserve"> PAGEREF _Toc227928375 \h </w:instrText>
             </w:r>
             <w:r>
               <w:rPr>
@@ -920,7 +920,7 @@
                 <w:noProof/>
                 <w:webHidden/>
               </w:rPr>
-              <w:t>15</w:t>
+              <w:t>14</w:t>
             </w:r>
             <w:r>
               <w:rPr>
@@ -945,7 +945,7 @@
               <w:lang w:eastAsia="en-IE"/>
             </w:rPr>
           </w:pPr>
-          <w:hyperlink w:anchor="_Toc227585043" w:history="1">
+          <w:hyperlink w:anchor="_Toc227928376" w:history="1">
             <w:r>
               <w:rPr>
                 <w:rStyle w:val="Hyperlink"/>
@@ -972,7 +972,7 @@
                 <w:noProof/>
                 <w:webHidden/>
               </w:rPr>
-              <w:instrText xml:space="preserve"> PAGEREF _Toc227585043 \h </w:instrText>
+              <w:instrText xml:space="preserve"> PAGEREF _Toc227928376 \h </w:instrText>
             </w:r>
             <w:r>
               <w:rPr>
@@ -992,7 +992,7 @@
                 <w:noProof/>
                 <w:webHidden/>
               </w:rPr>
-              <w:t>16</w:t>
+              <w:t>15</w:t>
             </w:r>
             <w:r>
               <w:rPr>
@@ -1017,7 +1017,7 @@
               <w:lang w:eastAsia="en-IE"/>
             </w:rPr>
           </w:pPr>
-          <w:hyperlink w:anchor="_Toc227585044" w:history="1">
+          <w:hyperlink w:anchor="_Toc227928377" w:history="1">
             <w:r>
               <w:rPr>
                 <w:rStyle w:val="Hyperlink"/>
@@ -1044,7 +1044,7 @@
                 <w:noProof/>
                 <w:webHidden/>
               </w:rPr>
-              <w:instrText xml:space="preserve"> PAGEREF _Toc227585044 \h </w:instrText>
+              <w:instrText xml:space="preserve"> PAGEREF _Toc227928377 \h </w:instrText>
             </w:r>
             <w:r>
               <w:rPr>
@@ -1064,7 +1064,7 @@
                 <w:noProof/>
                 <w:webHidden/>
               </w:rPr>
-              <w:t>16</w:t>
+              <w:t>15</w:t>
             </w:r>
             <w:r>
               <w:rPr>
@@ -1089,7 +1089,7 @@
               <w:lang w:eastAsia="en-IE"/>
             </w:rPr>
           </w:pPr>
-          <w:hyperlink w:anchor="_Toc227585045" w:history="1">
+          <w:hyperlink w:anchor="_Toc227928378" w:history="1">
             <w:r>
               <w:rPr>
                 <w:rStyle w:val="Hyperlink"/>
@@ -1116,7 +1116,7 @@
                 <w:noProof/>
                 <w:webHidden/>
               </w:rPr>
-              <w:instrText xml:space="preserve"> PAGEREF _Toc227585045 \h </w:instrText>
+              <w:instrText xml:space="preserve"> PAGEREF _Toc227928378 \h </w:instrText>
             </w:r>
             <w:r>
               <w:rPr>
@@ -1136,7 +1136,7 @@
                 <w:noProof/>
                 <w:webHidden/>
               </w:rPr>
-              <w:t>16</w:t>
+              <w:t>15</w:t>
             </w:r>
             <w:r>
               <w:rPr>
@@ -1161,7 +1161,7 @@
               <w:lang w:eastAsia="en-IE"/>
             </w:rPr>
           </w:pPr>
-          <w:hyperlink w:anchor="_Toc227585046" w:history="1">
+          <w:hyperlink w:anchor="_Toc227928379" w:history="1">
             <w:r>
               <w:rPr>
                 <w:rStyle w:val="Hyperlink"/>
@@ -1188,7 +1188,7 @@
                 <w:noProof/>
                 <w:webHidden/>
               </w:rPr>
-              <w:instrText xml:space="preserve"> PAGEREF _Toc227585046 \h </w:instrText>
+              <w:instrText xml:space="preserve"> PAGEREF _Toc227928379 \h </w:instrText>
             </w:r>
             <w:r>
               <w:rPr>
@@ -1208,7 +1208,7 @@
                 <w:noProof/>
                 <w:webHidden/>
               </w:rPr>
-              <w:t>17</w:t>
+              <w:t>15</w:t>
             </w:r>
             <w:r>
               <w:rPr>
@@ -1233,7 +1233,7 @@
               <w:lang w:eastAsia="en-IE"/>
             </w:rPr>
           </w:pPr>
-          <w:hyperlink w:anchor="_Toc227585047" w:history="1">
+          <w:hyperlink w:anchor="_Toc227928380" w:history="1">
             <w:r>
               <w:rPr>
                 <w:rStyle w:val="Hyperlink"/>
@@ -1260,7 +1260,7 @@
                 <w:noProof/>
                 <w:webHidden/>
               </w:rPr>
-              <w:instrText xml:space="preserve"> PAGEREF _Toc227585047 \h </w:instrText>
+              <w:instrText xml:space="preserve"> PAGEREF _Toc227928380 \h </w:instrText>
             </w:r>
             <w:r>
               <w:rPr>
@@ -1280,7 +1280,7 @@
                 <w:noProof/>
                 <w:webHidden/>
               </w:rPr>
-              <w:t>17</w:t>
+              <w:t>16</w:t>
             </w:r>
             <w:r>
               <w:rPr>
@@ -1305,7 +1305,7 @@
               <w:lang w:eastAsia="en-IE"/>
             </w:rPr>
           </w:pPr>
-          <w:hyperlink w:anchor="_Toc227585048" w:history="1">
+          <w:hyperlink w:anchor="_Toc227928381" w:history="1">
             <w:r>
               <w:rPr>
                 <w:rStyle w:val="Hyperlink"/>
@@ -1332,7 +1332,7 @@
                 <w:noProof/>
                 <w:webHidden/>
               </w:rPr>
-              <w:instrText xml:space="preserve"> PAGEREF _Toc227585048 \h </w:instrText>
+              <w:instrText xml:space="preserve"> PAGEREF _Toc227928381 \h </w:instrText>
             </w:r>
             <w:r>
               <w:rPr>
@@ -1352,7 +1352,7 @@
                 <w:noProof/>
                 <w:webHidden/>
               </w:rPr>
-              <w:t>18</w:t>
+              <w:t>17</w:t>
             </w:r>
             <w:r>
               <w:rPr>
@@ -1377,7 +1377,7 @@
               <w:lang w:eastAsia="en-IE"/>
             </w:rPr>
           </w:pPr>
-          <w:hyperlink w:anchor="_Toc227585049" w:history="1">
+          <w:hyperlink w:anchor="_Toc227928382" w:history="1">
             <w:r>
               <w:rPr>
                 <w:rStyle w:val="Hyperlink"/>
@@ -1404,7 +1404,7 @@
                 <w:noProof/>
                 <w:webHidden/>
               </w:rPr>
-              <w:instrText xml:space="preserve"> PAGEREF _Toc227585049 \h </w:instrText>
+              <w:instrText xml:space="preserve"> PAGEREF _Toc227928382 \h </w:instrText>
             </w:r>
             <w:r>
               <w:rPr>
@@ -1424,7 +1424,7 @@
                 <w:noProof/>
                 <w:webHidden/>
               </w:rPr>
-              <w:t>19</w:t>
+              <w:t>18</w:t>
             </w:r>
             <w:r>
               <w:rPr>
@@ -1449,7 +1449,7 @@
               <w:lang w:eastAsia="en-IE"/>
             </w:rPr>
           </w:pPr>
-          <w:hyperlink w:anchor="_Toc227585050" w:history="1">
+          <w:hyperlink w:anchor="_Toc227928383" w:history="1">
             <w:r>
               <w:rPr>
                 <w:rStyle w:val="Hyperlink"/>
@@ -1476,7 +1476,7 @@
                 <w:noProof/>
                 <w:webHidden/>
               </w:rPr>
-              <w:instrText xml:space="preserve"> PAGEREF _Toc227585050 \h </w:instrText>
+              <w:instrText xml:space="preserve"> PAGEREF _Toc227928383 \h </w:instrText>
             </w:r>
             <w:r>
               <w:rPr>
@@ -1496,7 +1496,7 @@
                 <w:noProof/>
                 <w:webHidden/>
               </w:rPr>
-              <w:t>27</w:t>
+              <w:t>26</w:t>
             </w:r>
             <w:r>
               <w:rPr>
@@ -1521,7 +1521,7 @@
               <w:lang w:eastAsia="en-IE"/>
             </w:rPr>
           </w:pPr>
-          <w:hyperlink w:anchor="_Toc227585051" w:history="1">
+          <w:hyperlink w:anchor="_Toc227928384" w:history="1">
             <w:r>
               <w:rPr>
                 <w:rStyle w:val="Hyperlink"/>
@@ -1548,7 +1548,7 @@
                 <w:noProof/>
                 <w:webHidden/>
               </w:rPr>
-              <w:instrText xml:space="preserve"> PAGEREF _Toc227585051 \h </w:instrText>
+              <w:instrText xml:space="preserve"> PAGEREF _Toc227928384 \h </w:instrText>
             </w:r>
             <w:r>
               <w:rPr>
@@ -1568,7 +1568,7 @@
                 <w:noProof/>
                 <w:webHidden/>
               </w:rPr>
-              <w:t>31</w:t>
+              <w:t>30</w:t>
             </w:r>
             <w:r>
               <w:rPr>
@@ -1593,7 +1593,7 @@
               <w:lang w:eastAsia="en-IE"/>
             </w:rPr>
           </w:pPr>
-          <w:hyperlink w:anchor="_Toc227585052" w:history="1">
+          <w:hyperlink w:anchor="_Toc227928385" w:history="1">
             <w:r>
               <w:rPr>
                 <w:rStyle w:val="Hyperlink"/>
@@ -1620,7 +1620,7 @@
                 <w:noProof/>
                 <w:webHidden/>
               </w:rPr>
-              <w:instrText xml:space="preserve"> PAGEREF _Toc227585052 \h </w:instrText>
+              <w:instrText xml:space="preserve"> PAGEREF _Toc227928385 \h </w:instrText>
             </w:r>
             <w:r>
               <w:rPr>
@@ -1640,7 +1640,7 @@
                 <w:noProof/>
                 <w:webHidden/>
               </w:rPr>
-              <w:t>32</w:t>
+              <w:t>31</w:t>
             </w:r>
             <w:r>
               <w:rPr>
@@ -1692,7 +1692,7 @@
       <w:pPr>
         <w:pStyle w:val="Heading1"/>
       </w:pPr>
-      <w:bookmarkStart w:id="0" w:name="_Toc227585033"/>
+      <w:bookmarkStart w:id="0" w:name="_Toc227928366"/>
       <w:r>
         <w:lastRenderedPageBreak/>
         <w:t>Table of Figures</w:t>
@@ -1722,7 +1722,7 @@
       <w:r>
         <w:fldChar w:fldCharType="separate"/>
       </w:r>
-      <w:hyperlink w:anchor="_Toc227585053" w:history="1">
+      <w:hyperlink w:anchor="_Toc227928386" w:history="1">
         <w:r>
           <w:rPr>
             <w:rStyle w:val="Hyperlink"/>
@@ -1758,7 +1758,7 @@
             <w:noProof/>
             <w:webHidden/>
           </w:rPr>
-          <w:instrText xml:space="preserve"> PAGEREF _Toc227585053 \h </w:instrText>
+          <w:instrText xml:space="preserve"> PAGEREF _Toc227928386 \h </w:instrText>
         </w:r>
         <w:r>
           <w:rPr>
@@ -1778,7 +1778,7 @@
             <w:noProof/>
             <w:webHidden/>
           </w:rPr>
-          <w:t>6</w:t>
+          <w:t>5</w:t>
         </w:r>
         <w:r>
           <w:rPr>
@@ -1803,7 +1803,7 @@
           <w:lang w:eastAsia="en-IE"/>
         </w:rPr>
       </w:pPr>
-      <w:hyperlink w:anchor="_Toc227585054" w:history="1">
+      <w:hyperlink w:anchor="_Toc227928387" w:history="1">
         <w:r>
           <w:rPr>
             <w:rStyle w:val="Hyperlink"/>
@@ -1839,7 +1839,7 @@
             <w:noProof/>
             <w:webHidden/>
           </w:rPr>
-          <w:instrText xml:space="preserve"> PAGEREF _Toc227585054 \h </w:instrText>
+          <w:instrText xml:space="preserve"> PAGEREF _Toc227928387 \h </w:instrText>
         </w:r>
         <w:r>
           <w:rPr>
@@ -1859,7 +1859,7 @@
             <w:noProof/>
             <w:webHidden/>
           </w:rPr>
-          <w:t>6</w:t>
+          <w:t>5</w:t>
         </w:r>
         <w:r>
           <w:rPr>
@@ -1884,7 +1884,7 @@
           <w:lang w:eastAsia="en-IE"/>
         </w:rPr>
       </w:pPr>
-      <w:hyperlink w:anchor="_Toc227585055" w:history="1">
+      <w:hyperlink w:anchor="_Toc227928388" w:history="1">
         <w:r>
           <w:rPr>
             <w:rStyle w:val="Hyperlink"/>
@@ -1920,7 +1920,7 @@
             <w:noProof/>
             <w:webHidden/>
           </w:rPr>
-          <w:instrText xml:space="preserve"> PAGEREF _Toc227585055 \h </w:instrText>
+          <w:instrText xml:space="preserve"> PAGEREF _Toc227928388 \h </w:instrText>
         </w:r>
         <w:r>
           <w:rPr>
@@ -1965,7 +1965,7 @@
           <w:lang w:eastAsia="en-IE"/>
         </w:rPr>
       </w:pPr>
-      <w:hyperlink w:anchor="_Toc227585056" w:history="1">
+      <w:hyperlink w:anchor="_Toc227928389" w:history="1">
         <w:r>
           <w:rPr>
             <w:rStyle w:val="Hyperlink"/>
@@ -2001,7 +2001,7 @@
             <w:noProof/>
             <w:webHidden/>
           </w:rPr>
-          <w:instrText xml:space="preserve"> PAGEREF _Toc227585056 \h </w:instrText>
+          <w:instrText xml:space="preserve"> PAGEREF _Toc227928389 \h </w:instrText>
         </w:r>
         <w:r>
           <w:rPr>
@@ -2021,7 +2021,7 @@
             <w:noProof/>
             <w:webHidden/>
           </w:rPr>
-          <w:t>7</w:t>
+          <w:t>6</w:t>
         </w:r>
         <w:r>
           <w:rPr>
@@ -2046,7 +2046,7 @@
           <w:lang w:eastAsia="en-IE"/>
         </w:rPr>
       </w:pPr>
-      <w:hyperlink w:anchor="_Toc227585057" w:history="1">
+      <w:hyperlink w:anchor="_Toc227928390" w:history="1">
         <w:r>
           <w:rPr>
             <w:rStyle w:val="Hyperlink"/>
@@ -2082,7 +2082,7 @@
             <w:noProof/>
             <w:webHidden/>
           </w:rPr>
-          <w:instrText xml:space="preserve"> PAGEREF _Toc227585057 \h </w:instrText>
+          <w:instrText xml:space="preserve"> PAGEREF _Toc227928390 \h </w:instrText>
         </w:r>
         <w:r>
           <w:rPr>
@@ -2102,7 +2102,7 @@
             <w:noProof/>
             <w:webHidden/>
           </w:rPr>
-          <w:t>8</w:t>
+          <w:t>7</w:t>
         </w:r>
         <w:r>
           <w:rPr>
@@ -2127,7 +2127,7 @@
           <w:lang w:eastAsia="en-IE"/>
         </w:rPr>
       </w:pPr>
-      <w:hyperlink w:anchor="_Toc227585058" w:history="1">
+      <w:hyperlink w:anchor="_Toc227928391" w:history="1">
         <w:r>
           <w:rPr>
             <w:rStyle w:val="Hyperlink"/>
@@ -2163,7 +2163,7 @@
             <w:noProof/>
             <w:webHidden/>
           </w:rPr>
-          <w:instrText xml:space="preserve"> PAGEREF _Toc227585058 \h </w:instrText>
+          <w:instrText xml:space="preserve"> PAGEREF _Toc227928391 \h </w:instrText>
         </w:r>
         <w:r>
           <w:rPr>
@@ -2183,7 +2183,7 @@
             <w:noProof/>
             <w:webHidden/>
           </w:rPr>
-          <w:t>8</w:t>
+          <w:t>7</w:t>
         </w:r>
         <w:r>
           <w:rPr>
@@ -2208,7 +2208,7 @@
           <w:lang w:eastAsia="en-IE"/>
         </w:rPr>
       </w:pPr>
-      <w:hyperlink w:anchor="_Toc227585059" w:history="1">
+      <w:hyperlink w:anchor="_Toc227928392" w:history="1">
         <w:r>
           <w:rPr>
             <w:rStyle w:val="Hyperlink"/>
@@ -2244,7 +2244,7 @@
             <w:noProof/>
             <w:webHidden/>
           </w:rPr>
-          <w:instrText xml:space="preserve"> PAGEREF _Toc227585059 \h </w:instrText>
+          <w:instrText xml:space="preserve"> PAGEREF _Toc227928392 \h </w:instrText>
         </w:r>
         <w:r>
           <w:rPr>
@@ -2264,7 +2264,7 @@
             <w:noProof/>
             <w:webHidden/>
           </w:rPr>
-          <w:t>9</w:t>
+          <w:t>8</w:t>
         </w:r>
         <w:r>
           <w:rPr>
@@ -2289,7 +2289,7 @@
           <w:lang w:eastAsia="en-IE"/>
         </w:rPr>
       </w:pPr>
-      <w:hyperlink w:anchor="_Toc227585060" w:history="1">
+      <w:hyperlink w:anchor="_Toc227928393" w:history="1">
         <w:r>
           <w:rPr>
             <w:rStyle w:val="Hyperlink"/>
@@ -2325,7 +2325,7 @@
             <w:noProof/>
             <w:webHidden/>
           </w:rPr>
-          <w:instrText xml:space="preserve"> PAGEREF _Toc227585060 \h </w:instrText>
+          <w:instrText xml:space="preserve"> PAGEREF _Toc227928393 \h </w:instrText>
         </w:r>
         <w:r>
           <w:rPr>
@@ -2345,7 +2345,7 @@
             <w:noProof/>
             <w:webHidden/>
           </w:rPr>
-          <w:t>10</w:t>
+          <w:t>9</w:t>
         </w:r>
         <w:r>
           <w:rPr>
@@ -2370,7 +2370,7 @@
           <w:lang w:eastAsia="en-IE"/>
         </w:rPr>
       </w:pPr>
-      <w:hyperlink w:anchor="_Toc227585061" w:history="1">
+      <w:hyperlink w:anchor="_Toc227928394" w:history="1">
         <w:r>
           <w:rPr>
             <w:rStyle w:val="Hyperlink"/>
@@ -2406,7 +2406,7 @@
             <w:noProof/>
             <w:webHidden/>
           </w:rPr>
-          <w:instrText xml:space="preserve"> PAGEREF _Toc227585061 \h </w:instrText>
+          <w:instrText xml:space="preserve"> PAGEREF _Toc227928394 \h </w:instrText>
         </w:r>
         <w:r>
           <w:rPr>
@@ -2426,7 +2426,7 @@
             <w:noProof/>
             <w:webHidden/>
           </w:rPr>
-          <w:t>11</w:t>
+          <w:t>10</w:t>
         </w:r>
         <w:r>
           <w:rPr>
@@ -2451,7 +2451,7 @@
           <w:lang w:eastAsia="en-IE"/>
         </w:rPr>
       </w:pPr>
-      <w:hyperlink w:anchor="_Toc227585062" w:history="1">
+      <w:hyperlink w:anchor="_Toc227928395" w:history="1">
         <w:r>
           <w:rPr>
             <w:rStyle w:val="Hyperlink"/>
@@ -2487,7 +2487,7 @@
             <w:noProof/>
             <w:webHidden/>
           </w:rPr>
-          <w:instrText xml:space="preserve"> PAGEREF _Toc227585062 \h </w:instrText>
+          <w:instrText xml:space="preserve"> PAGEREF _Toc227928395 \h </w:instrText>
         </w:r>
         <w:r>
           <w:rPr>
@@ -2507,7 +2507,7 @@
             <w:noProof/>
             <w:webHidden/>
           </w:rPr>
-          <w:t>11</w:t>
+          <w:t>10</w:t>
         </w:r>
         <w:r>
           <w:rPr>
@@ -2532,7 +2532,7 @@
           <w:lang w:eastAsia="en-IE"/>
         </w:rPr>
       </w:pPr>
-      <w:hyperlink w:anchor="_Toc227585063" w:history="1">
+      <w:hyperlink w:anchor="_Toc227928396" w:history="1">
         <w:r>
           <w:rPr>
             <w:rStyle w:val="Hyperlink"/>
@@ -2568,7 +2568,7 @@
             <w:noProof/>
             <w:webHidden/>
           </w:rPr>
-          <w:instrText xml:space="preserve"> PAGEREF _Toc227585063 \h </w:instrText>
+          <w:instrText xml:space="preserve"> PAGEREF _Toc227928396 \h </w:instrText>
         </w:r>
         <w:r>
           <w:rPr>
@@ -2588,7 +2588,7 @@
             <w:noProof/>
             <w:webHidden/>
           </w:rPr>
-          <w:t>12</w:t>
+          <w:t>11</w:t>
         </w:r>
         <w:r>
           <w:rPr>
@@ -2613,7 +2613,7 @@
           <w:lang w:eastAsia="en-IE"/>
         </w:rPr>
       </w:pPr>
-      <w:hyperlink w:anchor="_Toc227585064" w:history="1">
+      <w:hyperlink w:anchor="_Toc227928397" w:history="1">
         <w:r>
           <w:rPr>
             <w:rStyle w:val="Hyperlink"/>
@@ -2649,7 +2649,7 @@
             <w:noProof/>
             <w:webHidden/>
           </w:rPr>
-          <w:instrText xml:space="preserve"> PAGEREF _Toc227585064 \h </w:instrText>
+          <w:instrText xml:space="preserve"> PAGEREF _Toc227928397 \h </w:instrText>
         </w:r>
         <w:r>
           <w:rPr>
@@ -2669,7 +2669,7 @@
             <w:noProof/>
             <w:webHidden/>
           </w:rPr>
-          <w:t>12</w:t>
+          <w:t>11</w:t>
         </w:r>
         <w:r>
           <w:rPr>
@@ -2694,7 +2694,7 @@
           <w:lang w:eastAsia="en-IE"/>
         </w:rPr>
       </w:pPr>
-      <w:hyperlink w:anchor="_Toc227585065" w:history="1">
+      <w:hyperlink w:anchor="_Toc227928398" w:history="1">
         <w:r>
           <w:rPr>
             <w:rStyle w:val="Hyperlink"/>
@@ -2730,7 +2730,7 @@
             <w:noProof/>
             <w:webHidden/>
           </w:rPr>
-          <w:instrText xml:space="preserve"> PAGEREF _Toc227585065 \h </w:instrText>
+          <w:instrText xml:space="preserve"> PAGEREF _Toc227928398 \h </w:instrText>
         </w:r>
         <w:r>
           <w:rPr>
@@ -2750,7 +2750,7 @@
             <w:noProof/>
             <w:webHidden/>
           </w:rPr>
-          <w:t>13</w:t>
+          <w:t>12</w:t>
         </w:r>
         <w:r>
           <w:rPr>
@@ -2775,7 +2775,7 @@
           <w:lang w:eastAsia="en-IE"/>
         </w:rPr>
       </w:pPr>
-      <w:hyperlink w:anchor="_Toc227585066" w:history="1">
+      <w:hyperlink w:anchor="_Toc227928399" w:history="1">
         <w:r>
           <w:rPr>
             <w:rStyle w:val="Hyperlink"/>
@@ -2811,7 +2811,7 @@
             <w:noProof/>
             <w:webHidden/>
           </w:rPr>
-          <w:instrText xml:space="preserve"> PAGEREF _Toc227585066 \h </w:instrText>
+          <w:instrText xml:space="preserve"> PAGEREF _Toc227928399 \h </w:instrText>
         </w:r>
         <w:r>
           <w:rPr>
@@ -2831,7 +2831,7 @@
             <w:noProof/>
             <w:webHidden/>
           </w:rPr>
-          <w:t>13</w:t>
+          <w:t>12</w:t>
         </w:r>
         <w:r>
           <w:rPr>
@@ -2856,7 +2856,7 @@
           <w:lang w:eastAsia="en-IE"/>
         </w:rPr>
       </w:pPr>
-      <w:hyperlink w:anchor="_Toc227585067" w:history="1">
+      <w:hyperlink w:anchor="_Toc227928400" w:history="1">
         <w:r>
           <w:rPr>
             <w:rStyle w:val="Hyperlink"/>
@@ -2892,7 +2892,7 @@
             <w:noProof/>
             <w:webHidden/>
           </w:rPr>
-          <w:instrText xml:space="preserve"> PAGEREF _Toc227585067 \h </w:instrText>
+          <w:instrText xml:space="preserve"> PAGEREF _Toc227928400 \h </w:instrText>
         </w:r>
         <w:r>
           <w:rPr>
@@ -2912,7 +2912,7 @@
             <w:noProof/>
             <w:webHidden/>
           </w:rPr>
-          <w:t>16</w:t>
+          <w:t>14</w:t>
         </w:r>
         <w:r>
           <w:rPr>
@@ -2946,7 +2946,7 @@
       <w:pPr>
         <w:pStyle w:val="Heading1"/>
       </w:pPr>
-      <w:bookmarkStart w:id="1" w:name="_Toc227585034"/>
+      <w:bookmarkStart w:id="1" w:name="_Toc227928367"/>
       <w:r>
         <w:lastRenderedPageBreak/>
         <w:t>Abstract</w:t>
@@ -3078,7 +3078,7 @@
       <w:pPr>
         <w:pStyle w:val="Heading1"/>
       </w:pPr>
-      <w:bookmarkStart w:id="2" w:name="_Toc227585035"/>
+      <w:bookmarkStart w:id="2" w:name="_Toc227928368"/>
       <w:r>
         <w:t>Introduction</w:t>
       </w:r>
@@ -3187,7 +3187,7 @@
       <w:pPr>
         <w:pStyle w:val="Heading1"/>
       </w:pPr>
-      <w:bookmarkStart w:id="3" w:name="_Toc227585036"/>
+      <w:bookmarkStart w:id="3" w:name="_Toc227928369"/>
       <w:r>
         <w:lastRenderedPageBreak/>
         <w:t>Challenges</w:t>
@@ -3201,7 +3201,7 @@
       <w:pPr>
         <w:pStyle w:val="Heading2"/>
       </w:pPr>
-      <w:bookmarkStart w:id="4" w:name="_Toc227585037"/>
+      <w:bookmarkStart w:id="4" w:name="_Toc227928370"/>
       <w:r>
         <w:t>Architecture</w:t>
       </w:r>
@@ -3595,7 +3595,7 @@
         <w:pStyle w:val="Caption"/>
         <w:jc w:val="center"/>
       </w:pPr>
-      <w:bookmarkStart w:id="5" w:name="_Toc227585053"/>
+      <w:bookmarkStart w:id="5" w:name="_Toc227928386"/>
       <w:r>
         <w:rPr>
           <w:b/>
@@ -3701,7 +3701,7 @@
         <w:pStyle w:val="Caption"/>
         <w:jc w:val="center"/>
       </w:pPr>
-      <w:bookmarkStart w:id="6" w:name="_Toc227585054"/>
+      <w:bookmarkStart w:id="6" w:name="_Toc227928387"/>
       <w:r>
         <w:rPr>
           <w:b/>
@@ -3809,7 +3809,7 @@
         <w:pStyle w:val="Caption"/>
         <w:jc w:val="center"/>
       </w:pPr>
-      <w:bookmarkStart w:id="7" w:name="_Toc227585055"/>
+      <w:bookmarkStart w:id="7" w:name="_Toc227928388"/>
       <w:r>
         <w:rPr>
           <w:b/>
@@ -4056,7 +4056,7 @@
         <w:pStyle w:val="Caption"/>
         <w:jc w:val="center"/>
       </w:pPr>
-      <w:bookmarkStart w:id="8" w:name="_Toc227585056"/>
+      <w:bookmarkStart w:id="8" w:name="_Toc227928389"/>
       <w:r>
         <w:rPr>
           <w:b/>
@@ -4260,7 +4260,7 @@
         <w:pStyle w:val="Caption"/>
         <w:jc w:val="center"/>
       </w:pPr>
-      <w:bookmarkStart w:id="9" w:name="_Toc227585057"/>
+      <w:bookmarkStart w:id="9" w:name="_Toc227928390"/>
       <w:r>
         <w:rPr>
           <w:b/>
@@ -4371,7 +4371,7 @@
         <w:pStyle w:val="Caption"/>
         <w:jc w:val="center"/>
       </w:pPr>
-      <w:bookmarkStart w:id="10" w:name="_Toc227585058"/>
+      <w:bookmarkStart w:id="10" w:name="_Toc227928391"/>
       <w:r>
         <w:rPr>
           <w:b/>
@@ -4588,7 +4588,7 @@
         <w:pStyle w:val="Caption"/>
         <w:jc w:val="center"/>
       </w:pPr>
-      <w:bookmarkStart w:id="11" w:name="_Toc227585059"/>
+      <w:bookmarkStart w:id="11" w:name="_Toc227928392"/>
       <w:r>
         <w:rPr>
           <w:b/>
@@ -4648,7 +4648,7 @@
       <w:pPr>
         <w:pStyle w:val="Heading2"/>
       </w:pPr>
-      <w:bookmarkStart w:id="12" w:name="_Toc227585038"/>
+      <w:bookmarkStart w:id="12" w:name="_Toc227928371"/>
       <w:r>
         <w:t>Hosting</w:t>
       </w:r>
@@ -4743,9 +4743,11 @@
       <w:r>
         <w:t xml:space="preserve"> in </w:t>
       </w:r>
+      <w:proofErr w:type="gramStart"/>
       <w:r>
         <w:t>an</w:t>
       </w:r>
+      <w:proofErr w:type="gramEnd"/>
       <w:r>
         <w:t xml:space="preserve"> </w:t>
       </w:r>
@@ -4910,7 +4912,7 @@
       <w:pPr>
         <w:pStyle w:val="Heading2"/>
       </w:pPr>
-      <w:bookmarkStart w:id="13" w:name="_Toc227585039"/>
+      <w:bookmarkStart w:id="13" w:name="_Toc227928372"/>
       <w:r>
         <w:t>Docker Code Execution</w:t>
       </w:r>
@@ -5165,7 +5167,7 @@
         <w:pStyle w:val="Caption"/>
         <w:jc w:val="center"/>
       </w:pPr>
-      <w:bookmarkStart w:id="14" w:name="_Toc227585060"/>
+      <w:bookmarkStart w:id="14" w:name="_Toc227928393"/>
       <w:r>
         <w:rPr>
           <w:b/>
@@ -5370,7 +5372,7 @@
         <w:pStyle w:val="Caption"/>
         <w:jc w:val="center"/>
       </w:pPr>
-      <w:bookmarkStart w:id="15" w:name="_Toc227585061"/>
+      <w:bookmarkStart w:id="15" w:name="_Toc227928394"/>
       <w:r>
         <w:rPr>
           <w:b/>
@@ -5513,7 +5515,7 @@
         <w:pStyle w:val="Caption"/>
         <w:jc w:val="center"/>
       </w:pPr>
-      <w:bookmarkStart w:id="16" w:name="_Toc227585062"/>
+      <w:bookmarkStart w:id="16" w:name="_Toc227928395"/>
       <w:r>
         <w:rPr>
           <w:b/>
@@ -5730,7 +5732,7 @@
         <w:pStyle w:val="Caption"/>
         <w:jc w:val="center"/>
       </w:pPr>
-      <w:bookmarkStart w:id="17" w:name="_Toc227585063"/>
+      <w:bookmarkStart w:id="17" w:name="_Toc227928396"/>
       <w:r>
         <w:rPr>
           <w:b/>
@@ -6013,7 +6015,7 @@
         <w:pStyle w:val="Caption"/>
         <w:jc w:val="center"/>
       </w:pPr>
-      <w:bookmarkStart w:id="18" w:name="_Toc227585064"/>
+      <w:bookmarkStart w:id="18" w:name="_Toc227928397"/>
       <w:r>
         <w:rPr>
           <w:b/>
@@ -6252,7 +6254,7 @@
         <w:pStyle w:val="Caption"/>
         <w:jc w:val="center"/>
       </w:pPr>
-      <w:bookmarkStart w:id="19" w:name="_Toc227585065"/>
+      <w:bookmarkStart w:id="19" w:name="_Toc227928398"/>
       <w:r>
         <w:rPr>
           <w:b/>
@@ -6478,7 +6480,7 @@
         <w:pStyle w:val="Caption"/>
         <w:jc w:val="center"/>
       </w:pPr>
-      <w:bookmarkStart w:id="20" w:name="_Toc227585066"/>
+      <w:bookmarkStart w:id="20" w:name="_Toc227928399"/>
       <w:r>
         <w:rPr>
           <w:b/>
@@ -6594,7 +6596,7 @@
       <w:pPr>
         <w:pStyle w:val="Heading2"/>
       </w:pPr>
-      <w:bookmarkStart w:id="21" w:name="_Toc227585040"/>
+      <w:bookmarkStart w:id="21" w:name="_Toc227928373"/>
       <w:r>
         <w:lastRenderedPageBreak/>
         <w:t>Docker Containerisation</w:t>
@@ -6970,7 +6972,7 @@
       <w:pPr>
         <w:pStyle w:val="Heading2"/>
       </w:pPr>
-      <w:bookmarkStart w:id="22" w:name="_Toc227585041"/>
+      <w:bookmarkStart w:id="22" w:name="_Toc227928374"/>
       <w:r>
         <w:t>Generative Artificial Intelligence Considerations</w:t>
       </w:r>
@@ -7176,7 +7178,15 @@
         <w:t>Admittedly, this solution is weak</w:t>
       </w:r>
       <w:r>
-        <w:t xml:space="preserve"> as tabs can be opened on a different screen or beside the current screen before a student clicks into a problem.</w:t>
+        <w:t xml:space="preserve"> as tabs can be opened on a different screen or beside the current screen before a </w:t>
+      </w:r>
+      <w:proofErr w:type="gramStart"/>
+      <w:r>
+        <w:t>student clicks</w:t>
+      </w:r>
+      <w:proofErr w:type="gramEnd"/>
+      <w:r>
+        <w:t xml:space="preserve"> into a problem.</w:t>
       </w:r>
       <w:r>
         <w:t xml:space="preserve"> </w:t>
@@ -7216,7 +7226,7 @@
       <w:pPr>
         <w:pStyle w:val="Heading2"/>
       </w:pPr>
-      <w:bookmarkStart w:id="23" w:name="_Toc227585042"/>
+      <w:bookmarkStart w:id="23" w:name="_Toc227928375"/>
       <w:r>
         <w:t>Authentication</w:t>
       </w:r>
@@ -7465,7 +7475,7 @@
         <w:pStyle w:val="Caption"/>
         <w:jc w:val="center"/>
       </w:pPr>
-      <w:bookmarkStart w:id="24" w:name="_Toc227585067"/>
+      <w:bookmarkStart w:id="24" w:name="_Toc227928400"/>
       <w:r>
         <w:rPr>
           <w:b/>
@@ -7538,7 +7548,7 @@
       <w:pPr>
         <w:pStyle w:val="Heading1"/>
       </w:pPr>
-      <w:bookmarkStart w:id="25" w:name="_Toc227585043"/>
+      <w:bookmarkStart w:id="25" w:name="_Toc227928376"/>
       <w:r>
         <w:lastRenderedPageBreak/>
         <w:t>Reflection</w:t>
@@ -7549,7 +7559,7 @@
       <w:pPr>
         <w:pStyle w:val="Heading2"/>
       </w:pPr>
-      <w:bookmarkStart w:id="26" w:name="_Toc227585044"/>
+      <w:bookmarkStart w:id="26" w:name="_Toc227928377"/>
       <w:r>
         <w:t>What I Achieved</w:t>
       </w:r>
@@ -7678,7 +7688,7 @@
       <w:pPr>
         <w:pStyle w:val="Heading2"/>
       </w:pPr>
-      <w:bookmarkStart w:id="27" w:name="_Toc227585045"/>
+      <w:bookmarkStart w:id="27" w:name="_Toc227928378"/>
       <w:r>
         <w:t>What I did not Achieve</w:t>
       </w:r>
@@ -7721,12 +7731,15 @@
       <w:r>
         <w:t>.</w:t>
       </w:r>
+      <w:r>
+        <w:t xml:space="preserve"> </w:t>
+      </w:r>
     </w:p>
     <w:p>
       <w:pPr>
         <w:pStyle w:val="Heading2"/>
       </w:pPr>
-      <w:bookmarkStart w:id="28" w:name="_Toc227585046"/>
+      <w:bookmarkStart w:id="28" w:name="_Toc227928379"/>
       <w:r>
         <w:t>What I Learned</w:t>
       </w:r>
@@ -7787,7 +7800,7 @@
       <w:pPr>
         <w:pStyle w:val="Heading2"/>
       </w:pPr>
-      <w:bookmarkStart w:id="29" w:name="_Toc227585047"/>
+      <w:bookmarkStart w:id="29" w:name="_Toc227928380"/>
       <w:r>
         <w:t>What I would do Differently</w:t>
       </w:r>
@@ -8053,7 +8066,6 @@
           <w:szCs w:val="40"/>
         </w:rPr>
       </w:pPr>
-      <w:bookmarkStart w:id="30" w:name="_Toc227585048"/>
       <w:r>
         <w:br w:type="page"/>
       </w:r>
@@ -8062,6 +8074,7 @@
       <w:pPr>
         <w:pStyle w:val="Heading1"/>
       </w:pPr>
+      <w:bookmarkStart w:id="30" w:name="_Toc227928381"/>
       <w:r>
         <w:lastRenderedPageBreak/>
         <w:t>Testing</w:t>
@@ -9290,7 +9303,7 @@
       <w:pPr>
         <w:pStyle w:val="Heading2"/>
       </w:pPr>
-      <w:bookmarkStart w:id="31" w:name="_Toc227585049"/>
+      <w:bookmarkStart w:id="31" w:name="_Toc227928382"/>
       <w:r>
         <w:t>Functional Testing</w:t>
       </w:r>
@@ -9949,8 +9962,13 @@
             </w:r>
             <w:r>
               <w:br/>
-              <w:t>3. Click on a global problems</w:t>
-            </w:r>
+              <w:t xml:space="preserve">3. Click on a </w:t>
+            </w:r>
+            <w:proofErr w:type="gramStart"/>
+            <w:r>
+              <w:t>global problems</w:t>
+            </w:r>
+            <w:proofErr w:type="gramEnd"/>
             <w:r>
               <w:br/>
               <w:t>4. Observe results</w:t>
@@ -11409,7 +11427,7 @@
       <w:pPr>
         <w:pStyle w:val="Heading2"/>
       </w:pPr>
-      <w:bookmarkStart w:id="32" w:name="_Toc227585050"/>
+      <w:bookmarkStart w:id="32" w:name="_Toc227928383"/>
       <w:r>
         <w:lastRenderedPageBreak/>
         <w:t>Non-Functional Testing</w:t>
@@ -13546,7 +13564,7 @@
       <w:pPr>
         <w:pStyle w:val="Heading1"/>
       </w:pPr>
-      <w:bookmarkStart w:id="33" w:name="_Toc227585051"/>
+      <w:bookmarkStart w:id="33" w:name="_Toc227928384"/>
       <w:r>
         <w:lastRenderedPageBreak/>
         <w:t>Conclusion</w:t>
@@ -13694,7 +13712,7 @@
         <w:br w:type="page"/>
       </w:r>
     </w:p>
-    <w:bookmarkStart w:id="34" w:name="_Toc227585052" w:displacedByCustomXml="next"/>
+    <w:bookmarkStart w:id="34" w:name="_Toc227928385" w:displacedByCustomXml="next"/>
     <w:sdt>
       <w:sdtPr>
         <w:rPr>

</xml_diff>